<commit_message>
docs: Codebase-Erkundung & Persistenz als Kern-Feature in Guide ergänzen
Das Word/PPTX-Begleitdokument war nicht praxisorientiert genug — das
zentrale ECC-Prinzip "einmal erkunden, in Dateien festhalten, danach die
Karte lesen statt neu suchen" fehlte komplett.

Aus den vollständigen ECC-Guides (shortform/longform/workflow.de/security)
ergänzt:
- Abschnitt 5 erweitert zu "Projekt-Onboarding & Codebase einmal erkunden":
  a) /ecc-onboard  b) /update-codemaps → docs/CODEMAPS/ (KERN-FEATURE,
  mit Tabelle architecture/backend/frontend/data/dependencies)
  c) research.md-Pattern, code-tour, codebase-onboarding, claude-mem.
- Cheat-Sheet: /update-codemaps + Skill codebase-onboarding ergänzt.
- Neue PPTX-Folie "5b · Codebase EINMAL erkunden (Codemaps)".
- Prinzip "in Dateien speichern, nicht im Kopf behalten" durchgängig betont.

Co-Authored-By: Claude Opus 4.8 (1M context) <noreply@anthropic.com>
</commit_message>
<xml_diff>
--- a/docs/ECC-Harness-Guide.de.docx
+++ b/docs/ECC-Harness-Guide.de.docx
@@ -153,7 +153,7 @@
           <w:color w:val="1F2937"/>
           <w:sz w:val="21"/>
         </w:rPr>
-        <w:t>5 · Projekt-Onboarding mit /ecc-onboard</w:t>
+        <w:t>5 · Onboarding &amp; Codebase einmal erkunden (Codemaps)</w:t>
       </w:r>
     </w:p>
     <w:p>
@@ -1770,7 +1770,37 @@
           <w:color w:val="312E81"/>
           <w:sz w:val="34"/>
         </w:rPr>
-        <w:t>5 · Projekt-Onboarding mit /ecc-onboard</w:t>
+        <w:t>5 · Projekt-Onboarding &amp; Codebase einmal erkunden</w:t>
+      </w:r>
+    </w:p>
+    <w:p>
+      <w:pPr>
+        <w:spacing w:after="40"/>
+      </w:pPr>
+      <w:r>
+        <w:rPr>
+          <w:rFonts w:ascii="Calibri" w:hAnsi="Calibri"/>
+          <w:b w:val="0"/>
+          <w:i w:val="0"/>
+          <w:color w:val="1F2937"/>
+          <w:sz w:val="21"/>
+        </w:rPr>
+        <w:t>Die teuerste Verschwendung ist, die Codebase in jeder Session neu zu durchsuchen. ECC-Prinzip: EINMAL erkunden, das Ergebnis in Dateien festhalten, danach immer die kompakte Karte lesen statt den ganzen Code. Drei Ebenen — projektweit einrichten, Architektur kartieren, pro Aufgabe recherchieren:</w:t>
+      </w:r>
+    </w:p>
+    <w:p>
+      <w:pPr>
+        <w:spacing w:after="40"/>
+      </w:pPr>
+      <w:r>
+        <w:rPr>
+          <w:rFonts w:ascii="Calibri" w:hAnsi="Calibri"/>
+          <w:b/>
+          <w:i w:val="0"/>
+          <w:color w:val="312E81"/>
+          <w:sz w:val="21"/>
+        </w:rPr>
+        <w:t>a) Projekt ECC-ready machen — /ecc-onboard (einmalig je Projekt)</w:t>
       </w:r>
     </w:p>
     <w:p>
@@ -1785,7 +1815,7 @@
           <w:color w:val="1F2937"/>
           <w:sz w:val="21"/>
         </w:rPr>
-        <w:t>Ein einziger Command macht ein beliebiges Projekt ECC-ready — Auto-Detect, ein OK, fertig. Er orchestriert Stack-Detection, den ECC-Installer (project-level) und das state/-Pattern:</w:t>
+        <w:t>Ein Command, ein OK: erkennt den Stack, installiert ECC project-level und legt persistente Projekt-Dateien an, die Claude künftig zuerst liest.</w:t>
       </w:r>
     </w:p>
     <w:tbl>
@@ -1803,7 +1833,7 @@
       <w:tr>
         <w:tc>
           <w:tcPr>
-            <w:tcW w:type="dxa" w:w="2160"/>
+            <w:tcW w:type="dxa" w:w="1872"/>
             <w:shd w:val="clear" w:color="auto" w:fill="312E81"/>
           </w:tcPr>
           <w:p>
@@ -1824,7 +1854,7 @@
         </w:tc>
         <w:tc>
           <w:tcPr>
-            <w:tcW w:type="dxa" w:w="4320"/>
+            <w:tcW w:type="dxa" w:w="4896"/>
             <w:shd w:val="clear" w:color="auto" w:fill="312E81"/>
           </w:tcPr>
           <w:p>
@@ -1845,7 +1875,7 @@
         </w:tc>
         <w:tc>
           <w:tcPr>
-            <w:tcW w:type="dxa" w:w="3312"/>
+            <w:tcW w:type="dxa" w:w="3024"/>
             <w:shd w:val="clear" w:color="auto" w:fill="312E81"/>
           </w:tcPr>
           <w:p>
@@ -1860,7 +1890,7 @@
                 <w:color w:val="FFFFFF"/>
                 <w:sz w:val="19"/>
               </w:rPr>
-              <w:t>Ergebnis</w:t>
+              <w:t>Ergebnis (persistent)</w:t>
             </w:r>
           </w:p>
         </w:tc>
@@ -1868,7 +1898,7 @@
       <w:tr>
         <w:tc>
           <w:tcPr>
-            <w:tcW w:type="dxa" w:w="2160"/>
+            <w:tcW w:type="dxa" w:w="1872"/>
             <w:shd w:val="clear" w:color="auto" w:fill="F3F4F6"/>
           </w:tcPr>
           <w:p>
@@ -1889,7 +1919,7 @@
         </w:tc>
         <w:tc>
           <w:tcPr>
-            <w:tcW w:type="dxa" w:w="4320"/>
+            <w:tcW w:type="dxa" w:w="4896"/>
             <w:shd w:val="clear" w:color="auto" w:fill="F3F4F6"/>
           </w:tcPr>
           <w:p>
@@ -1904,13 +1934,13 @@
                 <w:color w:val="1F2937"/>
                 <w:sz w:val="19"/>
               </w:rPr>
-              <w:t>Stack aus package.json / pyproject.toml / go.mod … erkennen</w:t>
+              <w:t>Stack aus package.json / go.mod / pyproject.toml … erkennen</w:t>
             </w:r>
           </w:p>
         </w:tc>
         <w:tc>
           <w:tcPr>
-            <w:tcW w:type="dxa" w:w="3312"/>
+            <w:tcW w:type="dxa" w:w="3024"/>
             <w:shd w:val="clear" w:color="auto" w:fill="F3F4F6"/>
           </w:tcPr>
           <w:p>
@@ -1933,7 +1963,7 @@
       <w:tr>
         <w:tc>
           <w:tcPr>
-            <w:tcW w:type="dxa" w:w="2160"/>
+            <w:tcW w:type="dxa" w:w="1872"/>
           </w:tcPr>
           <w:p>
             <w:pPr>
@@ -1953,7 +1983,7 @@
         </w:tc>
         <w:tc>
           <w:tcPr>
-            <w:tcW w:type="dxa" w:w="4320"/>
+            <w:tcW w:type="dxa" w:w="4896"/>
           </w:tcPr>
           <w:p>
             <w:pPr>
@@ -1967,13 +1997,13 @@
                 <w:color w:val="1F2937"/>
                 <w:sz w:val="19"/>
               </w:rPr>
-              <w:t>install-plan/-apply --target claude-project --dry-run</w:t>
+              <w:t>install-apply --target claude-project --dry-run</w:t>
             </w:r>
           </w:p>
         </w:tc>
         <w:tc>
           <w:tcPr>
-            <w:tcW w:type="dxa" w:w="3312"/>
+            <w:tcW w:type="dxa" w:w="3024"/>
           </w:tcPr>
           <w:p>
             <w:pPr>
@@ -1995,7 +2025,7 @@
       <w:tr>
         <w:tc>
           <w:tcPr>
-            <w:tcW w:type="dxa" w:w="2160"/>
+            <w:tcW w:type="dxa" w:w="1872"/>
             <w:shd w:val="clear" w:color="auto" w:fill="F3F4F6"/>
           </w:tcPr>
           <w:p>
@@ -2016,7 +2046,7 @@
         </w:tc>
         <w:tc>
           <w:tcPr>
-            <w:tcW w:type="dxa" w:w="4320"/>
+            <w:tcW w:type="dxa" w:w="4896"/>
             <w:shd w:val="clear" w:color="auto" w:fill="F3F4F6"/>
           </w:tcPr>
           <w:p>
@@ -2031,13 +2061,13 @@
                 <w:color w:val="1F2937"/>
                 <w:sz w:val="19"/>
               </w:rPr>
-              <w:t>1× OK des Users (AskUserQuestion)</w:t>
+              <w:t>1× OK des Users</w:t>
             </w:r>
           </w:p>
         </w:tc>
         <w:tc>
           <w:tcPr>
-            <w:tcW w:type="dxa" w:w="3312"/>
+            <w:tcW w:type="dxa" w:w="3024"/>
             <w:shd w:val="clear" w:color="auto" w:fill="F3F4F6"/>
           </w:tcPr>
           <w:p>
@@ -2060,7 +2090,7 @@
       <w:tr>
         <w:tc>
           <w:tcPr>
-            <w:tcW w:type="dxa" w:w="2160"/>
+            <w:tcW w:type="dxa" w:w="1872"/>
           </w:tcPr>
           <w:p>
             <w:pPr>
@@ -2080,7 +2110,7 @@
         </w:tc>
         <w:tc>
           <w:tcPr>
-            <w:tcW w:type="dxa" w:w="4320"/>
+            <w:tcW w:type="dxa" w:w="4896"/>
           </w:tcPr>
           <w:p>
             <w:pPr>
@@ -2100,7 +2130,7 @@
         </w:tc>
         <w:tc>
           <w:tcPr>
-            <w:tcW w:type="dxa" w:w="3312"/>
+            <w:tcW w:type="dxa" w:w="3024"/>
           </w:tcPr>
           <w:p>
             <w:pPr>
@@ -2122,7 +2152,7 @@
       <w:tr>
         <w:tc>
           <w:tcPr>
-            <w:tcW w:type="dxa" w:w="2160"/>
+            <w:tcW w:type="dxa" w:w="1872"/>
             <w:shd w:val="clear" w:color="auto" w:fill="F3F4F6"/>
           </w:tcPr>
           <w:p>
@@ -2143,7 +2173,7 @@
         </w:tc>
         <w:tc>
           <w:tcPr>
-            <w:tcW w:type="dxa" w:w="4320"/>
+            <w:tcW w:type="dxa" w:w="4896"/>
             <w:shd w:val="clear" w:color="auto" w:fill="F3F4F6"/>
           </w:tcPr>
           <w:p>
@@ -2158,13 +2188,13 @@
                 <w:color w:val="1F2937"/>
                 <w:sz w:val="19"/>
               </w:rPr>
-              <w:t>Templates füllen (echte Projektwerte)</w:t>
+              <w:t>Templates mit echten Werten füllen</w:t>
             </w:r>
           </w:p>
         </w:tc>
         <w:tc>
           <w:tcPr>
-            <w:tcW w:type="dxa" w:w="3312"/>
+            <w:tcW w:type="dxa" w:w="3024"/>
             <w:shd w:val="clear" w:color="auto" w:fill="F3F4F6"/>
           </w:tcPr>
           <w:p>
@@ -2187,6 +2217,323 @@
     </w:tbl>
     <w:p>
       <w:pPr>
+        <w:spacing w:after="80"/>
+      </w:pPr>
+      <w:r>
+        <w:rPr>
+          <w:rFonts w:ascii="Calibri" w:hAnsi="Calibri"/>
+          <w:b w:val="0"/>
+          <w:i/>
+          <w:color w:val="6B7280"/>
+          <w:sz w:val="19"/>
+        </w:rPr>
+        <w:t>Aus dem Zielprojekt-Verzeichnis ausführen (Install landet im aktuellen cwd). Idempotent: erneut ausführen merged, überschreibt nichts blind.</w:t>
+      </w:r>
+    </w:p>
+    <w:p>
+      <w:pPr>
+        <w:spacing w:after="40"/>
+      </w:pPr>
+      <w:r>
+        <w:rPr>
+          <w:rFonts w:ascii="Calibri" w:hAnsi="Calibri"/>
+          <w:b/>
+          <w:i w:val="0"/>
+          <w:color w:val="312E81"/>
+          <w:sz w:val="21"/>
+        </w:rPr>
+        <w:t>b) Architektur kartieren — /update-codemaps  (KERN-FEATURE)</w:t>
+      </w:r>
+    </w:p>
+    <w:p>
+      <w:pPr>
+        <w:spacing w:after="80"/>
+      </w:pPr>
+      <w:r>
+        <w:rPr>
+          <w:rFonts w:ascii="Calibri" w:hAnsi="Calibri"/>
+          <w:b w:val="0"/>
+          <w:i w:val="0"/>
+          <w:color w:val="1F2937"/>
+          <w:sz w:val="21"/>
+        </w:rPr>
+        <w:t>Scannt die Struktur EINMAL und schreibt token-arme Architektur-Karten auf Platte. In späteren Sessions liest Claude die kompakte Karte (billig) statt die ganze Codebase neu zu durchsuchen.</w:t>
+      </w:r>
+    </w:p>
+    <w:tbl>
+      <w:tblPr>
+        <w:tblStyle w:val="TableGrid"/>
+        <w:tblW w:type="auto" w:w="0"/>
+        <w:jc w:val="center"/>
+        <w:tblLook w:firstColumn="1" w:firstRow="1" w:lastColumn="0" w:lastRow="0" w:noHBand="0" w:noVBand="1" w:val="04A0"/>
+      </w:tblPr>
+      <w:tblGrid>
+        <w:gridCol w:w="4968"/>
+        <w:gridCol w:w="4968"/>
+      </w:tblGrid>
+      <w:tr>
+        <w:tc>
+          <w:tcPr>
+            <w:tcW w:type="dxa" w:w="3456"/>
+            <w:shd w:val="clear" w:color="auto" w:fill="312E81"/>
+          </w:tcPr>
+          <w:p>
+            <w:pPr>
+              <w:spacing w:after="40" w:before="40"/>
+            </w:pPr>
+            <w:r/>
+            <w:r>
+              <w:rPr>
+                <w:rFonts w:ascii="Calibri" w:hAnsi="Calibri"/>
+                <w:b/>
+                <w:color w:val="FFFFFF"/>
+                <w:sz w:val="19"/>
+              </w:rPr>
+              <w:t>Datei (in docs/CODEMAPS/)</w:t>
+            </w:r>
+          </w:p>
+        </w:tc>
+        <w:tc>
+          <w:tcPr>
+            <w:tcW w:type="dxa" w:w="6336"/>
+            <w:shd w:val="clear" w:color="auto" w:fill="312E81"/>
+          </w:tcPr>
+          <w:p>
+            <w:pPr>
+              <w:spacing w:after="40" w:before="40"/>
+            </w:pPr>
+            <w:r/>
+            <w:r>
+              <w:rPr>
+                <w:rFonts w:ascii="Calibri" w:hAnsi="Calibri"/>
+                <w:b/>
+                <w:color w:val="FFFFFF"/>
+                <w:sz w:val="19"/>
+              </w:rPr>
+              <w:t>Inhalt</w:t>
+            </w:r>
+          </w:p>
+        </w:tc>
+      </w:tr>
+      <w:tr>
+        <w:tc>
+          <w:tcPr>
+            <w:tcW w:type="dxa" w:w="3456"/>
+            <w:shd w:val="clear" w:color="auto" w:fill="F3F4F6"/>
+          </w:tcPr>
+          <w:p>
+            <w:pPr>
+              <w:spacing w:after="40" w:before="40"/>
+            </w:pPr>
+            <w:r/>
+            <w:r>
+              <w:rPr>
+                <w:rFonts w:ascii="Calibri" w:hAnsi="Calibri"/>
+                <w:b w:val="0"/>
+                <w:color w:val="1F2937"/>
+                <w:sz w:val="19"/>
+              </w:rPr>
+              <w:t>architecture.md</w:t>
+            </w:r>
+          </w:p>
+        </w:tc>
+        <w:tc>
+          <w:tcPr>
+            <w:tcW w:type="dxa" w:w="6336"/>
+            <w:shd w:val="clear" w:color="auto" w:fill="F3F4F6"/>
+          </w:tcPr>
+          <w:p>
+            <w:pPr>
+              <w:spacing w:after="40" w:before="40"/>
+            </w:pPr>
+            <w:r/>
+            <w:r>
+              <w:rPr>
+                <w:rFonts w:ascii="Calibri" w:hAnsi="Calibri"/>
+                <w:b w:val="0"/>
+                <w:color w:val="1F2937"/>
+                <w:sz w:val="19"/>
+              </w:rPr>
+              <w:t>System-Diagramm, Service-Grenzen, Datenfluss</w:t>
+            </w:r>
+          </w:p>
+        </w:tc>
+      </w:tr>
+      <w:tr>
+        <w:tc>
+          <w:tcPr>
+            <w:tcW w:type="dxa" w:w="3456"/>
+          </w:tcPr>
+          <w:p>
+            <w:pPr>
+              <w:spacing w:after="40" w:before="40"/>
+            </w:pPr>
+            <w:r/>
+            <w:r>
+              <w:rPr>
+                <w:rFonts w:ascii="Calibri" w:hAnsi="Calibri"/>
+                <w:b w:val="0"/>
+                <w:color w:val="1F2937"/>
+                <w:sz w:val="19"/>
+              </w:rPr>
+              <w:t>backend.md</w:t>
+            </w:r>
+          </w:p>
+        </w:tc>
+        <w:tc>
+          <w:tcPr>
+            <w:tcW w:type="dxa" w:w="6336"/>
+          </w:tcPr>
+          <w:p>
+            <w:pPr>
+              <w:spacing w:after="40" w:before="40"/>
+            </w:pPr>
+            <w:r/>
+            <w:r>
+              <w:rPr>
+                <w:rFonts w:ascii="Calibri" w:hAnsi="Calibri"/>
+                <w:b w:val="0"/>
+                <w:color w:val="1F2937"/>
+                <w:sz w:val="19"/>
+              </w:rPr>
+              <w:t>Routes → Controller → Service → Repository</w:t>
+            </w:r>
+          </w:p>
+        </w:tc>
+      </w:tr>
+      <w:tr>
+        <w:tc>
+          <w:tcPr>
+            <w:tcW w:type="dxa" w:w="3456"/>
+            <w:shd w:val="clear" w:color="auto" w:fill="F3F4F6"/>
+          </w:tcPr>
+          <w:p>
+            <w:pPr>
+              <w:spacing w:after="40" w:before="40"/>
+            </w:pPr>
+            <w:r/>
+            <w:r>
+              <w:rPr>
+                <w:rFonts w:ascii="Calibri" w:hAnsi="Calibri"/>
+                <w:b w:val="0"/>
+                <w:color w:val="1F2937"/>
+                <w:sz w:val="19"/>
+              </w:rPr>
+              <w:t>frontend.md</w:t>
+            </w:r>
+          </w:p>
+        </w:tc>
+        <w:tc>
+          <w:tcPr>
+            <w:tcW w:type="dxa" w:w="6336"/>
+            <w:shd w:val="clear" w:color="auto" w:fill="F3F4F6"/>
+          </w:tcPr>
+          <w:p>
+            <w:pPr>
+              <w:spacing w:after="40" w:before="40"/>
+            </w:pPr>
+            <w:r/>
+            <w:r>
+              <w:rPr>
+                <w:rFonts w:ascii="Calibri" w:hAnsi="Calibri"/>
+                <w:b w:val="0"/>
+                <w:color w:val="1F2937"/>
+                <w:sz w:val="19"/>
+              </w:rPr>
+              <w:t>Page-Tree, Komponenten-Hierarchie, State-Flow</w:t>
+            </w:r>
+          </w:p>
+        </w:tc>
+      </w:tr>
+      <w:tr>
+        <w:tc>
+          <w:tcPr>
+            <w:tcW w:type="dxa" w:w="3456"/>
+          </w:tcPr>
+          <w:p>
+            <w:pPr>
+              <w:spacing w:after="40" w:before="40"/>
+            </w:pPr>
+            <w:r/>
+            <w:r>
+              <w:rPr>
+                <w:rFonts w:ascii="Calibri" w:hAnsi="Calibri"/>
+                <w:b w:val="0"/>
+                <w:color w:val="1F2937"/>
+                <w:sz w:val="19"/>
+              </w:rPr>
+              <w:t>data.md</w:t>
+            </w:r>
+          </w:p>
+        </w:tc>
+        <w:tc>
+          <w:tcPr>
+            <w:tcW w:type="dxa" w:w="6336"/>
+          </w:tcPr>
+          <w:p>
+            <w:pPr>
+              <w:spacing w:after="40" w:before="40"/>
+            </w:pPr>
+            <w:r/>
+            <w:r>
+              <w:rPr>
+                <w:rFonts w:ascii="Calibri" w:hAnsi="Calibri"/>
+                <w:b w:val="0"/>
+                <w:color w:val="1F2937"/>
+                <w:sz w:val="19"/>
+              </w:rPr>
+              <w:t>Tabellen, Relationen, Migrations-Historie</w:t>
+            </w:r>
+          </w:p>
+        </w:tc>
+      </w:tr>
+      <w:tr>
+        <w:tc>
+          <w:tcPr>
+            <w:tcW w:type="dxa" w:w="3456"/>
+            <w:shd w:val="clear" w:color="auto" w:fill="F3F4F6"/>
+          </w:tcPr>
+          <w:p>
+            <w:pPr>
+              <w:spacing w:after="40" w:before="40"/>
+            </w:pPr>
+            <w:r/>
+            <w:r>
+              <w:rPr>
+                <w:rFonts w:ascii="Calibri" w:hAnsi="Calibri"/>
+                <w:b w:val="0"/>
+                <w:color w:val="1F2937"/>
+                <w:sz w:val="19"/>
+              </w:rPr>
+              <w:t>dependencies.md</w:t>
+            </w:r>
+          </w:p>
+        </w:tc>
+        <w:tc>
+          <w:tcPr>
+            <w:tcW w:type="dxa" w:w="6336"/>
+            <w:shd w:val="clear" w:color="auto" w:fill="F3F4F6"/>
+          </w:tcPr>
+          <w:p>
+            <w:pPr>
+              <w:spacing w:after="40" w:before="40"/>
+            </w:pPr>
+            <w:r/>
+            <w:r>
+              <w:rPr>
+                <w:rFonts w:ascii="Calibri" w:hAnsi="Calibri"/>
+                <w:b w:val="0"/>
+                <w:color w:val="1F2937"/>
+                <w:sz w:val="19"/>
+              </w:rPr>
+              <w:t>externe Dienste, Third-Party-Integrationen</w:t>
+            </w:r>
+          </w:p>
+        </w:tc>
+      </w:tr>
+    </w:tbl>
+    <w:p>
+      <w:pPr>
         <w:spacing w:before="120" w:after="120"/>
         <w:ind w:left="120"/>
         <w:shd w:val="clear" w:color="auto" w:fill="EEF2FF"/>
@@ -2197,14 +2544,114 @@
           <w:color w:val="1E1B4B"/>
           <w:sz w:val="20"/>
         </w:rPr>
-        <w:t xml:space="preserve">Wichtig:  </w:t>
+        <w:t xml:space="preserve">Wann neu bauen?  </w:t>
       </w:r>
       <w:r>
         <w:rPr>
           <w:color w:val="1F2937"/>
           <w:sz w:val="20"/>
         </w:rPr>
-        <w:t>Aus dem Zielprojekt-Verzeichnis ausführen — der project-level Install landet im aktuellen cwd. /ecc-onboard ist idempotent: erneutes Ausführen merged, überschreibt nichts blind.</w:t>
+        <w:t>Codemaps sind ein Snapshot — sie aktualisieren sich nicht von selbst. Nach größeren Architektur-Änderungen /update-codemaps erneut laufen lassen. Erstes Mal in einem fremden Repo: Skill codebase-onboarding erzeugt zusätzlich Entry-Points, Konventionen + Starter-CLAUDE.md.</w:t>
+      </w:r>
+    </w:p>
+    <w:p>
+      <w:pPr>
+        <w:spacing w:after="40"/>
+      </w:pPr>
+      <w:r>
+        <w:rPr>
+          <w:rFonts w:ascii="Calibri" w:hAnsi="Calibri"/>
+          <w:b/>
+          <w:i w:val="0"/>
+          <w:color w:val="312E81"/>
+          <w:sz w:val="21"/>
+        </w:rPr>
+        <w:t>c) Pro Aufgabe recherchieren — research.md-Pattern</w:t>
+      </w:r>
+    </w:p>
+    <w:p>
+      <w:pPr>
+        <w:pStyle w:val="ListBullet"/>
+        <w:spacing w:after="40"/>
+      </w:pPr>
+      <w:r>
+        <w:rPr>
+          <w:b/>
+          <w:color w:val="1E1B4B"/>
+          <w:sz w:val="21"/>
+        </w:rPr>
+        <w:t xml:space="preserve">Phase-1-Output in Datei: </w:t>
+      </w:r>
+      <w:r>
+        <w:rPr>
+          <w:color w:val="1F2937"/>
+          <w:sz w:val="21"/>
+        </w:rPr>
+        <w:t>Ein Explore-/code-explorer-Agent kartiert die für DIE Aufgabe relevanten Dateien/Muster → research.md. Das wird Input für /plan.</w:t>
+      </w:r>
+    </w:p>
+    <w:p>
+      <w:pPr>
+        <w:pStyle w:val="ListBullet"/>
+        <w:spacing w:after="40"/>
+      </w:pPr>
+      <w:r>
+        <w:rPr>
+          <w:b/>
+          <w:color w:val="1E1B4B"/>
+          <w:sz w:val="21"/>
+        </w:rPr>
+        <w:t xml:space="preserve">code-tour (optional): </w:t>
+      </w:r>
+      <w:r>
+        <w:rPr>
+          <w:color w:val="1F2937"/>
+          <w:sz w:val="21"/>
+        </w:rPr>
+        <w:t>Erzeugt wiederverwendbare .tour-Dateien (öffnen direkt Datei+Zeile) — ideal für Onboarding neuer Mitarbeiter oder Architektur-Walkthroughs.</w:t>
+      </w:r>
+    </w:p>
+    <w:p>
+      <w:pPr>
+        <w:pStyle w:val="ListBullet"/>
+        <w:spacing w:after="40"/>
+      </w:pPr>
+      <w:r>
+        <w:rPr>
+          <w:b/>
+          <w:color w:val="1E1B4B"/>
+          <w:sz w:val="21"/>
+        </w:rPr>
+        <w:t xml:space="preserve">claude-mem ergänzt: </w:t>
+      </w:r>
+      <w:r>
+        <w:rPr>
+          <w:color w:val="1F2937"/>
+          <w:sz w:val="21"/>
+        </w:rPr>
+        <w:t>Injiziert relevanten Kontext aus früheren Sessions ab der 2. Session automatisch — Erinnerung ohne Zutun. /mem-search für gezielte Treffer („schon mal gelöst?").</w:t>
+      </w:r>
+    </w:p>
+    <w:p>
+      <w:pPr>
+        <w:spacing w:before="120" w:after="120"/>
+        <w:ind w:left="120"/>
+        <w:shd w:val="clear" w:color="auto" w:fill="EEF2FF"/>
+      </w:pPr>
+      <w:r>
+        <w:rPr>
+          <w:b/>
+          <w:color w:val="1E1B4B"/>
+          <w:sz w:val="20"/>
+        </w:rPr>
+        <w:t xml:space="preserve">Die Regel dahinter:  </w:t>
+      </w:r>
+      <w:r>
+        <w:rPr>
+          <w:color w:val="1F2937"/>
+          <w:sz w:val="20"/>
+        </w:rPr>
+        <w:t>„In Dateien speichern, nicht im Kopf behalten." research.md → plan.md → review.md, dazwischen /clear. Codemaps + PROJECT_RULES.md + state/ sind die dauerhafte Landkarte; der Chat-Kontext bleibt schlank.</w:t>
       </w:r>
     </w:p>
     <w:p>
@@ -2489,6 +2936,133 @@
                 <w:sz w:val="19"/>
               </w:rPr>
               <w:t>Stack erkennen → 1× OK → Rules/Skills + PROJECT_RULES.md + state/</w:t>
+            </w:r>
+          </w:p>
+        </w:tc>
+      </w:tr>
+      <w:tr>
+        <w:tc>
+          <w:tcPr>
+            <w:tcW w:type="dxa" w:w="2736"/>
+          </w:tcPr>
+          <w:p>
+            <w:pPr>
+              <w:spacing w:after="40" w:before="40"/>
+            </w:pPr>
+            <w:r/>
+            <w:r>
+              <w:rPr>
+                <w:rFonts w:ascii="Calibri" w:hAnsi="Calibri"/>
+                <w:b w:val="0"/>
+                <w:color w:val="1F2937"/>
+                <w:sz w:val="19"/>
+              </w:rPr>
+              <w:t>Codebase kartieren (1×)</w:t>
+            </w:r>
+          </w:p>
+        </w:tc>
+        <w:tc>
+          <w:tcPr>
+            <w:tcW w:type="dxa" w:w="3600"/>
+          </w:tcPr>
+          <w:p>
+            <w:pPr>
+              <w:spacing w:after="40" w:before="40"/>
+            </w:pPr>
+            <w:r/>
+            <w:r>
+              <w:rPr>
+                <w:rFonts w:ascii="Calibri" w:hAnsi="Calibri"/>
+                <w:b w:val="0"/>
+                <w:color w:val="1F2937"/>
+                <w:sz w:val="19"/>
+              </w:rPr>
+              <w:t>/update-codemaps</w:t>
+            </w:r>
+          </w:p>
+        </w:tc>
+        <w:tc>
+          <w:tcPr>
+            <w:tcW w:type="dxa" w:w="3456"/>
+          </w:tcPr>
+          <w:p>
+            <w:pPr>
+              <w:spacing w:after="40" w:before="40"/>
+            </w:pPr>
+            <w:r/>
+            <w:r>
+              <w:rPr>
+                <w:rFonts w:ascii="Calibri" w:hAnsi="Calibri"/>
+                <w:b w:val="0"/>
+                <w:color w:val="1F2937"/>
+                <w:sz w:val="19"/>
+              </w:rPr>
+              <w:t>token-arme Architektur-Karten in docs/CODEMAPS/ — statt neu suchen</w:t>
+            </w:r>
+          </w:p>
+        </w:tc>
+      </w:tr>
+      <w:tr>
+        <w:tc>
+          <w:tcPr>
+            <w:tcW w:type="dxa" w:w="2736"/>
+            <w:shd w:val="clear" w:color="auto" w:fill="F3F4F6"/>
+          </w:tcPr>
+          <w:p>
+            <w:pPr>
+              <w:spacing w:after="40" w:before="40"/>
+            </w:pPr>
+            <w:r/>
+            <w:r>
+              <w:rPr>
+                <w:rFonts w:ascii="Calibri" w:hAnsi="Calibri"/>
+                <w:b w:val="0"/>
+                <w:color w:val="1F2937"/>
+                <w:sz w:val="19"/>
+              </w:rPr>
+              <w:t>Fremdes Repo verstehen</w:t>
+            </w:r>
+          </w:p>
+        </w:tc>
+        <w:tc>
+          <w:tcPr>
+            <w:tcW w:type="dxa" w:w="3600"/>
+            <w:shd w:val="clear" w:color="auto" w:fill="F3F4F6"/>
+          </w:tcPr>
+          <w:p>
+            <w:pPr>
+              <w:spacing w:after="40" w:before="40"/>
+            </w:pPr>
+            <w:r/>
+            <w:r>
+              <w:rPr>
+                <w:rFonts w:ascii="Calibri" w:hAnsi="Calibri"/>
+                <w:b w:val="0"/>
+                <w:color w:val="1F2937"/>
+                <w:sz w:val="19"/>
+              </w:rPr>
+              <w:t>Skill codebase-onboarding</w:t>
+            </w:r>
+          </w:p>
+        </w:tc>
+        <w:tc>
+          <w:tcPr>
+            <w:tcW w:type="dxa" w:w="3456"/>
+            <w:shd w:val="clear" w:color="auto" w:fill="F3F4F6"/>
+          </w:tcPr>
+          <w:p>
+            <w:pPr>
+              <w:spacing w:after="40" w:before="40"/>
+            </w:pPr>
+            <w:r/>
+            <w:r>
+              <w:rPr>
+                <w:rFonts w:ascii="Calibri" w:hAnsi="Calibri"/>
+                <w:b w:val="0"/>
+                <w:color w:val="1F2937"/>
+                <w:sz w:val="19"/>
+              </w:rPr>
+              <w:t>Entry-Points, Konventionen, Starter-CLAUDE.md</w:t>
             </w:r>
           </w:p>
         </w:tc>

</xml_diff>

<commit_message>
docs: Doku-Drift bereinigen + Begleit-Guide neu bauen (Dark-Tech, Katalog, Word-TOC)
- README + legacy/README: RPI als archiviert, /ecc-onboard als aktiv, reale Zahlen (80 Commands / 63 Agents / 21 Skills core)
- build_guide.py: 2 Bugs raus, Zahlen vereinheitlicht, nicht-installierte Skill-Refs umgebogen, NEU Agent-/Skill-Katalog (Kap. 4), echtes klickbares Word-Inhaltsverzeichnis, Modellstrategie auf Opus-4.8-Default
- PPTX: Dark-Tech/Luxury-Redesign, fehlende Kapitel (Parallelisierung, ECC-CLIs) ergaenzt, durchgehende Foliennummern
- ecc/rules/common/git-workflow.md: Attribution-Hinweis korrigiert (AKTIV)
- docs/*.docx + *.pptx neu generiert

Co-Authored-By: Claude Opus 4.8 (1M context) <noreply@anthropic.com>
</commit_message>
<xml_diff>
--- a/docs/ECC-Harness-Guide.de.docx
+++ b/docs/ECC-Harness-Guide.de.docx
@@ -14,9 +14,6 @@
           <w:sz w:val="22"/>
         </w:rPr>
         <w:t xml:space="preserve">  ENGINEERING HARNESS</w:t>
-      </w:r>
-      <w:r>
-        <w:br/>
       </w:r>
     </w:p>
     <w:p>
@@ -76,217 +73,34 @@
     </w:p>
     <w:p>
       <w:pPr>
+        <w:pStyle w:val="Heading1"/>
         <w:spacing w:before="320" w:after="80"/>
         <w:pBdr>
           <w:bottom w:val="single" w:sz="18" w:space="2" w:color="06B6D4"/>
         </w:pBdr>
       </w:pPr>
       <w:r>
-        <w:rPr>
-          <w:rFonts w:ascii="Calibri" w:hAnsi="Calibri"/>
-          <w:b/>
-          <w:color w:val="312E81"/>
-          <w:sz w:val="34"/>
-        </w:rPr>
         <w:t>Inhalt</w:t>
       </w:r>
     </w:p>
     <w:p>
-      <w:pPr>
-        <w:pStyle w:val="ListBullet"/>
-        <w:spacing w:after="40"/>
-      </w:pPr>
       <w:r>
-        <w:rPr>
-          <w:color w:val="1F2937"/>
-          <w:sz w:val="21"/>
-        </w:rPr>
-        <w:t>1 · Was ist dieses Harness?</w:t>
+        <w:fldChar w:fldCharType="begin"/>
+        <w:instrText xml:space="preserve">TOC \o "1-2" \h \z \u</w:instrText>
+        <w:fldChar w:fldCharType="separate"/>
+        <w:t>Inhaltsverzeichnis – in Word mit F9 aktualisieren.</w:t>
+        <w:fldChar w:fldCharType="end"/>
       </w:r>
     </w:p>
     <w:p>
       <w:pPr>
-        <w:pStyle w:val="ListBullet"/>
-        <w:spacing w:after="40"/>
-      </w:pPr>
-      <w:r>
-        <w:rPr>
-          <w:color w:val="1F2937"/>
-          <w:sz w:val="21"/>
-        </w:rPr>
-        <w:t>2 · Setup &amp; VPS-Architektur (global, RTK, Koexistenz)</w:t>
-      </w:r>
-    </w:p>
-    <w:p>
-      <w:pPr>
-        <w:pStyle w:val="ListBullet"/>
-        <w:spacing w:after="40"/>
-      </w:pPr>
-      <w:r>
-        <w:rPr>
-          <w:color w:val="1F2937"/>
-          <w:sz w:val="21"/>
-        </w:rPr>
-        <w:t>3 · Mentales Modell — die Bausteine</w:t>
-      </w:r>
-    </w:p>
-    <w:p>
-      <w:pPr>
-        <w:pStyle w:val="ListBullet"/>
-        <w:spacing w:after="40"/>
-      </w:pPr>
-      <w:r>
-        <w:rPr>
-          <w:color w:val="1F2937"/>
-          <w:sz w:val="21"/>
-        </w:rPr>
-        <w:t>4 · Täglicher Workflow: die 5-Phasen-Pipeline</w:t>
-      </w:r>
-    </w:p>
-    <w:p>
-      <w:pPr>
-        <w:pStyle w:val="ListBullet"/>
-        <w:spacing w:after="40"/>
-      </w:pPr>
-      <w:r>
-        <w:rPr>
-          <w:color w:val="1F2937"/>
-          <w:sz w:val="21"/>
-        </w:rPr>
-        <w:t>5 · Onboarding &amp; Codebase einmal erkunden (Codemaps)</w:t>
-      </w:r>
-    </w:p>
-    <w:p>
-      <w:pPr>
-        <w:pStyle w:val="ListBullet"/>
-        <w:spacing w:after="40"/>
-      </w:pPr>
-      <w:r>
-        <w:rPr>
-          <w:color w:val="1F2937"/>
-          <w:sz w:val="21"/>
-        </w:rPr>
-        <w:t>6 · Cheat-Sheet: Wann welcher Command</w:t>
-      </w:r>
-    </w:p>
-    <w:p>
-      <w:pPr>
-        <w:pStyle w:val="ListBullet"/>
-        <w:spacing w:after="40"/>
-      </w:pPr>
-      <w:r>
-        <w:rPr>
-          <w:color w:val="1F2937"/>
-          <w:sz w:val="21"/>
-        </w:rPr>
-        <w:t>7 · Wann welcher MCP</w:t>
-      </w:r>
-    </w:p>
-    <w:p>
-      <w:pPr>
-        <w:pStyle w:val="ListBullet"/>
-        <w:spacing w:after="40"/>
-      </w:pPr>
-      <w:r>
-        <w:rPr>
-          <w:color w:val="1F2937"/>
-          <w:sz w:val="21"/>
-        </w:rPr>
-        <w:t>8 · Token-Ökonomie &amp; Modellstrategie</w:t>
-      </w:r>
-    </w:p>
-    <w:p>
-      <w:pPr>
-        <w:pStyle w:val="ListBullet"/>
-        <w:spacing w:after="40"/>
-      </w:pPr>
-      <w:r>
-        <w:rPr>
-          <w:color w:val="1F2937"/>
-          <w:sz w:val="21"/>
-        </w:rPr>
-        <w:t>9 · Memory &amp; Sessions</w:t>
-      </w:r>
-    </w:p>
-    <w:p>
-      <w:pPr>
-        <w:pStyle w:val="ListBullet"/>
-        <w:spacing w:after="40"/>
-      </w:pPr>
-      <w:r>
-        <w:rPr>
-          <w:color w:val="1F2937"/>
-          <w:sz w:val="21"/>
-        </w:rPr>
-        <w:t>10 · Continuous Learning (Self-Improvement)</w:t>
-      </w:r>
-    </w:p>
-    <w:p>
-      <w:pPr>
-        <w:pStyle w:val="ListBullet"/>
-        <w:spacing w:after="40"/>
-      </w:pPr>
-      <w:r>
-        <w:rPr>
-          <w:color w:val="1F2937"/>
-          <w:sz w:val="21"/>
-        </w:rPr>
-        <w:t>11 · Parallelisierung</w:t>
-      </w:r>
-    </w:p>
-    <w:p>
-      <w:pPr>
-        <w:pStyle w:val="ListBullet"/>
-        <w:spacing w:after="40"/>
-      </w:pPr>
-      <w:r>
-        <w:rPr>
-          <w:color w:val="1F2937"/>
-          <w:sz w:val="21"/>
-        </w:rPr>
-        <w:t>12 · Security im Alltag + VPS-Hinweise</w:t>
-      </w:r>
-    </w:p>
-    <w:p>
-      <w:pPr>
-        <w:pStyle w:val="ListBullet"/>
-        <w:spacing w:after="40"/>
-      </w:pPr>
-      <w:r>
-        <w:rPr>
-          <w:color w:val="1F2937"/>
-          <w:sz w:val="21"/>
-        </w:rPr>
-        <w:t>13 · ECC-CLIs &amp; Wartung</w:t>
-      </w:r>
-    </w:p>
-    <w:p>
-      <w:pPr>
-        <w:pStyle w:val="ListBullet"/>
-        <w:spacing w:after="40"/>
-      </w:pPr>
-      <w:r>
-        <w:rPr>
-          <w:color w:val="1F2937"/>
-          <w:sz w:val="21"/>
-        </w:rPr>
-        <w:t>14 · Quellen &amp; TL;DR</w:t>
-      </w:r>
-    </w:p>
-    <w:p>
-      <w:pPr>
+        <w:pStyle w:val="Heading1"/>
         <w:spacing w:before="320" w:after="80"/>
         <w:pBdr>
           <w:bottom w:val="single" w:sz="18" w:space="2" w:color="06B6D4"/>
         </w:pBdr>
       </w:pPr>
       <w:r>
-        <w:rPr>
-          <w:rFonts w:ascii="Calibri" w:hAnsi="Calibri"/>
-          <w:b/>
-          <w:color w:val="312E81"/>
-          <w:sz w:val="34"/>
-        </w:rPr>
         <w:t>1 · Was ist dieses Harness?</w:t>
       </w:r>
     </w:p>
@@ -323,7 +137,7 @@
           <w:color w:val="1F2937"/>
           <w:sz w:val="21"/>
         </w:rPr>
-        <w:t>von Affaan Mustafa — die dominante Engine: 63 Agents, ~79 Skills, 79 Commands, 21 Sprach-Rule-Packs, manifest-basierter Installer, Continuous Learning, Security-Scanning.</w:t>
+        <w:t>von Affaan Mustafa — die dominante Engine: 63 Agents, 249 Skills, ~80 Commands, manifest-basierter Installer, Continuous Learning, Security-Scanning. Global installiert (core-Profil): 80 Commands, 63 Agents, 21 ECC-Skills, rules/ecc = common + 19 Sprach-/Domain-Packs; mehr Skills via --profile full (249).</w:t>
       </w:r>
     </w:p>
     <w:p>
@@ -401,18 +215,13 @@
     </w:p>
     <w:p>
       <w:pPr>
+        <w:pStyle w:val="Heading1"/>
         <w:spacing w:before="320" w:after="80"/>
         <w:pBdr>
           <w:bottom w:val="single" w:sz="18" w:space="2" w:color="06B6D4"/>
         </w:pBdr>
       </w:pPr>
       <w:r>
-        <w:rPr>
-          <w:rFonts w:ascii="Calibri" w:hAnsi="Calibri"/>
-          <w:b/>
-          <w:color w:val="312E81"/>
-          <w:sz w:val="34"/>
-        </w:rPr>
         <w:t>2 · Setup &amp; VPS-Architektur</w:t>
       </w:r>
     </w:p>
@@ -773,7 +582,7 @@
                 <w:color w:val="1F2937"/>
                 <w:sz w:val="19"/>
               </w:rPr>
-              <w:t>Token-Ökonomie (§8)</w:t>
+              <w:t>Token-Ökonomie (§9)</w:t>
             </w:r>
           </w:p>
         </w:tc>
@@ -886,19 +695,14 @@
     </w:p>
     <w:p>
       <w:pPr>
+        <w:pStyle w:val="Heading1"/>
         <w:spacing w:before="320" w:after="80"/>
         <w:pBdr>
           <w:bottom w:val="single" w:sz="18" w:space="2" w:color="06B6D4"/>
         </w:pBdr>
       </w:pPr>
       <w:r>
-        <w:rPr>
-          <w:rFonts w:ascii="Calibri" w:hAnsi="Calibri"/>
-          <w:b/>
-          <w:color w:val="312E81"/>
-          <w:sz w:val="34"/>
-        </w:rPr>
-        <w:t>3 · Das mentale Modell — die Bausteine</w:t>
+        <w:t>3 · Mentales Modell — die Bausteine</w:t>
       </w:r>
     </w:p>
     <w:tbl>
@@ -1615,19 +1419,707 @@
     </w:p>
     <w:p>
       <w:pPr>
+        <w:pStyle w:val="Heading1"/>
         <w:spacing w:before="320" w:after="80"/>
         <w:pBdr>
           <w:bottom w:val="single" w:sz="18" w:space="2" w:color="06B6D4"/>
         </w:pBdr>
       </w:pPr>
       <w:r>
+        <w:t>4 · Agent- &amp; Skill-Katalog</w:t>
+      </w:r>
+    </w:p>
+    <w:p>
+      <w:pPr>
+        <w:spacing w:after="80"/>
+      </w:pPr>
+      <w:r>
         <w:rPr>
           <w:rFonts w:ascii="Calibri" w:hAnsi="Calibri"/>
           <w:b/>
+          <w:i w:val="0"/>
           <w:color w:val="312E81"/>
-          <w:sz w:val="34"/>
+          <w:sz w:val="21"/>
         </w:rPr>
-        <w:t>4 · Der tägliche Workflow — die 5-Phasen-Pipeline</w:t>
+        <w:t>63 Agents insgesamt — die wichtigsten:</w:t>
+      </w:r>
+    </w:p>
+    <w:p>
+      <w:pPr>
+        <w:spacing w:after="40"/>
+      </w:pPr>
+      <w:r>
+        <w:rPr>
+          <w:rFonts w:ascii="Calibri" w:hAnsi="Calibri"/>
+          <w:b/>
+          <w:i w:val="0"/>
+          <w:color w:val="1F2937"/>
+          <w:sz w:val="21"/>
+        </w:rPr>
+        <w:t>Core-Workflow:</w:t>
+      </w:r>
+    </w:p>
+    <w:p>
+      <w:pPr>
+        <w:pStyle w:val="ListBullet"/>
+        <w:spacing w:after="40"/>
+      </w:pPr>
+      <w:r>
+        <w:rPr>
+          <w:b/>
+          <w:color w:val="1E1B4B"/>
+          <w:sz w:val="21"/>
+        </w:rPr>
+        <w:t xml:space="preserve">planner </w:t>
+      </w:r>
+      <w:r>
+        <w:rPr>
+          <w:color w:val="1F2937"/>
+          <w:sz w:val="21"/>
+        </w:rPr>
+        <w:t>— Plan vor Code</w:t>
+      </w:r>
+    </w:p>
+    <w:p>
+      <w:pPr>
+        <w:pStyle w:val="ListBullet"/>
+        <w:spacing w:after="40"/>
+      </w:pPr>
+      <w:r>
+        <w:rPr>
+          <w:b/>
+          <w:color w:val="1E1B4B"/>
+          <w:sz w:val="21"/>
+        </w:rPr>
+        <w:t xml:space="preserve">architect / code-architect </w:t>
+      </w:r>
+      <w:r>
+        <w:rPr>
+          <w:color w:val="1F2937"/>
+          <w:sz w:val="21"/>
+        </w:rPr>
+        <w:t>— System-Design</w:t>
+      </w:r>
+    </w:p>
+    <w:p>
+      <w:pPr>
+        <w:pStyle w:val="ListBullet"/>
+        <w:spacing w:after="40"/>
+      </w:pPr>
+      <w:r>
+        <w:rPr>
+          <w:b/>
+          <w:color w:val="1E1B4B"/>
+          <w:sz w:val="21"/>
+        </w:rPr>
+        <w:t xml:space="preserve">code-explorer </w:t>
+      </w:r>
+      <w:r>
+        <w:rPr>
+          <w:color w:val="1F2937"/>
+          <w:sz w:val="21"/>
+        </w:rPr>
+        <w:t>— Codebase tracen</w:t>
+      </w:r>
+    </w:p>
+    <w:p>
+      <w:pPr>
+        <w:pStyle w:val="ListBullet"/>
+        <w:spacing w:after="40"/>
+      </w:pPr>
+      <w:r>
+        <w:rPr>
+          <w:b/>
+          <w:color w:val="1E1B4B"/>
+          <w:sz w:val="21"/>
+        </w:rPr>
+        <w:t xml:space="preserve">tdd-guide </w:t>
+      </w:r>
+      <w:r>
+        <w:rPr>
+          <w:color w:val="1F2937"/>
+          <w:sz w:val="21"/>
+        </w:rPr>
+        <w:t>— Tests zuerst</w:t>
+      </w:r>
+    </w:p>
+    <w:p>
+      <w:pPr>
+        <w:pStyle w:val="ListBullet"/>
+        <w:spacing w:after="40"/>
+      </w:pPr>
+      <w:r>
+        <w:rPr>
+          <w:b/>
+          <w:color w:val="1E1B4B"/>
+          <w:sz w:val="21"/>
+        </w:rPr>
+        <w:t xml:space="preserve">code-reviewer </w:t>
+      </w:r>
+      <w:r>
+        <w:rPr>
+          <w:color w:val="1F2937"/>
+          <w:sz w:val="21"/>
+        </w:rPr>
+        <w:t>— Qualität</w:t>
+      </w:r>
+    </w:p>
+    <w:p>
+      <w:pPr>
+        <w:pStyle w:val="ListBullet"/>
+        <w:spacing w:after="40"/>
+      </w:pPr>
+      <w:r>
+        <w:rPr>
+          <w:b/>
+          <w:color w:val="1E1B4B"/>
+          <w:sz w:val="21"/>
+        </w:rPr>
+        <w:t xml:space="preserve">security-reviewer </w:t>
+      </w:r>
+      <w:r>
+        <w:rPr>
+          <w:color w:val="1F2937"/>
+          <w:sz w:val="21"/>
+        </w:rPr>
+        <w:t>— OWASP / Secrets</w:t>
+      </w:r>
+    </w:p>
+    <w:p>
+      <w:pPr>
+        <w:pStyle w:val="ListBullet"/>
+        <w:spacing w:after="40"/>
+      </w:pPr>
+      <w:r>
+        <w:rPr>
+          <w:b/>
+          <w:color w:val="1E1B4B"/>
+          <w:sz w:val="21"/>
+        </w:rPr>
+        <w:t xml:space="preserve">build-error-resolver </w:t>
+      </w:r>
+      <w:r>
+        <w:rPr>
+          <w:color w:val="1F2937"/>
+          <w:sz w:val="21"/>
+        </w:rPr>
+        <w:t>— Build grün</w:t>
+      </w:r>
+    </w:p>
+    <w:p>
+      <w:pPr>
+        <w:pStyle w:val="ListBullet"/>
+        <w:spacing w:after="40"/>
+      </w:pPr>
+      <w:r>
+        <w:rPr>
+          <w:b/>
+          <w:color w:val="1E1B4B"/>
+          <w:sz w:val="21"/>
+        </w:rPr>
+        <w:t xml:space="preserve">refactor-cleaner </w:t>
+      </w:r>
+      <w:r>
+        <w:rPr>
+          <w:color w:val="1F2937"/>
+          <w:sz w:val="21"/>
+        </w:rPr>
+        <w:t>— toter Code raus</w:t>
+      </w:r>
+    </w:p>
+    <w:p>
+      <w:pPr>
+        <w:pStyle w:val="ListBullet"/>
+        <w:spacing w:after="40"/>
+      </w:pPr>
+      <w:r>
+        <w:rPr>
+          <w:b/>
+          <w:color w:val="1E1B4B"/>
+          <w:sz w:val="21"/>
+        </w:rPr>
+        <w:t xml:space="preserve">e2e-runner </w:t>
+      </w:r>
+      <w:r>
+        <w:rPr>
+          <w:color w:val="1F2937"/>
+          <w:sz w:val="21"/>
+        </w:rPr>
+        <w:t>— kritische Flows</w:t>
+      </w:r>
+    </w:p>
+    <w:p>
+      <w:pPr>
+        <w:pStyle w:val="ListBullet"/>
+        <w:spacing w:after="40"/>
+      </w:pPr>
+      <w:r>
+        <w:rPr>
+          <w:b/>
+          <w:color w:val="1E1B4B"/>
+          <w:sz w:val="21"/>
+        </w:rPr>
+        <w:t xml:space="preserve">doc-updater </w:t>
+      </w:r>
+      <w:r>
+        <w:rPr>
+          <w:color w:val="1F2937"/>
+          <w:sz w:val="21"/>
+        </w:rPr>
+        <w:t>— Doku-Sync</w:t>
+      </w:r>
+    </w:p>
+    <w:p>
+      <w:pPr>
+        <w:pStyle w:val="ListBullet"/>
+        <w:spacing w:after="40"/>
+      </w:pPr>
+      <w:r>
+        <w:rPr>
+          <w:b/>
+          <w:color w:val="1E1B4B"/>
+          <w:sz w:val="21"/>
+        </w:rPr>
+        <w:t xml:space="preserve">performance-optimizer </w:t>
+      </w:r>
+      <w:r>
+        <w:rPr>
+          <w:color w:val="1F2937"/>
+          <w:sz w:val="21"/>
+        </w:rPr>
+        <w:t>— Hot-Paths</w:t>
+      </w:r>
+    </w:p>
+    <w:p>
+      <w:pPr>
+        <w:pStyle w:val="ListBullet"/>
+        <w:spacing w:after="40"/>
+      </w:pPr>
+      <w:r>
+        <w:rPr>
+          <w:b/>
+          <w:color w:val="1E1B4B"/>
+          <w:sz w:val="21"/>
+        </w:rPr>
+        <w:t xml:space="preserve">silent-failure-hunter </w:t>
+      </w:r>
+      <w:r>
+        <w:rPr>
+          <w:color w:val="1F2937"/>
+          <w:sz w:val="21"/>
+        </w:rPr>
+        <w:t>— verschluckte Fehler</w:t>
+      </w:r>
+    </w:p>
+    <w:p>
+      <w:pPr>
+        <w:spacing w:after="40"/>
+      </w:pPr>
+      <w:r>
+        <w:rPr>
+          <w:rFonts w:ascii="Calibri" w:hAnsi="Calibri"/>
+          <w:b/>
+          <w:i w:val="0"/>
+          <w:color w:val="1F2937"/>
+          <w:sz w:val="21"/>
+        </w:rPr>
+        <w:t>Sprach-Reviewer:</w:t>
+      </w:r>
+    </w:p>
+    <w:p>
+      <w:pPr>
+        <w:spacing w:after="80"/>
+      </w:pPr>
+      <w:r>
+        <w:rPr>
+          <w:rFonts w:ascii="Calibri" w:hAnsi="Calibri"/>
+          <w:b w:val="0"/>
+          <w:i w:val="0"/>
+          <w:color w:val="1F2937"/>
+          <w:sz w:val="20"/>
+        </w:rPr>
+        <w:t>python-reviewer · typescript-reviewer · react-reviewer · go-reviewer · rust-reviewer · cpp-reviewer · java-reviewer · kotlin-reviewer · swift-reviewer · csharp-reviewer · fsharp-reviewer · django-reviewer · fastapi-reviewer · flutter-reviewer</w:t>
+      </w:r>
+    </w:p>
+    <w:p>
+      <w:pPr>
+        <w:spacing w:after="40"/>
+      </w:pPr>
+      <w:r>
+        <w:rPr>
+          <w:rFonts w:ascii="Calibri" w:hAnsi="Calibri"/>
+          <w:b/>
+          <w:i w:val="0"/>
+          <w:color w:val="1F2937"/>
+          <w:sz w:val="21"/>
+        </w:rPr>
+        <w:t>Build-Resolver:</w:t>
+      </w:r>
+    </w:p>
+    <w:p>
+      <w:pPr>
+        <w:spacing w:after="80"/>
+      </w:pPr>
+      <w:r>
+        <w:rPr>
+          <w:rFonts w:ascii="Calibri" w:hAnsi="Calibri"/>
+          <w:b w:val="0"/>
+          <w:i w:val="0"/>
+          <w:color w:val="1F2937"/>
+          <w:sz w:val="20"/>
+        </w:rPr>
+        <w:t>go-build-resolver · rust-build-resolver · cpp-build-resolver · java-build-resolver · kotlin-build-resolver · swift-build-resolver · dart-build-resolver · django-build-resolver · react-build-resolver · pytorch-build-resolver</w:t>
+      </w:r>
+    </w:p>
+    <w:p>
+      <w:pPr>
+        <w:spacing w:after="40"/>
+      </w:pPr>
+      <w:r>
+        <w:rPr>
+          <w:rFonts w:ascii="Calibri" w:hAnsi="Calibri"/>
+          <w:b/>
+          <w:i w:val="0"/>
+          <w:color w:val="1F2937"/>
+          <w:sz w:val="21"/>
+        </w:rPr>
+        <w:t>Spezial:</w:t>
+      </w:r>
+    </w:p>
+    <w:p>
+      <w:pPr>
+        <w:spacing w:after="120"/>
+      </w:pPr>
+      <w:r>
+        <w:rPr>
+          <w:rFonts w:ascii="Calibri" w:hAnsi="Calibri"/>
+          <w:b w:val="0"/>
+          <w:i w:val="0"/>
+          <w:color w:val="1F2937"/>
+          <w:sz w:val="20"/>
+        </w:rPr>
+        <w:t>database-reviewer · a11y-architect · type-design-analyzer · comment-analyzer · gan-planner / generator / evaluator · harness-optimizer · marketing-agent · seo-specialist · network-architect · docs-lookup · mle-reviewer</w:t>
+      </w:r>
+    </w:p>
+    <w:p>
+      <w:pPr>
+        <w:spacing w:after="80"/>
+      </w:pPr>
+      <w:r>
+        <w:rPr>
+          <w:rFonts w:ascii="Calibri" w:hAnsi="Calibri"/>
+          <w:b/>
+          <w:i w:val="0"/>
+          <w:color w:val="312E81"/>
+          <w:sz w:val="21"/>
+        </w:rPr>
+        <w:t>21 ECC-Skills (core-Profil) — gruppiert:</w:t>
+      </w:r>
+    </w:p>
+    <w:tbl>
+      <w:tblPr>
+        <w:tblStyle w:val="TableGrid"/>
+        <w:tblW w:type="auto" w:w="0"/>
+        <w:jc w:val="center"/>
+        <w:tblLook w:firstColumn="1" w:firstRow="1" w:lastColumn="0" w:lastRow="0" w:noHBand="0" w:noVBand="1" w:val="04A0"/>
+      </w:tblPr>
+      <w:tblGrid>
+        <w:gridCol w:w="4968"/>
+        <w:gridCol w:w="4968"/>
+      </w:tblGrid>
+      <w:tr>
+        <w:tc>
+          <w:tcPr>
+            <w:tcW w:type="dxa" w:w="2736"/>
+            <w:shd w:val="clear" w:color="auto" w:fill="312E81"/>
+          </w:tcPr>
+          <w:p>
+            <w:pPr>
+              <w:spacing w:after="40" w:before="40"/>
+            </w:pPr>
+            <w:r/>
+            <w:r>
+              <w:rPr>
+                <w:rFonts w:ascii="Calibri" w:hAnsi="Calibri"/>
+                <w:b/>
+                <w:color w:val="FFFFFF"/>
+                <w:sz w:val="19"/>
+              </w:rPr>
+              <w:t>Gruppe</w:t>
+            </w:r>
+          </w:p>
+        </w:tc>
+        <w:tc>
+          <w:tcPr>
+            <w:tcW w:type="dxa" w:w="7056"/>
+            <w:shd w:val="clear" w:color="auto" w:fill="312E81"/>
+          </w:tcPr>
+          <w:p>
+            <w:pPr>
+              <w:spacing w:after="40" w:before="40"/>
+            </w:pPr>
+            <w:r/>
+            <w:r>
+              <w:rPr>
+                <w:rFonts w:ascii="Calibri" w:hAnsi="Calibri"/>
+                <w:b/>
+                <w:color w:val="FFFFFF"/>
+                <w:sz w:val="19"/>
+              </w:rPr>
+              <w:t>Skills</w:t>
+            </w:r>
+          </w:p>
+        </w:tc>
+      </w:tr>
+      <w:tr>
+        <w:tc>
+          <w:tcPr>
+            <w:tcW w:type="dxa" w:w="2736"/>
+            <w:shd w:val="clear" w:color="auto" w:fill="F3F4F6"/>
+          </w:tcPr>
+          <w:p>
+            <w:pPr>
+              <w:spacing w:after="40" w:before="40"/>
+            </w:pPr>
+            <w:r/>
+            <w:r>
+              <w:rPr>
+                <w:rFonts w:ascii="Calibri" w:hAnsi="Calibri"/>
+                <w:b w:val="0"/>
+                <w:color w:val="1F2937"/>
+                <w:sz w:val="19"/>
+              </w:rPr>
+              <w:t>Workflow / Qualität</w:t>
+            </w:r>
+          </w:p>
+        </w:tc>
+        <w:tc>
+          <w:tcPr>
+            <w:tcW w:type="dxa" w:w="7056"/>
+            <w:shd w:val="clear" w:color="auto" w:fill="F3F4F6"/>
+          </w:tcPr>
+          <w:p>
+            <w:pPr>
+              <w:spacing w:after="40" w:before="40"/>
+            </w:pPr>
+            <w:r/>
+            <w:r>
+              <w:rPr>
+                <w:rFonts w:ascii="Calibri" w:hAnsi="Calibri"/>
+                <w:b w:val="0"/>
+                <w:color w:val="1F2937"/>
+                <w:sz w:val="19"/>
+              </w:rPr>
+              <w:t>tdd-workflow · verification-loop · plankton-code-quality · production-audit · eval-harness · council · error-handling</w:t>
+            </w:r>
+          </w:p>
+        </w:tc>
+      </w:tr>
+      <w:tr>
+        <w:tc>
+          <w:tcPr>
+            <w:tcW w:type="dxa" w:w="2736"/>
+          </w:tcPr>
+          <w:p>
+            <w:pPr>
+              <w:spacing w:after="40" w:before="40"/>
+            </w:pPr>
+            <w:r/>
+            <w:r>
+              <w:rPr>
+                <w:rFonts w:ascii="Calibri" w:hAnsi="Calibri"/>
+                <w:b w:val="0"/>
+                <w:color w:val="1F2937"/>
+                <w:sz w:val="19"/>
+              </w:rPr>
+              <w:t>Codebase / Recherche</w:t>
+            </w:r>
+          </w:p>
+        </w:tc>
+        <w:tc>
+          <w:tcPr>
+            <w:tcW w:type="dxa" w:w="7056"/>
+          </w:tcPr>
+          <w:p>
+            <w:pPr>
+              <w:spacing w:after="40" w:before="40"/>
+            </w:pPr>
+            <w:r/>
+            <w:r>
+              <w:rPr>
+                <w:rFonts w:ascii="Calibri" w:hAnsi="Calibri"/>
+                <w:b w:val="0"/>
+                <w:color w:val="1F2937"/>
+                <w:sz w:val="19"/>
+              </w:rPr>
+              <w:t>code-tour · iterative-retrieval · skill-scout · skill-stocktake</w:t>
+            </w:r>
+          </w:p>
+        </w:tc>
+      </w:tr>
+      <w:tr>
+        <w:tc>
+          <w:tcPr>
+            <w:tcW w:type="dxa" w:w="2736"/>
+            <w:shd w:val="clear" w:color="auto" w:fill="F3F4F6"/>
+          </w:tcPr>
+          <w:p>
+            <w:pPr>
+              <w:spacing w:after="40" w:before="40"/>
+            </w:pPr>
+            <w:r/>
+            <w:r>
+              <w:rPr>
+                <w:rFonts w:ascii="Calibri" w:hAnsi="Calibri"/>
+                <w:b w:val="0"/>
+                <w:color w:val="1F2937"/>
+                <w:sz w:val="19"/>
+              </w:rPr>
+              <w:t>Testing</w:t>
+            </w:r>
+          </w:p>
+        </w:tc>
+        <w:tc>
+          <w:tcPr>
+            <w:tcW w:type="dxa" w:w="7056"/>
+            <w:shd w:val="clear" w:color="auto" w:fill="F3F4F6"/>
+          </w:tcPr>
+          <w:p>
+            <w:pPr>
+              <w:spacing w:after="40" w:before="40"/>
+            </w:pPr>
+            <w:r/>
+            <w:r>
+              <w:rPr>
+                <w:rFonts w:ascii="Calibri" w:hAnsi="Calibri"/>
+                <w:b w:val="0"/>
+                <w:color w:val="1F2937"/>
+                <w:sz w:val="19"/>
+              </w:rPr>
+              <w:t>e2e-testing · ai-regression-testing · windows-desktop-e2e</w:t>
+            </w:r>
+          </w:p>
+        </w:tc>
+      </w:tr>
+      <w:tr>
+        <w:tc>
+          <w:tcPr>
+            <w:tcW w:type="dxa" w:w="2736"/>
+          </w:tcPr>
+          <w:p>
+            <w:pPr>
+              <w:spacing w:after="40" w:before="40"/>
+            </w:pPr>
+            <w:r/>
+            <w:r>
+              <w:rPr>
+                <w:rFonts w:ascii="Calibri" w:hAnsi="Calibri"/>
+                <w:b w:val="0"/>
+                <w:color w:val="1F2937"/>
+                <w:sz w:val="19"/>
+              </w:rPr>
+              <w:t>Lernen / Memory</w:t>
+            </w:r>
+          </w:p>
+        </w:tc>
+        <w:tc>
+          <w:tcPr>
+            <w:tcW w:type="dxa" w:w="7056"/>
+          </w:tcPr>
+          <w:p>
+            <w:pPr>
+              <w:spacing w:after="40" w:before="40"/>
+            </w:pPr>
+            <w:r/>
+            <w:r>
+              <w:rPr>
+                <w:rFonts w:ascii="Calibri" w:hAnsi="Calibri"/>
+                <w:b w:val="0"/>
+                <w:color w:val="1F2937"/>
+                <w:sz w:val="19"/>
+              </w:rPr>
+              <w:t>continuous-learning(-v2) · strategic-compact · agent-introspection-debugging</w:t>
+            </w:r>
+          </w:p>
+        </w:tc>
+      </w:tr>
+      <w:tr>
+        <w:tc>
+          <w:tcPr>
+            <w:tcW w:type="dxa" w:w="2736"/>
+            <w:shd w:val="clear" w:color="auto" w:fill="F3F4F6"/>
+          </w:tcPr>
+          <w:p>
+            <w:pPr>
+              <w:spacing w:after="40" w:before="40"/>
+            </w:pPr>
+            <w:r/>
+            <w:r>
+              <w:rPr>
+                <w:rFonts w:ascii="Calibri" w:hAnsi="Calibri"/>
+                <w:b w:val="0"/>
+                <w:color w:val="1F2937"/>
+                <w:sz w:val="19"/>
+              </w:rPr>
+              <w:t>Setup / Automatik</w:t>
+            </w:r>
+          </w:p>
+        </w:tc>
+        <w:tc>
+          <w:tcPr>
+            <w:tcW w:type="dxa" w:w="7056"/>
+            <w:shd w:val="clear" w:color="auto" w:fill="F3F4F6"/>
+          </w:tcPr>
+          <w:p>
+            <w:pPr>
+              <w:spacing w:after="40" w:before="40"/>
+            </w:pPr>
+            <w:r/>
+            <w:r>
+              <w:rPr>
+                <w:rFonts w:ascii="Calibri" w:hAnsi="Calibri"/>
+                <w:b w:val="0"/>
+                <w:color w:val="1F2937"/>
+                <w:sz w:val="19"/>
+              </w:rPr>
+              <w:t>configure-ecc · hookify-rules · agent-sort</w:t>
+            </w:r>
+          </w:p>
+        </w:tc>
+      </w:tr>
+    </w:tbl>
+    <w:p>
+      <w:pPr>
+        <w:spacing w:before="120" w:after="120"/>
+        <w:ind w:left="120"/>
+        <w:shd w:val="clear" w:color="auto" w:fill="EEF2FF"/>
+      </w:pPr>
+      <w:r>
+        <w:rPr>
+          <w:b/>
+          <w:color w:val="1E1B4B"/>
+          <w:sz w:val="20"/>
+        </w:rPr>
+        <w:t xml:space="preserve">Mehr verfügbar:  </w:t>
+      </w:r>
+      <w:r>
+        <w:rPr>
+          <w:color w:val="1F2937"/>
+          <w:sz w:val="20"/>
+        </w:rPr>
+        <w:t>Mehr (249 Skills) via ./install-vps.sh --profile full. claude-mem (mem-search, smart-explore) + superpowers koexistieren.</w:t>
+      </w:r>
+    </w:p>
+    <w:p>
+      <w:pPr>
+        <w:pStyle w:val="Heading1"/>
+        <w:spacing w:before="320" w:after="80"/>
+        <w:pBdr>
+          <w:bottom w:val="single" w:sz="18" w:space="2" w:color="06B6D4"/>
+        </w:pBdr>
+      </w:pPr>
+      <w:r>
+        <w:t>5 · Täglicher Workflow — die 5-Phasen-Pipeline</w:t>
       </w:r>
     </w:p>
     <w:p>
@@ -1758,19 +2250,14 @@
     </w:p>
     <w:p>
       <w:pPr>
+        <w:pStyle w:val="Heading1"/>
         <w:spacing w:before="320" w:after="80"/>
         <w:pBdr>
           <w:bottom w:val="single" w:sz="18" w:space="2" w:color="06B6D4"/>
         </w:pBdr>
       </w:pPr>
       <w:r>
-        <w:rPr>
-          <w:rFonts w:ascii="Calibri" w:hAnsi="Calibri"/>
-          <w:b/>
-          <w:color w:val="312E81"/>
-          <w:sz w:val="34"/>
-        </w:rPr>
-        <w:t>5 · Projekt-Onboarding &amp; Codebase einmal erkunden</w:t>
+        <w:t>6 · Onboarding &amp; Codebase einmal erkunden (Codemaps)</w:t>
       </w:r>
     </w:p>
     <w:p>
@@ -2551,7 +3038,7 @@
           <w:color w:val="1F2937"/>
           <w:sz w:val="20"/>
         </w:rPr>
-        <w:t>Codemaps sind ein Snapshot — sie aktualisieren sich nicht von selbst. Nach größeren Architektur-Änderungen /update-codemaps erneut laufen lassen. Erstes Mal in einem fremden Repo: Skill codebase-onboarding erzeugt zusätzlich Entry-Points, Konventionen + Starter-CLAUDE.md.</w:t>
+        <w:t>Codemaps sind ein Snapshot — sie aktualisieren sich nicht von selbst. Nach größeren Architektur-Änderungen /update-codemaps erneut laufen lassen. Erstes Mal in einem fremden Repo: code-tour-Skill bzw. claude-mem smart-explore/learn-codebase erzeugen Touren/Struktur.</w:t>
       </w:r>
     </w:p>
     <w:p>
@@ -2656,19 +3143,14 @@
     </w:p>
     <w:p>
       <w:pPr>
+        <w:pStyle w:val="Heading1"/>
         <w:spacing w:before="320" w:after="80"/>
         <w:pBdr>
           <w:bottom w:val="single" w:sz="18" w:space="2" w:color="06B6D4"/>
         </w:pBdr>
       </w:pPr>
       <w:r>
-        <w:rPr>
-          <w:rFonts w:ascii="Calibri" w:hAnsi="Calibri"/>
-          <w:b/>
-          <w:color w:val="312E81"/>
-          <w:sz w:val="34"/>
-        </w:rPr>
-        <w:t>6 · Cheat-Sheet — wann welcher Command</w:t>
+        <w:t>7 · Cheat-Sheet — wann welcher Command</w:t>
       </w:r>
     </w:p>
     <w:tbl>
@@ -3041,7 +3523,7 @@
                 <w:color w:val="1F2937"/>
                 <w:sz w:val="19"/>
               </w:rPr>
-              <w:t>Skill codebase-onboarding</w:t>
+              <w:t>/update-codemaps · code-tour · smart-explore</w:t>
             </w:r>
           </w:p>
         </w:tc>
@@ -3062,7 +3544,7 @@
                 <w:color w:val="1F2937"/>
                 <w:sz w:val="19"/>
               </w:rPr>
-              <w:t>Entry-Points, Konventionen, Starter-CLAUDE.md</w:t>
+              <w:t>Architektur kartieren, gefuehrte Touren, Struktur-Suche</w:t>
             </w:r>
           </w:p>
         </w:tc>
@@ -3358,7 +3840,7 @@
                 <w:color w:val="1F2937"/>
                 <w:sz w:val="19"/>
               </w:rPr>
-              <w:t>context7-MCP  ·  Skill documentation-lookup</w:t>
+              <w:t>context7-MCP · docs-lookup-Agent</w:t>
             </w:r>
           </w:p>
         </w:tc>
@@ -3782,19 +4264,14 @@
     </w:p>
     <w:p>
       <w:pPr>
+        <w:pStyle w:val="Heading1"/>
         <w:spacing w:before="320" w:after="80"/>
         <w:pBdr>
           <w:bottom w:val="single" w:sz="18" w:space="2" w:color="06B6D4"/>
         </w:pBdr>
       </w:pPr>
       <w:r>
-        <w:rPr>
-          <w:rFonts w:ascii="Calibri" w:hAnsi="Calibri"/>
-          <w:b/>
-          <w:color w:val="312E81"/>
-          <w:sz w:val="34"/>
-        </w:rPr>
-        <w:t>7 · Wann welcher MCP</w:t>
+        <w:t>8 · Wann welcher MCP</w:t>
       </w:r>
     </w:p>
     <w:p>
@@ -4465,19 +4942,14 @@
     </w:tbl>
     <w:p>
       <w:pPr>
+        <w:pStyle w:val="Heading1"/>
         <w:spacing w:before="320" w:after="80"/>
         <w:pBdr>
           <w:bottom w:val="single" w:sz="18" w:space="2" w:color="06B6D4"/>
         </w:pBdr>
       </w:pPr>
       <w:r>
-        <w:rPr>
-          <w:rFonts w:ascii="Calibri" w:hAnsi="Calibri"/>
-          <w:b/>
-          <w:color w:val="312E81"/>
-          <w:sz w:val="34"/>
-        </w:rPr>
-        <w:t>8 · Token-Ökonomie &amp; Modellstrategie</w:t>
+        <w:t>9 · Token-Ökonomie &amp; Modellstrategie</w:t>
       </w:r>
     </w:p>
     <w:p>
@@ -4531,7 +5003,7 @@
         </w:tc>
         <w:tc>
           <w:tcPr>
-            <w:tcW w:type="dxa" w:w="1728"/>
+            <w:tcW w:type="dxa" w:w="2304"/>
             <w:shd w:val="clear" w:color="auto" w:fill="312E81"/>
           </w:tcPr>
           <w:p>
@@ -4552,7 +5024,7 @@
         </w:tc>
         <w:tc>
           <w:tcPr>
-            <w:tcW w:type="dxa" w:w="4608"/>
+            <w:tcW w:type="dxa" w:w="4032"/>
             <w:shd w:val="clear" w:color="auto" w:fill="312E81"/>
           </w:tcPr>
           <w:p>
@@ -4596,7 +5068,7 @@
         </w:tc>
         <w:tc>
           <w:tcPr>
-            <w:tcW w:type="dxa" w:w="1728"/>
+            <w:tcW w:type="dxa" w:w="2304"/>
             <w:shd w:val="clear" w:color="auto" w:fill="F3F4F6"/>
           </w:tcPr>
           <w:p>
@@ -4611,13 +5083,13 @@
                 <w:color w:val="1F2937"/>
                 <w:sz w:val="19"/>
               </w:rPr>
-              <w:t>Haiku</w:t>
+              <w:t>Haiku 4.5</w:t>
             </w:r>
           </w:p>
         </w:tc>
         <w:tc>
           <w:tcPr>
-            <w:tcW w:type="dxa" w:w="4608"/>
+            <w:tcW w:type="dxa" w:w="4032"/>
             <w:shd w:val="clear" w:color="auto" w:fill="F3F4F6"/>
           </w:tcPr>
           <w:p>
@@ -4654,13 +5126,13 @@
                 <w:color w:val="1F2937"/>
                 <w:sz w:val="19"/>
               </w:rPr>
-              <w:t>Einfache Einzeldatei-Edits</w:t>
+              <w:t>Einfache, gut definierte Edits</w:t>
             </w:r>
           </w:p>
         </w:tc>
         <w:tc>
           <w:tcPr>
-            <w:tcW w:type="dxa" w:w="1728"/>
+            <w:tcW w:type="dxa" w:w="2304"/>
           </w:tcPr>
           <w:p>
             <w:pPr>
@@ -4674,13 +5146,13 @@
                 <w:color w:val="1F2937"/>
                 <w:sz w:val="19"/>
               </w:rPr>
-              <w:t>Haiku</w:t>
+              <w:t>Sonnet 4.6</w:t>
             </w:r>
           </w:p>
         </w:tc>
         <w:tc>
           <w:tcPr>
-            <w:tcW w:type="dxa" w:w="4608"/>
+            <w:tcW w:type="dxa" w:w="4032"/>
           </w:tcPr>
           <w:p>
             <w:pPr>
@@ -4694,7 +5166,7 @@
                 <w:color w:val="1F2937"/>
                 <w:sz w:val="19"/>
               </w:rPr>
-              <w:t>klar umrissen</w:t>
+              <w:t>günstige Alternative</w:t>
             </w:r>
           </w:p>
         </w:tc>
@@ -4717,13 +5189,13 @@
                 <w:color w:val="1F2937"/>
                 <w:sz w:val="19"/>
               </w:rPr>
-              <w:t>Multi-File-Implementierung</w:t>
+              <w:t>Standard-Coding / Multi-File</w:t>
             </w:r>
           </w:p>
         </w:tc>
         <w:tc>
           <w:tcPr>
-            <w:tcW w:type="dxa" w:w="1728"/>
+            <w:tcW w:type="dxa" w:w="2304"/>
             <w:shd w:val="clear" w:color="auto" w:fill="F3F4F6"/>
           </w:tcPr>
           <w:p>
@@ -4738,13 +5210,13 @@
                 <w:color w:val="1F2937"/>
                 <w:sz w:val="19"/>
               </w:rPr>
-              <w:t>Sonnet</w:t>
+              <w:t>Opus 4.8 (1M)</w:t>
             </w:r>
           </w:p>
         </w:tc>
         <w:tc>
           <w:tcPr>
-            <w:tcW w:type="dxa" w:w="4608"/>
+            <w:tcW w:type="dxa" w:w="4032"/>
             <w:shd w:val="clear" w:color="auto" w:fill="F3F4F6"/>
           </w:tcPr>
           <w:p>
@@ -4759,7 +5231,7 @@
                 <w:color w:val="1F2937"/>
                 <w:sz w:val="19"/>
               </w:rPr>
-              <w:t>bester Coding-Kompromiss</w:t>
+              <w:t>Default — schnell genug via /fast</w:t>
             </w:r>
           </w:p>
         </w:tc>
@@ -4787,7 +5259,7 @@
         </w:tc>
         <w:tc>
           <w:tcPr>
-            <w:tcW w:type="dxa" w:w="1728"/>
+            <w:tcW w:type="dxa" w:w="2304"/>
           </w:tcPr>
           <w:p>
             <w:pPr>
@@ -4801,13 +5273,13 @@
                 <w:color w:val="1F2937"/>
                 <w:sz w:val="19"/>
               </w:rPr>
-              <w:t>Opus</w:t>
+              <w:t>Opus 4.8 + effort high</w:t>
             </w:r>
           </w:p>
         </w:tc>
         <w:tc>
           <w:tcPr>
-            <w:tcW w:type="dxa" w:w="4608"/>
+            <w:tcW w:type="dxa" w:w="4032"/>
           </w:tcPr>
           <w:p>
             <w:pPr>
@@ -4850,7 +5322,7 @@
         </w:tc>
         <w:tc>
           <w:tcPr>
-            <w:tcW w:type="dxa" w:w="1728"/>
+            <w:tcW w:type="dxa" w:w="2304"/>
             <w:shd w:val="clear" w:color="auto" w:fill="F3F4F6"/>
           </w:tcPr>
           <w:p>
@@ -4865,13 +5337,13 @@
                 <w:color w:val="1F2937"/>
                 <w:sz w:val="19"/>
               </w:rPr>
-              <w:t>Sonnet</w:t>
+              <w:t>Opus / Sonnet</w:t>
             </w:r>
           </w:p>
         </w:tc>
         <w:tc>
           <w:tcPr>
-            <w:tcW w:type="dxa" w:w="4608"/>
+            <w:tcW w:type="dxa" w:w="4032"/>
             <w:shd w:val="clear" w:color="auto" w:fill="F3F4F6"/>
           </w:tcPr>
           <w:p>
@@ -4914,7 +5386,7 @@
         </w:tc>
         <w:tc>
           <w:tcPr>
-            <w:tcW w:type="dxa" w:w="1728"/>
+            <w:tcW w:type="dxa" w:w="2304"/>
           </w:tcPr>
           <w:p>
             <w:pPr>
@@ -4928,13 +5400,13 @@
                 <w:color w:val="1F2937"/>
                 <w:sz w:val="19"/>
               </w:rPr>
-              <w:t>Opus</w:t>
+              <w:t>Opus 4.8</w:t>
             </w:r>
           </w:p>
         </w:tc>
         <w:tc>
           <w:tcPr>
-            <w:tcW w:type="dxa" w:w="4608"/>
+            <w:tcW w:type="dxa" w:w="4032"/>
           </w:tcPr>
           <w:p>
             <w:pPr>
@@ -4977,7 +5449,7 @@
         </w:tc>
         <w:tc>
           <w:tcPr>
-            <w:tcW w:type="dxa" w:w="1728"/>
+            <w:tcW w:type="dxa" w:w="2304"/>
             <w:shd w:val="clear" w:color="auto" w:fill="F3F4F6"/>
           </w:tcPr>
           <w:p>
@@ -4992,13 +5464,13 @@
                 <w:color w:val="1F2937"/>
                 <w:sz w:val="19"/>
               </w:rPr>
-              <w:t>Haiku</w:t>
+              <w:t>Haiku / Sonnet</w:t>
             </w:r>
           </w:p>
         </w:tc>
         <w:tc>
           <w:tcPr>
-            <w:tcW w:type="dxa" w:w="4608"/>
+            <w:tcW w:type="dxa" w:w="4032"/>
             <w:shd w:val="clear" w:color="auto" w:fill="F3F4F6"/>
           </w:tcPr>
           <w:p>
@@ -5041,7 +5513,7 @@
         </w:tc>
         <w:tc>
           <w:tcPr>
-            <w:tcW w:type="dxa" w:w="1728"/>
+            <w:tcW w:type="dxa" w:w="2304"/>
           </w:tcPr>
           <w:p>
             <w:pPr>
@@ -5055,13 +5527,13 @@
                 <w:color w:val="1F2937"/>
                 <w:sz w:val="19"/>
               </w:rPr>
-              <w:t>Opus</w:t>
+              <w:t>Opus 4.8 + effort high</w:t>
             </w:r>
           </w:p>
         </w:tc>
         <w:tc>
           <w:tcPr>
-            <w:tcW w:type="dxa" w:w="4608"/>
+            <w:tcW w:type="dxa" w:w="4032"/>
           </w:tcPr>
           <w:p>
             <w:pPr>
@@ -5080,6 +5552,71 @@
           </w:p>
         </w:tc>
       </w:tr>
+      <w:tr>
+        <w:tc>
+          <w:tcPr>
+            <w:tcW w:type="dxa" w:w="3456"/>
+            <w:shd w:val="clear" w:color="auto" w:fill="F3F4F6"/>
+          </w:tcPr>
+          <w:p>
+            <w:pPr>
+              <w:spacing w:after="40" w:before="40"/>
+            </w:pPr>
+            <w:r/>
+            <w:r>
+              <w:rPr>
+                <w:rFonts w:ascii="Calibri" w:hAnsi="Calibri"/>
+                <w:b w:val="0"/>
+                <w:color w:val="1F2937"/>
+                <w:sz w:val="19"/>
+              </w:rPr>
+              <w:t>Worker in Multi-Agent</w:t>
+            </w:r>
+          </w:p>
+        </w:tc>
+        <w:tc>
+          <w:tcPr>
+            <w:tcW w:type="dxa" w:w="2304"/>
+            <w:shd w:val="clear" w:color="auto" w:fill="F3F4F6"/>
+          </w:tcPr>
+          <w:p>
+            <w:pPr>
+              <w:spacing w:after="40" w:before="40"/>
+            </w:pPr>
+            <w:r/>
+            <w:r>
+              <w:rPr>
+                <w:rFonts w:ascii="Calibri" w:hAnsi="Calibri"/>
+                <w:b w:val="0"/>
+                <w:color w:val="1F2937"/>
+                <w:sz w:val="19"/>
+              </w:rPr>
+              <w:t>Haiku 4.5</w:t>
+            </w:r>
+          </w:p>
+        </w:tc>
+        <w:tc>
+          <w:tcPr>
+            <w:tcW w:type="dxa" w:w="4032"/>
+            <w:shd w:val="clear" w:color="auto" w:fill="F3F4F6"/>
+          </w:tcPr>
+          <w:p>
+            <w:pPr>
+              <w:spacing w:after="40" w:before="40"/>
+            </w:pPr>
+            <w:r/>
+            <w:r>
+              <w:rPr>
+                <w:rFonts w:ascii="Calibri" w:hAnsi="Calibri"/>
+                <w:b w:val="0"/>
+                <w:color w:val="1F2937"/>
+                <w:sz w:val="19"/>
+              </w:rPr>
+              <w:t>viele günstige Parallel-Agents</w:t>
+            </w:r>
+          </w:p>
+        </w:tc>
+      </w:tr>
     </w:tbl>
     <w:p>
       <w:pPr>
@@ -5093,14 +5630,14 @@
           <w:color w:val="1E1B4B"/>
           <w:sz w:val="20"/>
         </w:rPr>
-        <w:t xml:space="preserve">Default = Sonnet  </w:t>
+        <w:t xml:space="preserve">Default = Opus 4.8 (1M)  </w:t>
       </w:r>
       <w:r>
         <w:rPr>
           <w:color w:val="1F2937"/>
           <w:sz w:val="20"/>
         </w:rPr>
-        <w:t>für ~90 % des Codings. Upgrade auf Opus bei: erster Versuch gescheitert · ≥ 5 Dateien · Architektur-Entscheidung · Security-kritisch. Hilfe: /model-route, /cost-report.</w:t>
+        <w:t>— schnell genug via /fast. Effort-Level: medium Standard, high bei schweren Bugs/Architektur. Hilfe: /model-route, /cost-report.</w:t>
       </w:r>
     </w:p>
     <w:p>
@@ -5144,19 +5681,14 @@
     </w:p>
     <w:p>
       <w:pPr>
+        <w:pStyle w:val="Heading1"/>
         <w:spacing w:before="320" w:after="80"/>
         <w:pBdr>
           <w:bottom w:val="single" w:sz="18" w:space="2" w:color="06B6D4"/>
         </w:pBdr>
       </w:pPr>
       <w:r>
-        <w:rPr>
-          <w:rFonts w:ascii="Calibri" w:hAnsi="Calibri"/>
-          <w:b/>
-          <w:color w:val="312E81"/>
-          <w:sz w:val="34"/>
-        </w:rPr>
-        <w:t>9 · Memory &amp; Sessions</w:t>
+        <w:t>10 · Memory &amp; Sessions</w:t>
       </w:r>
     </w:p>
     <w:tbl>
@@ -5470,19 +6002,14 @@
     </w:p>
     <w:p>
       <w:pPr>
+        <w:pStyle w:val="Heading1"/>
         <w:spacing w:before="320" w:after="80"/>
         <w:pBdr>
           <w:bottom w:val="single" w:sz="18" w:space="2" w:color="06B6D4"/>
         </w:pBdr>
       </w:pPr>
       <w:r>
-        <w:rPr>
-          <w:rFonts w:ascii="Calibri" w:hAnsi="Calibri"/>
-          <w:b/>
-          <w:color w:val="312E81"/>
-          <w:sz w:val="34"/>
-        </w:rPr>
-        <w:t>10 · Continuous Learning (Self-Improvement)</w:t>
+        <w:t>11 · Continuous Learning (Self-Improvement)</w:t>
       </w:r>
     </w:p>
     <w:p>
@@ -5831,19 +6358,14 @@
     </w:p>
     <w:p>
       <w:pPr>
+        <w:pStyle w:val="Heading1"/>
         <w:spacing w:before="320" w:after="80"/>
         <w:pBdr>
           <w:bottom w:val="single" w:sz="18" w:space="2" w:color="06B6D4"/>
         </w:pBdr>
       </w:pPr>
       <w:r>
-        <w:rPr>
-          <w:rFonts w:ascii="Calibri" w:hAnsi="Calibri"/>
-          <w:b/>
-          <w:color w:val="312E81"/>
-          <w:sz w:val="34"/>
-        </w:rPr>
-        <w:t>11 · Parallelisierung</w:t>
+        <w:t>12 · Parallelisierung</w:t>
       </w:r>
     </w:p>
     <w:p>
@@ -5958,19 +6480,14 @@
     </w:p>
     <w:p>
       <w:pPr>
+        <w:pStyle w:val="Heading1"/>
         <w:spacing w:before="320" w:after="80"/>
         <w:pBdr>
           <w:bottom w:val="single" w:sz="18" w:space="2" w:color="06B6D4"/>
         </w:pBdr>
       </w:pPr>
       <w:r>
-        <w:rPr>
-          <w:rFonts w:ascii="Calibri" w:hAnsi="Calibri"/>
-          <w:b/>
-          <w:color w:val="312E81"/>
-          <w:sz w:val="34"/>
-        </w:rPr>
-        <w:t>12 · Security im Alltag + VPS-Hinweise</w:t>
+        <w:t>13 · Security im Alltag + VPS-Hinweise</w:t>
       </w:r>
     </w:p>
     <w:p>
@@ -6168,19 +6685,14 @@
     </w:p>
     <w:p>
       <w:pPr>
+        <w:pStyle w:val="Heading1"/>
         <w:spacing w:before="320" w:after="80"/>
         <w:pBdr>
           <w:bottom w:val="single" w:sz="18" w:space="2" w:color="06B6D4"/>
         </w:pBdr>
       </w:pPr>
       <w:r>
-        <w:rPr>
-          <w:rFonts w:ascii="Calibri" w:hAnsi="Calibri"/>
-          <w:b/>
-          <w:color w:val="312E81"/>
-          <w:sz w:val="34"/>
-        </w:rPr>
-        <w:t>13 · ECC-CLIs &amp; Wartung</w:t>
+        <w:t>14 · ECC-CLIs &amp; Wartung</w:t>
       </w:r>
     </w:p>
     <w:p>
@@ -6281,19 +6793,14 @@
     </w:p>
     <w:p>
       <w:pPr>
+        <w:pStyle w:val="Heading1"/>
         <w:spacing w:before="320" w:after="80"/>
         <w:pBdr>
           <w:bottom w:val="single" w:sz="18" w:space="2" w:color="06B6D4"/>
         </w:pBdr>
       </w:pPr>
       <w:r>
-        <w:rPr>
-          <w:rFonts w:ascii="Calibri" w:hAnsi="Calibri"/>
-          <w:b/>
-          <w:color w:val="312E81"/>
-          <w:sz w:val="34"/>
-        </w:rPr>
-        <w:t>14 · Quellen &amp; TL;DR</w:t>
+        <w:t>15 · Quellen &amp; TL;DR</w:t>
       </w:r>
     </w:p>
     <w:p>
@@ -6926,11 +7433,11 @@
       <w:outlineLvl w:val="0"/>
     </w:pPr>
     <w:rPr>
-      <w:rFonts w:asciiTheme="majorHAnsi" w:eastAsiaTheme="majorEastAsia" w:hAnsiTheme="majorHAnsi" w:cstheme="majorBidi"/>
+      <w:rFonts w:asciiTheme="majorHAnsi" w:eastAsiaTheme="majorEastAsia" w:hAnsiTheme="majorHAnsi" w:cstheme="majorBidi" w:ascii="Calibri" w:hAnsi="Calibri"/>
       <w:b/>
       <w:bCs/>
-      <w:color w:val="365F91" w:themeColor="accent1" w:themeShade="BF"/>
-      <w:sz w:val="28"/>
+      <w:color w:val="312E81"/>
+      <w:sz w:val="32"/>
       <w:szCs w:val="28"/>
     </w:rPr>
   </w:style>
@@ -6950,11 +7457,11 @@
       <w:outlineLvl w:val="1"/>
     </w:pPr>
     <w:rPr>
-      <w:rFonts w:asciiTheme="majorHAnsi" w:eastAsiaTheme="majorEastAsia" w:hAnsiTheme="majorHAnsi" w:cstheme="majorBidi"/>
+      <w:rFonts w:asciiTheme="majorHAnsi" w:eastAsiaTheme="majorEastAsia" w:hAnsiTheme="majorHAnsi" w:cstheme="majorBidi" w:ascii="Calibri" w:hAnsi="Calibri"/>
       <w:b/>
       <w:bCs/>
-      <w:color w:val="4F81BD" w:themeColor="accent1"/>
-      <w:sz w:val="26"/>
+      <w:color w:val="1E1B4B"/>
+      <w:sz w:val="25"/>
       <w:szCs w:val="26"/>
     </w:rPr>
   </w:style>

</xml_diff>

<commit_message>
docs: MCP-Kapitel auf reale Installation umstellen (aktiv vs. optional) + claude-mem-Nutzung
- §8 getrennte Tabellen: 'bei dir aktiv' (markitdown, context7, claude-mem, context-mode, claude.ai-Connectoren, RTK) vs. 'optional/NICHT installiert' (exa, github→gh-CLI, playwright, memory, sequential-thinking)
- Klarstellung: der 'memory'-MCP (Wissensgraph) ist NICHT installiert/nicht noetig — claude-mem ist die primaere Memory-Quelle
- §10: konkreter claude-mem-Nutzungsblock (Auto-Injektion ab 2. Session, /mem-search, automatische Erfassung)
- PPTX §8 (Aktiv-Tabelle + Optional-Hinweis) und §10-11 entsprechend
- docs/*.docx + *.pptx neu generiert; ecc-doctor unveraendert gruen

Co-Authored-By: Claude Opus 4.8 (1M context) <noreply@anthropic.com>
</commit_message>
<xml_diff>
--- a/docs/ECC-Harness-Guide.de.docx
+++ b/docs/ECC-Harness-Guide.de.docx
@@ -4289,6 +4289,21 @@
         <w:t>Faustregel: 20–30 MCPs konfiguriert, aber &lt; 10 aktiv / &lt; 80 Tools. Ungenutztes pro Projekt mit /mcp deaktivieren — das Kontextfenster ist kostbar.</w:t>
       </w:r>
     </w:p>
+    <w:p>
+      <w:pPr>
+        <w:spacing w:after="40"/>
+      </w:pPr>
+      <w:r>
+        <w:rPr>
+          <w:rFonts w:ascii="Calibri" w:hAnsi="Calibri"/>
+          <w:b/>
+          <w:i w:val="0"/>
+          <w:color w:val="312E81"/>
+          <w:sz w:val="21"/>
+        </w:rPr>
+        <w:t>Bei dir aktiv (global):</w:t>
+      </w:r>
+    </w:p>
     <w:tbl>
       <w:tblPr>
         <w:tblStyle w:val="TableGrid"/>
@@ -4384,261 +4399,7 @@
                 <w:color w:val="1F2937"/>
                 <w:sz w:val="19"/>
               </w:rPr>
-              <w:t>Aktuelle Library-/API-Doku</w:t>
-            </w:r>
-          </w:p>
-        </w:tc>
-        <w:tc>
-          <w:tcPr>
-            <w:tcW w:type="dxa" w:w="2448"/>
-            <w:shd w:val="clear" w:color="auto" w:fill="F3F4F6"/>
-          </w:tcPr>
-          <w:p>
-            <w:pPr>
-              <w:spacing w:after="40" w:before="40"/>
-            </w:pPr>
-            <w:r/>
-            <w:r>
-              <w:rPr>
-                <w:rFonts w:ascii="Calibri" w:hAnsi="Calibri"/>
-                <w:b w:val="0"/>
-                <w:color w:val="1F2937"/>
-                <w:sz w:val="19"/>
-              </w:rPr>
-              <w:t>context7</w:t>
-            </w:r>
-          </w:p>
-        </w:tc>
-        <w:tc>
-          <w:tcPr>
-            <w:tcW w:type="dxa" w:w="3888"/>
-            <w:shd w:val="clear" w:color="auto" w:fill="F3F4F6"/>
-          </w:tcPr>
-          <w:p>
-            <w:pPr>
-              <w:spacing w:after="40" w:before="40"/>
-            </w:pPr>
-            <w:r/>
-            <w:r>
-              <w:rPr>
-                <w:rFonts w:ascii="Calibri" w:hAnsi="Calibri"/>
-                <w:b w:val="0"/>
-                <w:color w:val="1F2937"/>
-                <w:sz w:val="19"/>
-              </w:rPr>
-              <w:t>React, Prisma, Next.js … statt veraltetem Wissen</w:t>
-            </w:r>
-          </w:p>
-        </w:tc>
-      </w:tr>
-      <w:tr>
-        <w:tc>
-          <w:tcPr>
-            <w:tcW w:type="dxa" w:w="3456"/>
-          </w:tcPr>
-          <w:p>
-            <w:pPr>
-              <w:spacing w:after="40" w:before="40"/>
-            </w:pPr>
-            <w:r/>
-            <w:r>
-              <w:rPr>
-                <w:rFonts w:ascii="Calibri" w:hAnsi="Calibri"/>
-                <w:b w:val="0"/>
-                <w:color w:val="1F2937"/>
-                <w:sz w:val="19"/>
-              </w:rPr>
-              <w:t>Web-Recherche / Discovery</w:t>
-            </w:r>
-          </w:p>
-        </w:tc>
-        <w:tc>
-          <w:tcPr>
-            <w:tcW w:type="dxa" w:w="2448"/>
-          </w:tcPr>
-          <w:p>
-            <w:pPr>
-              <w:spacing w:after="40" w:before="40"/>
-            </w:pPr>
-            <w:r/>
-            <w:r>
-              <w:rPr>
-                <w:rFonts w:ascii="Calibri" w:hAnsi="Calibri"/>
-                <w:b w:val="0"/>
-                <w:color w:val="1F2937"/>
-                <w:sz w:val="19"/>
-              </w:rPr>
-              <w:t>exa</w:t>
-            </w:r>
-          </w:p>
-        </w:tc>
-        <w:tc>
-          <w:tcPr>
-            <w:tcW w:type="dxa" w:w="3888"/>
-          </w:tcPr>
-          <w:p>
-            <w:pPr>
-              <w:spacing w:after="40" w:before="40"/>
-            </w:pPr>
-            <w:r/>
-            <w:r>
-              <w:rPr>
-                <w:rFonts w:ascii="Calibri" w:hAnsi="Calibri"/>
-                <w:b w:val="0"/>
-                <w:color w:val="1F2937"/>
-                <w:sz w:val="19"/>
-              </w:rPr>
-              <w:t>breite Suche, wenn GitHub+Docs nicht reichen</w:t>
-            </w:r>
-          </w:p>
-        </w:tc>
-      </w:tr>
-      <w:tr>
-        <w:tc>
-          <w:tcPr>
-            <w:tcW w:type="dxa" w:w="3456"/>
-            <w:shd w:val="clear" w:color="auto" w:fill="F3F4F6"/>
-          </w:tcPr>
-          <w:p>
-            <w:pPr>
-              <w:spacing w:after="40" w:before="40"/>
-            </w:pPr>
-            <w:r/>
-            <w:r>
-              <w:rPr>
-                <w:rFonts w:ascii="Calibri" w:hAnsi="Calibri"/>
-                <w:b w:val="0"/>
-                <w:color w:val="1F2937"/>
-                <w:sz w:val="19"/>
-              </w:rPr>
-              <w:t>GitHub (PRs, Issues, Code-Suche)</w:t>
-            </w:r>
-          </w:p>
-        </w:tc>
-        <w:tc>
-          <w:tcPr>
-            <w:tcW w:type="dxa" w:w="2448"/>
-            <w:shd w:val="clear" w:color="auto" w:fill="F3F4F6"/>
-          </w:tcPr>
-          <w:p>
-            <w:pPr>
-              <w:spacing w:after="40" w:before="40"/>
-            </w:pPr>
-            <w:r/>
-            <w:r>
-              <w:rPr>
-                <w:rFonts w:ascii="Calibri" w:hAnsi="Calibri"/>
-                <w:b w:val="0"/>
-                <w:color w:val="1F2937"/>
-                <w:sz w:val="19"/>
-              </w:rPr>
-              <w:t>github</w:t>
-            </w:r>
-          </w:p>
-        </w:tc>
-        <w:tc>
-          <w:tcPr>
-            <w:tcW w:type="dxa" w:w="3888"/>
-            <w:shd w:val="clear" w:color="auto" w:fill="F3F4F6"/>
-          </w:tcPr>
-          <w:p>
-            <w:pPr>
-              <w:spacing w:after="40" w:before="40"/>
-            </w:pPr>
-            <w:r/>
-            <w:r>
-              <w:rPr>
-                <w:rFonts w:ascii="Calibri" w:hAnsi="Calibri"/>
-                <w:b w:val="0"/>
-                <w:color w:val="1F2937"/>
-                <w:sz w:val="19"/>
-              </w:rPr>
-              <w:t>Code-Search FIRST vor Neuschreiben</w:t>
-            </w:r>
-          </w:p>
-        </w:tc>
-      </w:tr>
-      <w:tr>
-        <w:tc>
-          <w:tcPr>
-            <w:tcW w:type="dxa" w:w="3456"/>
-          </w:tcPr>
-          <w:p>
-            <w:pPr>
-              <w:spacing w:after="40" w:before="40"/>
-            </w:pPr>
-            <w:r/>
-            <w:r>
-              <w:rPr>
-                <w:rFonts w:ascii="Calibri" w:hAnsi="Calibri"/>
-                <w:b w:val="0"/>
-                <w:color w:val="1F2937"/>
-                <w:sz w:val="19"/>
-              </w:rPr>
-              <w:t>Browser / E2E / Screenshots</w:t>
-            </w:r>
-          </w:p>
-        </w:tc>
-        <w:tc>
-          <w:tcPr>
-            <w:tcW w:type="dxa" w:w="2448"/>
-          </w:tcPr>
-          <w:p>
-            <w:pPr>
-              <w:spacing w:after="40" w:before="40"/>
-            </w:pPr>
-            <w:r/>
-            <w:r>
-              <w:rPr>
-                <w:rFonts w:ascii="Calibri" w:hAnsi="Calibri"/>
-                <w:b w:val="0"/>
-                <w:color w:val="1F2937"/>
-                <w:sz w:val="19"/>
-              </w:rPr>
-              <w:t>playwright</w:t>
-            </w:r>
-          </w:p>
-        </w:tc>
-        <w:tc>
-          <w:tcPr>
-            <w:tcW w:type="dxa" w:w="3888"/>
-          </w:tcPr>
-          <w:p>
-            <w:pPr>
-              <w:spacing w:after="40" w:before="40"/>
-            </w:pPr>
-            <w:r/>
-            <w:r>
-              <w:rPr>
-                <w:rFonts w:ascii="Calibri" w:hAnsi="Calibri"/>
-                <w:b w:val="0"/>
-                <w:color w:val="1F2937"/>
-                <w:sz w:val="19"/>
-              </w:rPr>
-              <w:t>headless Automation, visuelle Tests</w:t>
-            </w:r>
-          </w:p>
-        </w:tc>
-      </w:tr>
-      <w:tr>
-        <w:tc>
-          <w:tcPr>
-            <w:tcW w:type="dxa" w:w="3456"/>
-            <w:shd w:val="clear" w:color="auto" w:fill="F3F4F6"/>
-          </w:tcPr>
-          <w:p>
-            <w:pPr>
-              <w:spacing w:after="40" w:before="40"/>
-            </w:pPr>
-            <w:r/>
-            <w:r>
-              <w:rPr>
-                <w:rFonts w:ascii="Calibri" w:hAnsi="Calibri"/>
-                <w:b w:val="0"/>
-                <w:color w:val="1F2937"/>
-                <w:sz w:val="19"/>
-              </w:rPr>
-              <w:t>PDF / Word / Excel lesen</w:t>
+              <w:t>PDF/Word/Excel/PPTX lesen</w:t>
             </w:r>
           </w:p>
         </w:tc>
@@ -4680,7 +4441,608 @@
                 <w:color w:val="1F2937"/>
                 <w:sz w:val="19"/>
               </w:rPr>
-              <w:t>Dokumente → Markdown (global aktiv)</w:t>
+              <w:t>Dokumente → Markdown (lokal, global aktiv)</w:t>
+            </w:r>
+          </w:p>
+        </w:tc>
+      </w:tr>
+      <w:tr>
+        <w:tc>
+          <w:tcPr>
+            <w:tcW w:type="dxa" w:w="3456"/>
+          </w:tcPr>
+          <w:p>
+            <w:pPr>
+              <w:spacing w:after="40" w:before="40"/>
+            </w:pPr>
+            <w:r/>
+            <w:r>
+              <w:rPr>
+                <w:rFonts w:ascii="Calibri" w:hAnsi="Calibri"/>
+                <w:b w:val="0"/>
+                <w:color w:val="1F2937"/>
+                <w:sz w:val="19"/>
+              </w:rPr>
+              <w:t>Aktuelle Library-/API-Doku</w:t>
+            </w:r>
+          </w:p>
+        </w:tc>
+        <w:tc>
+          <w:tcPr>
+            <w:tcW w:type="dxa" w:w="2448"/>
+          </w:tcPr>
+          <w:p>
+            <w:pPr>
+              <w:spacing w:after="40" w:before="40"/>
+            </w:pPr>
+            <w:r/>
+            <w:r>
+              <w:rPr>
+                <w:rFonts w:ascii="Calibri" w:hAnsi="Calibri"/>
+                <w:b w:val="0"/>
+                <w:color w:val="1F2937"/>
+                <w:sz w:val="19"/>
+              </w:rPr>
+              <w:t>context7</w:t>
+            </w:r>
+          </w:p>
+        </w:tc>
+        <w:tc>
+          <w:tcPr>
+            <w:tcW w:type="dxa" w:w="3888"/>
+          </w:tcPr>
+          <w:p>
+            <w:pPr>
+              <w:spacing w:after="40" w:before="40"/>
+            </w:pPr>
+            <w:r/>
+            <w:r>
+              <w:rPr>
+                <w:rFonts w:ascii="Calibri" w:hAnsi="Calibri"/>
+                <w:b w:val="0"/>
+                <w:color w:val="1F2937"/>
+                <w:sz w:val="19"/>
+              </w:rPr>
+              <w:t>React, Prisma, Next.js … statt veraltetem Wissen (Plugin)</w:t>
+            </w:r>
+          </w:p>
+        </w:tc>
+      </w:tr>
+      <w:tr>
+        <w:tc>
+          <w:tcPr>
+            <w:tcW w:type="dxa" w:w="3456"/>
+            <w:shd w:val="clear" w:color="auto" w:fill="F3F4F6"/>
+          </w:tcPr>
+          <w:p>
+            <w:pPr>
+              <w:spacing w:after="40" w:before="40"/>
+            </w:pPr>
+            <w:r/>
+            <w:r>
+              <w:rPr>
+                <w:rFonts w:ascii="Calibri" w:hAnsi="Calibri"/>
+                <w:b w:val="0"/>
+                <w:color w:val="1F2937"/>
+                <w:sz w:val="19"/>
+              </w:rPr>
+              <w:t>Frühere Arbeit / „schon gelöst?“</w:t>
+            </w:r>
+          </w:p>
+        </w:tc>
+        <w:tc>
+          <w:tcPr>
+            <w:tcW w:type="dxa" w:w="2448"/>
+            <w:shd w:val="clear" w:color="auto" w:fill="F3F4F6"/>
+          </w:tcPr>
+          <w:p>
+            <w:pPr>
+              <w:spacing w:after="40" w:before="40"/>
+            </w:pPr>
+            <w:r/>
+            <w:r>
+              <w:rPr>
+                <w:rFonts w:ascii="Calibri" w:hAnsi="Calibri"/>
+                <w:b w:val="0"/>
+                <w:color w:val="1F2937"/>
+                <w:sz w:val="19"/>
+              </w:rPr>
+              <w:t>claude-mem</w:t>
+            </w:r>
+          </w:p>
+        </w:tc>
+        <w:tc>
+          <w:tcPr>
+            <w:tcW w:type="dxa" w:w="3888"/>
+            <w:shd w:val="clear" w:color="auto" w:fill="F3F4F6"/>
+          </w:tcPr>
+          <w:p>
+            <w:pPr>
+              <w:spacing w:after="40" w:before="40"/>
+            </w:pPr>
+            <w:r/>
+            <w:r>
+              <w:rPr>
+                <w:rFonts w:ascii="Calibri" w:hAnsi="Calibri"/>
+                <w:b w:val="0"/>
+                <w:color w:val="1F2937"/>
+                <w:sz w:val="19"/>
+              </w:rPr>
+              <w:t>deine Memory-Quelle: /mem-search, Auto-Injektion ab 2. Session</w:t>
+            </w:r>
+          </w:p>
+        </w:tc>
+      </w:tr>
+      <w:tr>
+        <w:tc>
+          <w:tcPr>
+            <w:tcW w:type="dxa" w:w="3456"/>
+          </w:tcPr>
+          <w:p>
+            <w:pPr>
+              <w:spacing w:after="40" w:before="40"/>
+            </w:pPr>
+            <w:r/>
+            <w:r>
+              <w:rPr>
+                <w:rFonts w:ascii="Calibri" w:hAnsi="Calibri"/>
+                <w:b w:val="0"/>
+                <w:color w:val="1F2937"/>
+                <w:sz w:val="19"/>
+              </w:rPr>
+              <w:t>Kontext-Tooling</w:t>
+            </w:r>
+          </w:p>
+        </w:tc>
+        <w:tc>
+          <w:tcPr>
+            <w:tcW w:type="dxa" w:w="2448"/>
+          </w:tcPr>
+          <w:p>
+            <w:pPr>
+              <w:spacing w:after="40" w:before="40"/>
+            </w:pPr>
+            <w:r/>
+            <w:r>
+              <w:rPr>
+                <w:rFonts w:ascii="Calibri" w:hAnsi="Calibri"/>
+                <w:b w:val="0"/>
+                <w:color w:val="1F2937"/>
+                <w:sz w:val="19"/>
+              </w:rPr>
+              <w:t>context-mode</w:t>
+            </w:r>
+          </w:p>
+        </w:tc>
+        <w:tc>
+          <w:tcPr>
+            <w:tcW w:type="dxa" w:w="3888"/>
+          </w:tcPr>
+          <w:p>
+            <w:pPr>
+              <w:spacing w:after="40" w:before="40"/>
+            </w:pPr>
+            <w:r/>
+            <w:r>
+              <w:rPr>
+                <w:rFonts w:ascii="Calibri" w:hAnsi="Calibri"/>
+                <w:b w:val="0"/>
+                <w:color w:val="1F2937"/>
+                <w:sz w:val="19"/>
+              </w:rPr>
+              <w:t>lokaler MCP</w:t>
+            </w:r>
+          </w:p>
+        </w:tc>
+      </w:tr>
+      <w:tr>
+        <w:tc>
+          <w:tcPr>
+            <w:tcW w:type="dxa" w:w="3456"/>
+            <w:shd w:val="clear" w:color="auto" w:fill="F3F4F6"/>
+          </w:tcPr>
+          <w:p>
+            <w:pPr>
+              <w:spacing w:after="40" w:before="40"/>
+            </w:pPr>
+            <w:r/>
+            <w:r>
+              <w:rPr>
+                <w:rFonts w:ascii="Calibri" w:hAnsi="Calibri"/>
+                <w:b w:val="0"/>
+                <w:color w:val="1F2937"/>
+                <w:sz w:val="19"/>
+              </w:rPr>
+              <w:t>Dienste anbinden</w:t>
+            </w:r>
+          </w:p>
+        </w:tc>
+        <w:tc>
+          <w:tcPr>
+            <w:tcW w:type="dxa" w:w="2448"/>
+            <w:shd w:val="clear" w:color="auto" w:fill="F3F4F6"/>
+          </w:tcPr>
+          <w:p>
+            <w:pPr>
+              <w:spacing w:after="40" w:before="40"/>
+            </w:pPr>
+            <w:r/>
+            <w:r>
+              <w:rPr>
+                <w:rFonts w:ascii="Calibri" w:hAnsi="Calibri"/>
+                <w:b w:val="0"/>
+                <w:color w:val="1F2937"/>
+                <w:sz w:val="19"/>
+              </w:rPr>
+              <w:t>claude.ai-Connectoren</w:t>
+            </w:r>
+          </w:p>
+        </w:tc>
+        <w:tc>
+          <w:tcPr>
+            <w:tcW w:type="dxa" w:w="3888"/>
+            <w:shd w:val="clear" w:color="auto" w:fill="F3F4F6"/>
+          </w:tcPr>
+          <w:p>
+            <w:pPr>
+              <w:spacing w:after="40" w:before="40"/>
+            </w:pPr>
+            <w:r/>
+            <w:r>
+              <w:rPr>
+                <w:rFonts w:ascii="Calibri" w:hAnsi="Calibri"/>
+                <w:b w:val="0"/>
+                <w:color w:val="1F2937"/>
+                <w:sz w:val="19"/>
+              </w:rPr>
+              <w:t>n8n · Notion · Gamma · Google Drive · Microsoft Learn · Kiwi</w:t>
+            </w:r>
+          </w:p>
+        </w:tc>
+      </w:tr>
+      <w:tr>
+        <w:tc>
+          <w:tcPr>
+            <w:tcW w:type="dxa" w:w="3456"/>
+          </w:tcPr>
+          <w:p>
+            <w:pPr>
+              <w:spacing w:after="40" w:before="40"/>
+            </w:pPr>
+            <w:r/>
+            <w:r>
+              <w:rPr>
+                <w:rFonts w:ascii="Calibri" w:hAnsi="Calibri"/>
+                <w:b w:val="0"/>
+                <w:color w:val="1F2937"/>
+                <w:sz w:val="19"/>
+              </w:rPr>
+              <w:t>Bash-Token sparen</w:t>
+            </w:r>
+          </w:p>
+        </w:tc>
+        <w:tc>
+          <w:tcPr>
+            <w:tcW w:type="dxa" w:w="2448"/>
+          </w:tcPr>
+          <w:p>
+            <w:pPr>
+              <w:spacing w:after="40" w:before="40"/>
+            </w:pPr>
+            <w:r/>
+            <w:r>
+              <w:rPr>
+                <w:rFonts w:ascii="Calibri" w:hAnsi="Calibri"/>
+                <w:b w:val="0"/>
+                <w:color w:val="1F2937"/>
+                <w:sz w:val="19"/>
+              </w:rPr>
+              <w:t>RTK (Hook, kein MCP)</w:t>
+            </w:r>
+          </w:p>
+        </w:tc>
+        <w:tc>
+          <w:tcPr>
+            <w:tcW w:type="dxa" w:w="3888"/>
+          </w:tcPr>
+          <w:p>
+            <w:pPr>
+              <w:spacing w:after="40" w:before="40"/>
+            </w:pPr>
+            <w:r/>
+            <w:r>
+              <w:rPr>
+                <w:rFonts w:ascii="Calibri" w:hAnsi="Calibri"/>
+                <w:b w:val="0"/>
+                <w:color w:val="1F2937"/>
+                <w:sz w:val="19"/>
+              </w:rPr>
+              <w:t>60–90 % Ersparnis, läuft transparent global</w:t>
+            </w:r>
+          </w:p>
+        </w:tc>
+      </w:tr>
+    </w:tbl>
+    <w:p>
+      <w:pPr>
+        <w:spacing w:after="40"/>
+      </w:pPr>
+      <w:r>
+        <w:rPr>
+          <w:rFonts w:ascii="Calibri" w:hAnsi="Calibri"/>
+          <w:b/>
+          <w:i w:val="0"/>
+          <w:color w:val="6B7280"/>
+          <w:sz w:val="21"/>
+        </w:rPr>
+        <w:t>Optional / empfohlen — NICHT installiert, bei Bedarf nachrüsten:</w:t>
+      </w:r>
+    </w:p>
+    <w:tbl>
+      <w:tblPr>
+        <w:tblStyle w:val="TableGrid"/>
+        <w:tblW w:type="auto" w:w="0"/>
+        <w:jc w:val="center"/>
+        <w:tblLook w:firstColumn="1" w:firstRow="1" w:lastColumn="0" w:lastRow="0" w:noHBand="0" w:noVBand="1" w:val="04A0"/>
+      </w:tblPr>
+      <w:tblGrid>
+        <w:gridCol w:w="3312"/>
+        <w:gridCol w:w="3312"/>
+        <w:gridCol w:w="3312"/>
+      </w:tblGrid>
+      <w:tr>
+        <w:tc>
+          <w:tcPr>
+            <w:tcW w:type="dxa" w:w="3456"/>
+            <w:shd w:val="clear" w:color="auto" w:fill="312E81"/>
+          </w:tcPr>
+          <w:p>
+            <w:pPr>
+              <w:spacing w:after="40" w:before="40"/>
+            </w:pPr>
+            <w:r/>
+            <w:r>
+              <w:rPr>
+                <w:rFonts w:ascii="Calibri" w:hAnsi="Calibri"/>
+                <w:b/>
+                <w:color w:val="FFFFFF"/>
+                <w:sz w:val="19"/>
+              </w:rPr>
+              <w:t>Aufgabe</w:t>
+            </w:r>
+          </w:p>
+        </w:tc>
+        <w:tc>
+          <w:tcPr>
+            <w:tcW w:type="dxa" w:w="2448"/>
+            <w:shd w:val="clear" w:color="auto" w:fill="312E81"/>
+          </w:tcPr>
+          <w:p>
+            <w:pPr>
+              <w:spacing w:after="40" w:before="40"/>
+            </w:pPr>
+            <w:r/>
+            <w:r>
+              <w:rPr>
+                <w:rFonts w:ascii="Calibri" w:hAnsi="Calibri"/>
+                <w:b/>
+                <w:color w:val="FFFFFF"/>
+                <w:sz w:val="19"/>
+              </w:rPr>
+              <w:t>MCP / Tool</w:t>
+            </w:r>
+          </w:p>
+        </w:tc>
+        <w:tc>
+          <w:tcPr>
+            <w:tcW w:type="dxa" w:w="3888"/>
+            <w:shd w:val="clear" w:color="auto" w:fill="312E81"/>
+          </w:tcPr>
+          <w:p>
+            <w:pPr>
+              <w:spacing w:after="40" w:before="40"/>
+            </w:pPr>
+            <w:r/>
+            <w:r>
+              <w:rPr>
+                <w:rFonts w:ascii="Calibri" w:hAnsi="Calibri"/>
+                <w:b/>
+                <w:color w:val="FFFFFF"/>
+                <w:sz w:val="19"/>
+              </w:rPr>
+              <w:t>Hinweis</w:t>
+            </w:r>
+          </w:p>
+        </w:tc>
+      </w:tr>
+      <w:tr>
+        <w:tc>
+          <w:tcPr>
+            <w:tcW w:type="dxa" w:w="3456"/>
+            <w:shd w:val="clear" w:color="auto" w:fill="F3F4F6"/>
+          </w:tcPr>
+          <w:p>
+            <w:pPr>
+              <w:spacing w:after="40" w:before="40"/>
+            </w:pPr>
+            <w:r/>
+            <w:r>
+              <w:rPr>
+                <w:rFonts w:ascii="Calibri" w:hAnsi="Calibri"/>
+                <w:b w:val="0"/>
+                <w:color w:val="1F2937"/>
+                <w:sz w:val="19"/>
+              </w:rPr>
+              <w:t>Web-Recherche / Discovery</w:t>
+            </w:r>
+          </w:p>
+        </w:tc>
+        <w:tc>
+          <w:tcPr>
+            <w:tcW w:type="dxa" w:w="2448"/>
+            <w:shd w:val="clear" w:color="auto" w:fill="F3F4F6"/>
+          </w:tcPr>
+          <w:p>
+            <w:pPr>
+              <w:spacing w:after="40" w:before="40"/>
+            </w:pPr>
+            <w:r/>
+            <w:r>
+              <w:rPr>
+                <w:rFonts w:ascii="Calibri" w:hAnsi="Calibri"/>
+                <w:b w:val="0"/>
+                <w:color w:val="1F2937"/>
+                <w:sz w:val="19"/>
+              </w:rPr>
+              <w:t>exa</w:t>
+            </w:r>
+          </w:p>
+        </w:tc>
+        <w:tc>
+          <w:tcPr>
+            <w:tcW w:type="dxa" w:w="3888"/>
+            <w:shd w:val="clear" w:color="auto" w:fill="F3F4F6"/>
+          </w:tcPr>
+          <w:p>
+            <w:pPr>
+              <w:spacing w:after="40" w:before="40"/>
+            </w:pPr>
+            <w:r/>
+            <w:r>
+              <w:rPr>
+                <w:rFonts w:ascii="Calibri" w:hAnsi="Calibri"/>
+                <w:b w:val="0"/>
+                <w:color w:val="1F2937"/>
+                <w:sz w:val="19"/>
+              </w:rPr>
+              <w:t>breite Suche, wenn GitHub+Docs nicht reichen</w:t>
+            </w:r>
+          </w:p>
+        </w:tc>
+      </w:tr>
+      <w:tr>
+        <w:tc>
+          <w:tcPr>
+            <w:tcW w:type="dxa" w:w="3456"/>
+          </w:tcPr>
+          <w:p>
+            <w:pPr>
+              <w:spacing w:after="40" w:before="40"/>
+            </w:pPr>
+            <w:r/>
+            <w:r>
+              <w:rPr>
+                <w:rFonts w:ascii="Calibri" w:hAnsi="Calibri"/>
+                <w:b w:val="0"/>
+                <w:color w:val="1F2937"/>
+                <w:sz w:val="19"/>
+              </w:rPr>
+              <w:t>GitHub (PRs, Issues, Code-Suche)</w:t>
+            </w:r>
+          </w:p>
+        </w:tc>
+        <w:tc>
+          <w:tcPr>
+            <w:tcW w:type="dxa" w:w="2448"/>
+          </w:tcPr>
+          <w:p>
+            <w:pPr>
+              <w:spacing w:after="40" w:before="40"/>
+            </w:pPr>
+            <w:r/>
+            <w:r>
+              <w:rPr>
+                <w:rFonts w:ascii="Calibri" w:hAnsi="Calibri"/>
+                <w:b w:val="0"/>
+                <w:color w:val="1F2937"/>
+                <w:sz w:val="19"/>
+              </w:rPr>
+              <w:t>github</w:t>
+            </w:r>
+          </w:p>
+        </w:tc>
+        <w:tc>
+          <w:tcPr>
+            <w:tcW w:type="dxa" w:w="3888"/>
+          </w:tcPr>
+          <w:p>
+            <w:pPr>
+              <w:spacing w:after="40" w:before="40"/>
+            </w:pPr>
+            <w:r/>
+            <w:r>
+              <w:rPr>
+                <w:rFonts w:ascii="Calibri" w:hAnsi="Calibri"/>
+                <w:b w:val="0"/>
+                <w:color w:val="1F2937"/>
+                <w:sz w:val="19"/>
+              </w:rPr>
+              <w:t>du nutzt die gh-CLI statt MCP</w:t>
+            </w:r>
+          </w:p>
+        </w:tc>
+      </w:tr>
+      <w:tr>
+        <w:tc>
+          <w:tcPr>
+            <w:tcW w:type="dxa" w:w="3456"/>
+            <w:shd w:val="clear" w:color="auto" w:fill="F3F4F6"/>
+          </w:tcPr>
+          <w:p>
+            <w:pPr>
+              <w:spacing w:after="40" w:before="40"/>
+            </w:pPr>
+            <w:r/>
+            <w:r>
+              <w:rPr>
+                <w:rFonts w:ascii="Calibri" w:hAnsi="Calibri"/>
+                <w:b w:val="0"/>
+                <w:color w:val="1F2937"/>
+                <w:sz w:val="19"/>
+              </w:rPr>
+              <w:t>Browser / E2E / Screenshots</w:t>
+            </w:r>
+          </w:p>
+        </w:tc>
+        <w:tc>
+          <w:tcPr>
+            <w:tcW w:type="dxa" w:w="2448"/>
+            <w:shd w:val="clear" w:color="auto" w:fill="F3F4F6"/>
+          </w:tcPr>
+          <w:p>
+            <w:pPr>
+              <w:spacing w:after="40" w:before="40"/>
+            </w:pPr>
+            <w:r/>
+            <w:r>
+              <w:rPr>
+                <w:rFonts w:ascii="Calibri" w:hAnsi="Calibri"/>
+                <w:b w:val="0"/>
+                <w:color w:val="1F2937"/>
+                <w:sz w:val="19"/>
+              </w:rPr>
+              <w:t>playwright</w:t>
+            </w:r>
+          </w:p>
+        </w:tc>
+        <w:tc>
+          <w:tcPr>
+            <w:tcW w:type="dxa" w:w="3888"/>
+            <w:shd w:val="clear" w:color="auto" w:fill="F3F4F6"/>
+          </w:tcPr>
+          <w:p>
+            <w:pPr>
+              <w:spacing w:after="40" w:before="40"/>
+            </w:pPr>
+            <w:r/>
+            <w:r>
+              <w:rPr>
+                <w:rFonts w:ascii="Calibri" w:hAnsi="Calibri"/>
+                <w:b w:val="0"/>
+                <w:color w:val="1F2937"/>
+                <w:sz w:val="19"/>
+              </w:rPr>
+              <w:t>headless Automation, visuelle Tests</w:t>
             </w:r>
           </w:p>
         </w:tc>
@@ -4742,7 +5104,7 @@
                 <w:color w:val="1F2937"/>
                 <w:sz w:val="19"/>
               </w:rPr>
-              <w:t>Laufzeit-Memory (mit claude-mem abstimmen)</w:t>
+              <w:t>Wissensgraph — NICHT nötig, claude-mem deckt das ab</w:t>
             </w:r>
           </w:p>
         </w:tc>
@@ -4812,134 +5174,29 @@
           </w:p>
         </w:tc>
       </w:tr>
-      <w:tr>
-        <w:tc>
-          <w:tcPr>
-            <w:tcW w:type="dxa" w:w="3456"/>
-          </w:tcPr>
-          <w:p>
-            <w:pPr>
-              <w:spacing w:after="40" w:before="40"/>
-            </w:pPr>
-            <w:r/>
-            <w:r>
-              <w:rPr>
-                <w:rFonts w:ascii="Calibri" w:hAnsi="Calibri"/>
-                <w:b w:val="0"/>
-                <w:color w:val="1F2937"/>
-                <w:sz w:val="19"/>
-              </w:rPr>
-              <w:t>Bash-Token sparen (lokal)</w:t>
-            </w:r>
-          </w:p>
-        </w:tc>
-        <w:tc>
-          <w:tcPr>
-            <w:tcW w:type="dxa" w:w="2448"/>
-          </w:tcPr>
-          <w:p>
-            <w:pPr>
-              <w:spacing w:after="40" w:before="40"/>
-            </w:pPr>
-            <w:r/>
-            <w:r>
-              <w:rPr>
-                <w:rFonts w:ascii="Calibri" w:hAnsi="Calibri"/>
-                <w:b w:val="0"/>
-                <w:color w:val="1F2937"/>
-                <w:sz w:val="19"/>
-              </w:rPr>
-              <w:t>RTK-Hook</w:t>
-            </w:r>
-          </w:p>
-        </w:tc>
-        <w:tc>
-          <w:tcPr>
-            <w:tcW w:type="dxa" w:w="3888"/>
-          </w:tcPr>
-          <w:p>
-            <w:pPr>
-              <w:spacing w:after="40" w:before="40"/>
-            </w:pPr>
-            <w:r/>
-            <w:r>
-              <w:rPr>
-                <w:rFonts w:ascii="Calibri" w:hAnsi="Calibri"/>
-                <w:b w:val="0"/>
-                <w:color w:val="1F2937"/>
-                <w:sz w:val="19"/>
-              </w:rPr>
-              <w:t>60–90 % Ersparnis, läuft transparent global</w:t>
-            </w:r>
-          </w:p>
-        </w:tc>
-      </w:tr>
-      <w:tr>
-        <w:tc>
-          <w:tcPr>
-            <w:tcW w:type="dxa" w:w="3456"/>
-            <w:shd w:val="clear" w:color="auto" w:fill="F3F4F6"/>
-          </w:tcPr>
-          <w:p>
-            <w:pPr>
-              <w:spacing w:after="40" w:before="40"/>
-            </w:pPr>
-            <w:r/>
-            <w:r>
-              <w:rPr>
-                <w:rFonts w:ascii="Calibri" w:hAnsi="Calibri"/>
-                <w:b w:val="0"/>
-                <w:color w:val="1F2937"/>
-                <w:sz w:val="19"/>
-              </w:rPr>
-              <w:t>Frühere Arbeit / „schon gelöst?"</w:t>
-            </w:r>
-          </w:p>
-        </w:tc>
-        <w:tc>
-          <w:tcPr>
-            <w:tcW w:type="dxa" w:w="2448"/>
-            <w:shd w:val="clear" w:color="auto" w:fill="F3F4F6"/>
-          </w:tcPr>
-          <w:p>
-            <w:pPr>
-              <w:spacing w:after="40" w:before="40"/>
-            </w:pPr>
-            <w:r/>
-            <w:r>
-              <w:rPr>
-                <w:rFonts w:ascii="Calibri" w:hAnsi="Calibri"/>
-                <w:b w:val="0"/>
-                <w:color w:val="1F2937"/>
-                <w:sz w:val="19"/>
-              </w:rPr>
-              <w:t>claude-mem (/mem-search)</w:t>
-            </w:r>
-          </w:p>
-        </w:tc>
-        <w:tc>
-          <w:tcPr>
-            <w:tcW w:type="dxa" w:w="3888"/>
-            <w:shd w:val="clear" w:color="auto" w:fill="F3F4F6"/>
-          </w:tcPr>
-          <w:p>
-            <w:pPr>
-              <w:spacing w:after="40" w:before="40"/>
-            </w:pPr>
-            <w:r/>
-            <w:r>
-              <w:rPr>
-                <w:rFonts w:ascii="Calibri" w:hAnsi="Calibri"/>
-                <w:b w:val="0"/>
-                <w:color w:val="1F2937"/>
-                <w:sz w:val="19"/>
-              </w:rPr>
-              <w:t>cross-session Memory, injiziert Kontext automatisch</w:t>
-            </w:r>
-          </w:p>
-        </w:tc>
-      </w:tr>
     </w:tbl>
+    <w:p>
+      <w:pPr>
+        <w:spacing w:before="120" w:after="120"/>
+        <w:ind w:left="120"/>
+        <w:shd w:val="clear" w:color="auto" w:fill="EEF2FF"/>
+      </w:pPr>
+      <w:r>
+        <w:rPr>
+          <w:b/>
+          <w:color w:val="1E1B4B"/>
+          <w:sz w:val="20"/>
+        </w:rPr>
+        <w:t xml:space="preserve">Memory-Klarstellung:  </w:t>
+      </w:r>
+      <w:r>
+        <w:rPr>
+          <w:color w:val="1F2937"/>
+          <w:sz w:val="20"/>
+        </w:rPr>
+        <w:t>Der „memory“-MCP (Wissensgraph) ist NICHT installiert und nicht nötig — claude-mem ist deine primäre Memory-Quelle (§10). EINE Quelle pro Projekt, sonst doppelte Wahrheit.</w:t>
+      </w:r>
+    </w:p>
     <w:p>
       <w:pPr>
         <w:pStyle w:val="Heading1"/>
@@ -5691,6 +5948,99 @@
         <w:t>10 · Memory &amp; Sessions</w:t>
       </w:r>
     </w:p>
+    <w:p>
+      <w:pPr>
+        <w:spacing w:after="40"/>
+      </w:pPr>
+      <w:r>
+        <w:rPr>
+          <w:rFonts w:ascii="Calibri" w:hAnsi="Calibri"/>
+          <w:b/>
+          <w:i w:val="0"/>
+          <w:color w:val="312E81"/>
+          <w:sz w:val="21"/>
+        </w:rPr>
+        <w:t>claude-mem ist deine primäre, persistente Memory-Quelle — so nutzt du sie:</w:t>
+      </w:r>
+    </w:p>
+    <w:p>
+      <w:pPr>
+        <w:pStyle w:val="ListBullet"/>
+        <w:spacing w:after="40"/>
+      </w:pPr>
+      <w:r>
+        <w:rPr>
+          <w:b/>
+          <w:color w:val="1E1B4B"/>
+          <w:sz w:val="21"/>
+        </w:rPr>
+        <w:t xml:space="preserve">Automatisch: </w:t>
+      </w:r>
+      <w:r>
+        <w:rPr>
+          <w:color w:val="1F2937"/>
+          <w:sz w:val="21"/>
+        </w:rPr>
+        <w:t>injiziert relevanten Kontext aus früheren Sessions ab der 2. Session je Projekt — ohne Zutun.</w:t>
+      </w:r>
+    </w:p>
+    <w:p>
+      <w:pPr>
+        <w:pStyle w:val="ListBullet"/>
+        <w:spacing w:after="40"/>
+      </w:pPr>
+      <w:r>
+        <w:rPr>
+          <w:b/>
+          <w:color w:val="1E1B4B"/>
+          <w:sz w:val="21"/>
+        </w:rPr>
+        <w:t xml:space="preserve">/mem-search „…“: </w:t>
+      </w:r>
+      <w:r>
+        <w:rPr>
+          <w:color w:val="1F2937"/>
+          <w:sz w:val="21"/>
+        </w:rPr>
+        <w:t>gezielt frühere Arbeit finden („schon gelöst?“, „wie haben wir X gemacht?“).</w:t>
+      </w:r>
+    </w:p>
+    <w:p>
+      <w:pPr>
+        <w:pStyle w:val="ListBullet"/>
+        <w:spacing w:after="40"/>
+      </w:pPr>
+      <w:r>
+        <w:rPr>
+          <w:b/>
+          <w:color w:val="1E1B4B"/>
+          <w:sz w:val="21"/>
+        </w:rPr>
+        <w:t xml:space="preserve">Erfasst von selbst: </w:t>
+      </w:r>
+      <w:r>
+        <w:rPr>
+          <w:color w:val="1F2937"/>
+          <w:sz w:val="21"/>
+        </w:rPr>
+        <w:t>Beobachtungen/Entscheidungen werden automatisch gespeichert — kein manuelles Speichern.</w:t>
+      </w:r>
+    </w:p>
+    <w:p>
+      <w:pPr>
+        <w:spacing w:after="40"/>
+      </w:pPr>
+      <w:r>
+        <w:rPr>
+          <w:rFonts w:ascii="Calibri" w:hAnsi="Calibri"/>
+          <w:b/>
+          <w:i w:val="0"/>
+          <w:color w:val="312E81"/>
+          <w:sz w:val="21"/>
+        </w:rPr>
+        <w:t>Sessions explizit sichern/laden (ECC-Commands, ergänzend):</w:t>
+      </w:r>
+    </w:p>
     <w:tbl>
       <w:tblPr>
         <w:tblStyle w:val="TableGrid"/>
@@ -5990,14 +6340,14 @@
           <w:color w:val="B45309"/>
           <w:sz w:val="20"/>
         </w:rPr>
-        <w:t xml:space="preserve">Koexistenz claude-mem:  </w:t>
+        <w:t xml:space="preserve">EINE Memory-Quelle:  </w:t>
       </w:r>
       <w:r>
         <w:rPr>
           <w:color w:val="1F2937"/>
           <w:sz w:val="20"/>
         </w:rPr>
-        <w:t>Entscheide dich pro Projekt für EINE primäre Memory-Quelle, sonst doppelte Wahrheit. Keine Secrets in Memory.</w:t>
+        <w:t>claude-mem ist gesetzt — den generischen „memory“-MCP NICHT zusätzlich aktivieren (sonst doppelte Wahrheit). Keine Secrets in Memory.</w:t>
       </w:r>
     </w:p>
     <w:p>

</xml_diff>

<commit_message>
docs: End-to-End-Founder-Playbook als Kapitel 7 im Begleit-Guide
Neues Kapitel "7 · Playbook — Von 0 auf Feature (durchgespielt)" in Word + PPT:
- 7a Zwei Startpunkte (leeres Projekt vs. bestehende Codebase)
- 7b /api/search-Feature durch alle 5 Phasen (RESEARCH→PLAN→IMPLEMENT→REVIEW→VERIFY)
- 7c taeglicher Rhythmus (Session-Start / Phasen / Lernen)

Kapitel 7-15 → 8-16 umnummeriert, 2 PPTX-Slides ergaenzt (§7a/§7b),
Footer-Nenner /16 → /18, Inhalt geerdet an ecc/ECC-WORKFLOW-GUIDE.de.md.

Verifiziert: build_guide.py exit 0; Word-Headings lueckenlos 1..16;
PPTX 19 Slides, §-Refs konsistent; beide Dateien valide ZIPs.

Co-Authored-By: Claude Opus 4.8 (1M context) <noreply@anthropic.com>
</commit_message>
<xml_diff>
--- a/docs/ECC-Harness-Guide.de.docx
+++ b/docs/ECC-Harness-Guide.de.docx
@@ -582,7 +582,7 @@
                 <w:color w:val="1F2937"/>
                 <w:sz w:val="19"/>
               </w:rPr>
-              <w:t>Token-Ökonomie (§9)</w:t>
+              <w:t>Token-Ökonomie (§10)</w:t>
             </w:r>
           </w:p>
         </w:tc>
@@ -3150,7 +3150,1460 @@
         </w:pBdr>
       </w:pPr>
       <w:r>
-        <w:t>7 · Cheat-Sheet — wann welcher Command</w:t>
+        <w:t>7 · Playbook — Von 0 auf Feature (durchgespielt)</w:t>
+      </w:r>
+    </w:p>
+    <w:p>
+      <w:pPr>
+        <w:spacing w:after="40"/>
+      </w:pPr>
+      <w:r>
+        <w:rPr>
+          <w:rFonts w:ascii="Calibri" w:hAnsi="Calibri"/>
+          <w:b w:val="0"/>
+          <w:i w:val="0"/>
+          <w:color w:val="1F2937"/>
+          <w:sz w:val="21"/>
+        </w:rPr>
+        <w:t>Kapitel 5–6 erklären die Phasen und das Onboarding einzeln. Hier laufen sie als EIN durchgehender Ablauf zusammen — genau wie der Erfinder: zwei Startpunkte, ein Feature von Anfang bis grün, dann der tägliche Rhythmus.</w:t>
+      </w:r>
+    </w:p>
+    <w:p>
+      <w:pPr>
+        <w:spacing w:after="40"/>
+      </w:pPr>
+      <w:r>
+        <w:rPr>
+          <w:rFonts w:ascii="Calibri" w:hAnsi="Calibri"/>
+          <w:b/>
+          <w:i w:val="0"/>
+          <w:color w:val="312E81"/>
+          <w:sz w:val="21"/>
+        </w:rPr>
+        <w:t>a) Zwei Startpunkte — leeres Projekt ODER bestehende Codebase</w:t>
+      </w:r>
+    </w:p>
+    <w:p>
+      <w:pPr>
+        <w:spacing w:after="40"/>
+      </w:pPr>
+      <w:r>
+        <w:rPr>
+          <w:rFonts w:ascii="Calibri" w:hAnsi="Calibri"/>
+          <w:b/>
+          <w:i w:val="0"/>
+          <w:color w:val="1F2937"/>
+          <w:sz w:val="21"/>
+        </w:rPr>
+        <w:t>Leeres Projekt (greenfield) — bei null anfangen:</w:t>
+      </w:r>
+    </w:p>
+    <w:p>
+      <w:pPr>
+        <w:spacing w:before="80" w:after="160"/>
+        <w:ind w:left="80"/>
+        <w:shd w:val="clear" w:color="auto" w:fill="1E1B2E"/>
+      </w:pPr>
+      <w:r>
+        <w:rPr>
+          <w:rFonts w:ascii="Consolas" w:hAnsi="Consolas"/>
+          <w:color w:val="9CE3F0"/>
+          <w:sz w:val="18"/>
+        </w:rPr>
+        <w:t>mkdir mein-projekt &amp;&amp; cd mein-projekt &amp;&amp; git init</w:t>
+      </w:r>
+      <w:r>
+        <w:br/>
+      </w:r>
+      <w:r>
+        <w:rPr>
+          <w:rFonts w:ascii="Consolas" w:hAnsi="Consolas"/>
+          <w:color w:val="9CE3F0"/>
+          <w:sz w:val="18"/>
+        </w:rPr>
+        <w:t>claude                       # Claude Code IN diesem Ordner starten</w:t>
+      </w:r>
+      <w:r>
+        <w:br/>
+      </w:r>
+      <w:r>
+        <w:rPr>
+          <w:rFonts w:ascii="Consolas" w:hAnsi="Consolas"/>
+          <w:color w:val="9CE3F0"/>
+          <w:sz w:val="18"/>
+        </w:rPr>
+        <w:t>/ecc-onboard                 # Stack-Frage → 1x OK → .claude/rules+skills, PROJECT_RULES.md, state/</w:t>
+      </w:r>
+      <w:r>
+        <w:br/>
+      </w:r>
+      <w:r>
+        <w:rPr>
+          <w:rFonts w:ascii="Consolas" w:hAnsi="Consolas"/>
+          <w:color w:val="9CE3F0"/>
+          <w:sz w:val="18"/>
+        </w:rPr>
+        <w:t>/plan  Baue &lt;Feature X&gt; …    # erster Plan — wartet auf dein OK</w:t>
+      </w:r>
+    </w:p>
+    <w:p>
+      <w:pPr>
+        <w:spacing w:after="40"/>
+      </w:pPr>
+      <w:r>
+        <w:rPr>
+          <w:rFonts w:ascii="Calibri" w:hAnsi="Calibri"/>
+          <w:b/>
+          <w:i w:val="0"/>
+          <w:color w:val="1F2937"/>
+          <w:sz w:val="21"/>
+        </w:rPr>
+        <w:t>Bestehende Codebase übernehmen — fremden Code zähmen:</w:t>
+      </w:r>
+    </w:p>
+    <w:p>
+      <w:pPr>
+        <w:spacing w:before="80" w:after="160"/>
+        <w:ind w:left="80"/>
+        <w:shd w:val="clear" w:color="auto" w:fill="1E1B2E"/>
+      </w:pPr>
+      <w:r>
+        <w:rPr>
+          <w:rFonts w:ascii="Consolas" w:hAnsi="Consolas"/>
+          <w:color w:val="9CE3F0"/>
+          <w:sz w:val="18"/>
+        </w:rPr>
+        <w:t>git clone &lt;repo&gt; &amp;&amp; cd &lt;repo&gt;</w:t>
+      </w:r>
+      <w:r>
+        <w:br/>
+      </w:r>
+      <w:r>
+        <w:rPr>
+          <w:rFonts w:ascii="Consolas" w:hAnsi="Consolas"/>
+          <w:color w:val="9CE3F0"/>
+          <w:sz w:val="18"/>
+        </w:rPr>
+        <w:t>claude</w:t>
+      </w:r>
+      <w:r>
+        <w:br/>
+      </w:r>
+      <w:r>
+        <w:rPr>
+          <w:rFonts w:ascii="Consolas" w:hAnsi="Consolas"/>
+          <w:color w:val="9CE3F0"/>
+          <w:sz w:val="18"/>
+        </w:rPr>
+        <w:t>/ecc-onboard                 # erkennt Stack aus package.json / go.mod / pyproject.toml …</w:t>
+      </w:r>
+      <w:r>
+        <w:br/>
+      </w:r>
+      <w:r>
+        <w:rPr>
+          <w:rFonts w:ascii="Consolas" w:hAnsi="Consolas"/>
+          <w:color w:val="9CE3F0"/>
+          <w:sz w:val="18"/>
+        </w:rPr>
+        <w:t>/update-codemaps             # EINMAL kartieren → docs/CODEMAPS/*  (danach Karte statt Volltext)</w:t>
+      </w:r>
+      <w:r>
+        <w:br/>
+      </w:r>
+      <w:r>
+        <w:rPr>
+          <w:rFonts w:ascii="Consolas" w:hAnsi="Consolas"/>
+          <w:color w:val="9CE3F0"/>
+          <w:sz w:val="18"/>
+        </w:rPr>
+        <w:t>code-tour · smart-explore    # geführte Tour / Struktur-Suche bei fremdem Code</w:t>
+      </w:r>
+    </w:p>
+    <w:p>
+      <w:pPr>
+        <w:spacing w:before="120" w:after="120"/>
+        <w:ind w:left="120"/>
+        <w:shd w:val="clear" w:color="auto" w:fill="EEF2FF"/>
+      </w:pPr>
+      <w:r>
+        <w:rPr>
+          <w:b/>
+          <w:color w:val="1E1B4B"/>
+          <w:sz w:val="20"/>
+        </w:rPr>
+        <w:t xml:space="preserve">Einmal, nicht jedes Mal:  </w:t>
+      </w:r>
+      <w:r>
+        <w:rPr>
+          <w:color w:val="1F2937"/>
+          <w:sz w:val="20"/>
+        </w:rPr>
+        <w:t>/ecc-onboard und /update-codemaps laufen pro Projekt EINMAL. Das Ergebnis ist persistent (Dateien) — jede Folge-Session startet mit der kompakten Karte statt die ganze Codebase neu zu durchsuchen.</w:t>
+      </w:r>
+    </w:p>
+    <w:p>
+      <w:pPr>
+        <w:spacing w:after="40"/>
+      </w:pPr>
+      <w:r>
+        <w:rPr>
+          <w:rFonts w:ascii="Calibri" w:hAnsi="Calibri"/>
+          <w:b/>
+          <w:i w:val="0"/>
+          <w:color w:val="312E81"/>
+          <w:sz w:val="21"/>
+        </w:rPr>
+        <w:t>b) Ein Feature von Anfang bis Ende — Beispiel: neuer /api/search-Endpoint</w:t>
+      </w:r>
+    </w:p>
+    <w:p>
+      <w:pPr>
+        <w:spacing w:after="40"/>
+      </w:pPr>
+      <w:r>
+        <w:rPr>
+          <w:rFonts w:ascii="Calibri" w:hAnsi="Calibri"/>
+          <w:b w:val="0"/>
+          <w:i w:val="0"/>
+          <w:color w:val="1F2937"/>
+          <w:sz w:val="21"/>
+        </w:rPr>
+        <w:t>Eine Aufgabe, fünf Phasen, je ein Datei-Output, /clear dazwischen, billigstes ausreichendes Modell:</w:t>
+      </w:r>
+    </w:p>
+    <w:tbl>
+      <w:tblPr>
+        <w:tblStyle w:val="TableGrid"/>
+        <w:tblW w:type="auto" w:w="0"/>
+        <w:jc w:val="center"/>
+        <w:tblLook w:firstColumn="1" w:firstRow="1" w:lastColumn="0" w:lastRow="0" w:noHBand="0" w:noVBand="1" w:val="04A0"/>
+      </w:tblPr>
+      <w:tblGrid>
+        <w:gridCol w:w="2484"/>
+        <w:gridCol w:w="2484"/>
+        <w:gridCol w:w="2484"/>
+        <w:gridCol w:w="2484"/>
+      </w:tblGrid>
+      <w:tr>
+        <w:tc>
+          <w:tcPr>
+            <w:tcW w:type="dxa" w:w="1656"/>
+            <w:shd w:val="clear" w:color="auto" w:fill="312E81"/>
+          </w:tcPr>
+          <w:p>
+            <w:pPr>
+              <w:spacing w:after="40" w:before="40"/>
+            </w:pPr>
+            <w:r/>
+            <w:r>
+              <w:rPr>
+                <w:rFonts w:ascii="Calibri" w:hAnsi="Calibri"/>
+                <w:b/>
+                <w:color w:val="FFFFFF"/>
+                <w:sz w:val="19"/>
+              </w:rPr>
+              <w:t>Phase</w:t>
+            </w:r>
+          </w:p>
+        </w:tc>
+        <w:tc>
+          <w:tcPr>
+            <w:tcW w:type="dxa" w:w="4536"/>
+            <w:shd w:val="clear" w:color="auto" w:fill="312E81"/>
+          </w:tcPr>
+          <w:p>
+            <w:pPr>
+              <w:spacing w:after="40" w:before="40"/>
+            </w:pPr>
+            <w:r/>
+            <w:r>
+              <w:rPr>
+                <w:rFonts w:ascii="Calibri" w:hAnsi="Calibri"/>
+                <w:b/>
+                <w:color w:val="FFFFFF"/>
+                <w:sz w:val="19"/>
+              </w:rPr>
+              <w:t>Du tippst</w:t>
+            </w:r>
+          </w:p>
+        </w:tc>
+        <w:tc>
+          <w:tcPr>
+            <w:tcW w:type="dxa" w:w="1368"/>
+            <w:shd w:val="clear" w:color="auto" w:fill="312E81"/>
+          </w:tcPr>
+          <w:p>
+            <w:pPr>
+              <w:spacing w:after="40" w:before="40"/>
+            </w:pPr>
+            <w:r/>
+            <w:r>
+              <w:rPr>
+                <w:rFonts w:ascii="Calibri" w:hAnsi="Calibri"/>
+                <w:b/>
+                <w:color w:val="FFFFFF"/>
+                <w:sz w:val="19"/>
+              </w:rPr>
+              <w:t>Modell</w:t>
+            </w:r>
+          </w:p>
+        </w:tc>
+        <w:tc>
+          <w:tcPr>
+            <w:tcW w:type="dxa" w:w="2232"/>
+            <w:shd w:val="clear" w:color="auto" w:fill="312E81"/>
+          </w:tcPr>
+          <w:p>
+            <w:pPr>
+              <w:spacing w:after="40" w:before="40"/>
+            </w:pPr>
+            <w:r/>
+            <w:r>
+              <w:rPr>
+                <w:rFonts w:ascii="Calibri" w:hAnsi="Calibri"/>
+                <w:b/>
+                <w:color w:val="FFFFFF"/>
+                <w:sz w:val="19"/>
+              </w:rPr>
+              <w:t>Output (Datei)</w:t>
+            </w:r>
+          </w:p>
+        </w:tc>
+      </w:tr>
+      <w:tr>
+        <w:tc>
+          <w:tcPr>
+            <w:tcW w:type="dxa" w:w="1656"/>
+            <w:shd w:val="clear" w:color="auto" w:fill="F3F4F6"/>
+          </w:tcPr>
+          <w:p>
+            <w:pPr>
+              <w:spacing w:after="40" w:before="40"/>
+            </w:pPr>
+            <w:r/>
+            <w:r>
+              <w:rPr>
+                <w:rFonts w:ascii="Calibri" w:hAnsi="Calibri"/>
+                <w:b w:val="0"/>
+                <w:color w:val="1F2937"/>
+                <w:sz w:val="19"/>
+              </w:rPr>
+              <w:t>1 · RESEARCH</w:t>
+            </w:r>
+          </w:p>
+        </w:tc>
+        <w:tc>
+          <w:tcPr>
+            <w:tcW w:type="dxa" w:w="4536"/>
+            <w:shd w:val="clear" w:color="auto" w:fill="F3F4F6"/>
+          </w:tcPr>
+          <w:p>
+            <w:pPr>
+              <w:spacing w:after="40" w:before="40"/>
+            </w:pPr>
+            <w:r/>
+            <w:r>
+              <w:rPr>
+                <w:rFonts w:ascii="Calibri" w:hAnsi="Calibri"/>
+                <w:b w:val="0"/>
+                <w:color w:val="1F2937"/>
+                <w:sz w:val="19"/>
+              </w:rPr>
+              <w:t>Explore-Agent: Routing/Handler/Tests für Suche kartieren (+ claude-mem)</w:t>
+            </w:r>
+          </w:p>
+        </w:tc>
+        <w:tc>
+          <w:tcPr>
+            <w:tcW w:type="dxa" w:w="1368"/>
+            <w:shd w:val="clear" w:color="auto" w:fill="F3F4F6"/>
+          </w:tcPr>
+          <w:p>
+            <w:pPr>
+              <w:spacing w:after="40" w:before="40"/>
+            </w:pPr>
+            <w:r/>
+            <w:r>
+              <w:rPr>
+                <w:rFonts w:ascii="Calibri" w:hAnsi="Calibri"/>
+                <w:b w:val="0"/>
+                <w:color w:val="1F2937"/>
+                <w:sz w:val="19"/>
+              </w:rPr>
+              <w:t>Haiku</w:t>
+            </w:r>
+          </w:p>
+        </w:tc>
+        <w:tc>
+          <w:tcPr>
+            <w:tcW w:type="dxa" w:w="2232"/>
+            <w:shd w:val="clear" w:color="auto" w:fill="F3F4F6"/>
+          </w:tcPr>
+          <w:p>
+            <w:pPr>
+              <w:spacing w:after="40" w:before="40"/>
+            </w:pPr>
+            <w:r/>
+            <w:r>
+              <w:rPr>
+                <w:rFonts w:ascii="Calibri" w:hAnsi="Calibri"/>
+                <w:b w:val="0"/>
+                <w:color w:val="1F2937"/>
+                <w:sz w:val="19"/>
+              </w:rPr>
+              <w:t>research.md</w:t>
+            </w:r>
+          </w:p>
+        </w:tc>
+      </w:tr>
+      <w:tr>
+        <w:tc>
+          <w:tcPr>
+            <w:tcW w:type="dxa" w:w="1656"/>
+          </w:tcPr>
+          <w:p>
+            <w:pPr>
+              <w:spacing w:after="40" w:before="40"/>
+            </w:pPr>
+            <w:r/>
+            <w:r>
+              <w:rPr>
+                <w:rFonts w:ascii="Calibri" w:hAnsi="Calibri"/>
+                <w:b w:val="0"/>
+                <w:color w:val="1F2937"/>
+                <w:sz w:val="19"/>
+              </w:rPr>
+              <w:t>— /clear —</w:t>
+            </w:r>
+          </w:p>
+        </w:tc>
+        <w:tc>
+          <w:tcPr>
+            <w:tcW w:type="dxa" w:w="4536"/>
+          </w:tcPr>
+          <w:p>
+            <w:pPr>
+              <w:spacing w:after="40" w:before="40"/>
+            </w:pPr>
+            <w:r/>
+            <w:r>
+              <w:rPr>
+                <w:rFonts w:ascii="Calibri" w:hAnsi="Calibri"/>
+                <w:b w:val="0"/>
+                <w:color w:val="1F2937"/>
+                <w:sz w:val="19"/>
+              </w:rPr>
+              <w:t>Explorations-Kontext ist für die Umsetzung irrelevant</w:t>
+            </w:r>
+          </w:p>
+        </w:tc>
+        <w:tc>
+          <w:tcPr>
+            <w:tcW w:type="dxa" w:w="1368"/>
+          </w:tcPr>
+          <w:p>
+            <w:pPr>
+              <w:spacing w:after="40" w:before="40"/>
+            </w:pPr>
+            <w:r/>
+            <w:r>
+              <w:rPr>
+                <w:rFonts w:ascii="Calibri" w:hAnsi="Calibri"/>
+                <w:b w:val="0"/>
+                <w:color w:val="1F2937"/>
+                <w:sz w:val="19"/>
+              </w:rPr>
+              <w:t>—</w:t>
+            </w:r>
+          </w:p>
+        </w:tc>
+        <w:tc>
+          <w:tcPr>
+            <w:tcW w:type="dxa" w:w="2232"/>
+          </w:tcPr>
+          <w:p>
+            <w:pPr>
+              <w:spacing w:after="40" w:before="40"/>
+            </w:pPr>
+            <w:r/>
+            <w:r>
+              <w:rPr>
+                <w:rFonts w:ascii="Calibri" w:hAnsi="Calibri"/>
+                <w:b w:val="0"/>
+                <w:color w:val="1F2937"/>
+                <w:sz w:val="19"/>
+              </w:rPr>
+              <w:t>—</w:t>
+            </w:r>
+          </w:p>
+        </w:tc>
+      </w:tr>
+      <w:tr>
+        <w:tc>
+          <w:tcPr>
+            <w:tcW w:type="dxa" w:w="1656"/>
+            <w:shd w:val="clear" w:color="auto" w:fill="F3F4F6"/>
+          </w:tcPr>
+          <w:p>
+            <w:pPr>
+              <w:spacing w:after="40" w:before="40"/>
+            </w:pPr>
+            <w:r/>
+            <w:r>
+              <w:rPr>
+                <w:rFonts w:ascii="Calibri" w:hAnsi="Calibri"/>
+                <w:b w:val="0"/>
+                <w:color w:val="1F2937"/>
+                <w:sz w:val="19"/>
+              </w:rPr>
+              <w:t>2 · PLAN</w:t>
+            </w:r>
+          </w:p>
+        </w:tc>
+        <w:tc>
+          <w:tcPr>
+            <w:tcW w:type="dxa" w:w="4536"/>
+            <w:shd w:val="clear" w:color="auto" w:fill="F3F4F6"/>
+          </w:tcPr>
+          <w:p>
+            <w:pPr>
+              <w:spacing w:after="40" w:before="40"/>
+            </w:pPr>
+            <w:r/>
+            <w:r>
+              <w:rPr>
+                <w:rFonts w:ascii="Calibri" w:hAnsi="Calibri"/>
+                <w:b w:val="0"/>
+                <w:color w:val="1F2937"/>
+                <w:sz w:val="19"/>
+              </w:rPr>
+              <w:t>/plan  /api/search: Query → Filter → Paginierung, Tests zuerst</w:t>
+            </w:r>
+          </w:p>
+        </w:tc>
+        <w:tc>
+          <w:tcPr>
+            <w:tcW w:type="dxa" w:w="1368"/>
+            <w:shd w:val="clear" w:color="auto" w:fill="F3F4F6"/>
+          </w:tcPr>
+          <w:p>
+            <w:pPr>
+              <w:spacing w:after="40" w:before="40"/>
+            </w:pPr>
+            <w:r/>
+            <w:r>
+              <w:rPr>
+                <w:rFonts w:ascii="Calibri" w:hAnsi="Calibri"/>
+                <w:b w:val="0"/>
+                <w:color w:val="1F2937"/>
+                <w:sz w:val="19"/>
+              </w:rPr>
+              <w:t>Opus</w:t>
+            </w:r>
+          </w:p>
+        </w:tc>
+        <w:tc>
+          <w:tcPr>
+            <w:tcW w:type="dxa" w:w="2232"/>
+            <w:shd w:val="clear" w:color="auto" w:fill="F3F4F6"/>
+          </w:tcPr>
+          <w:p>
+            <w:pPr>
+              <w:spacing w:after="40" w:before="40"/>
+            </w:pPr>
+            <w:r/>
+            <w:r>
+              <w:rPr>
+                <w:rFonts w:ascii="Calibri" w:hAnsi="Calibri"/>
+                <w:b w:val="0"/>
+                <w:color w:val="1F2937"/>
+                <w:sz w:val="19"/>
+              </w:rPr>
+              <w:t>plan.md (wartet auf OK)</w:t>
+            </w:r>
+          </w:p>
+        </w:tc>
+      </w:tr>
+      <w:tr>
+        <w:tc>
+          <w:tcPr>
+            <w:tcW w:type="dxa" w:w="1656"/>
+          </w:tcPr>
+          <w:p>
+            <w:pPr>
+              <w:spacing w:after="40" w:before="40"/>
+            </w:pPr>
+            <w:r/>
+            <w:r>
+              <w:rPr>
+                <w:rFonts w:ascii="Calibri" w:hAnsi="Calibri"/>
+                <w:b w:val="0"/>
+                <w:color w:val="1F2937"/>
+                <w:sz w:val="19"/>
+              </w:rPr>
+              <w:t>3 · IMPLEMENT</w:t>
+            </w:r>
+          </w:p>
+        </w:tc>
+        <w:tc>
+          <w:tcPr>
+            <w:tcW w:type="dxa" w:w="4536"/>
+          </w:tcPr>
+          <w:p>
+            <w:pPr>
+              <w:spacing w:after="40" w:before="40"/>
+            </w:pPr>
+            <w:r/>
+            <w:r>
+              <w:rPr>
+                <w:rFonts w:ascii="Calibri" w:hAnsi="Calibri"/>
+                <w:b w:val="0"/>
+                <w:color w:val="1F2937"/>
+                <w:sz w:val="19"/>
+              </w:rPr>
+              <w:t>/feature-dev  plan.md umsetzen (Skill tdd-workflow: Tests zuerst)</w:t>
+            </w:r>
+          </w:p>
+        </w:tc>
+        <w:tc>
+          <w:tcPr>
+            <w:tcW w:type="dxa" w:w="1368"/>
+          </w:tcPr>
+          <w:p>
+            <w:pPr>
+              <w:spacing w:after="40" w:before="40"/>
+            </w:pPr>
+            <w:r/>
+            <w:r>
+              <w:rPr>
+                <w:rFonts w:ascii="Calibri" w:hAnsi="Calibri"/>
+                <w:b w:val="0"/>
+                <w:color w:val="1F2937"/>
+                <w:sz w:val="19"/>
+              </w:rPr>
+              <w:t>Sonnet→Opus</w:t>
+            </w:r>
+          </w:p>
+        </w:tc>
+        <w:tc>
+          <w:tcPr>
+            <w:tcW w:type="dxa" w:w="2232"/>
+          </w:tcPr>
+          <w:p>
+            <w:pPr>
+              <w:spacing w:after="40" w:before="40"/>
+            </w:pPr>
+            <w:r/>
+            <w:r>
+              <w:rPr>
+                <w:rFonts w:ascii="Calibri" w:hAnsi="Calibri"/>
+                <w:b w:val="0"/>
+                <w:color w:val="1F2937"/>
+                <w:sz w:val="19"/>
+              </w:rPr>
+              <w:t>Code + Tests (RED→GREEN)</w:t>
+            </w:r>
+          </w:p>
+        </w:tc>
+      </w:tr>
+      <w:tr>
+        <w:tc>
+          <w:tcPr>
+            <w:tcW w:type="dxa" w:w="1656"/>
+            <w:shd w:val="clear" w:color="auto" w:fill="F3F4F6"/>
+          </w:tcPr>
+          <w:p>
+            <w:pPr>
+              <w:spacing w:after="40" w:before="40"/>
+            </w:pPr>
+            <w:r/>
+            <w:r>
+              <w:rPr>
+                <w:rFonts w:ascii="Calibri" w:hAnsi="Calibri"/>
+                <w:b w:val="0"/>
+                <w:color w:val="1F2937"/>
+                <w:sz w:val="19"/>
+              </w:rPr>
+              <w:t>4 · REVIEW</w:t>
+            </w:r>
+          </w:p>
+        </w:tc>
+        <w:tc>
+          <w:tcPr>
+            <w:tcW w:type="dxa" w:w="4536"/>
+            <w:shd w:val="clear" w:color="auto" w:fill="F3F4F6"/>
+          </w:tcPr>
+          <w:p>
+            <w:pPr>
+              <w:spacing w:after="40" w:before="40"/>
+            </w:pPr>
+            <w:r/>
+            <w:r>
+              <w:rPr>
+                <w:rFonts w:ascii="Calibri" w:hAnsi="Calibri"/>
+                <w:b w:val="0"/>
+                <w:color w:val="1F2937"/>
+                <w:sz w:val="19"/>
+              </w:rPr>
+              <w:t>/code-review  (+ /python-review | /go-review …)</w:t>
+            </w:r>
+          </w:p>
+        </w:tc>
+        <w:tc>
+          <w:tcPr>
+            <w:tcW w:type="dxa" w:w="1368"/>
+            <w:shd w:val="clear" w:color="auto" w:fill="F3F4F6"/>
+          </w:tcPr>
+          <w:p>
+            <w:pPr>
+              <w:spacing w:after="40" w:before="40"/>
+            </w:pPr>
+            <w:r/>
+            <w:r>
+              <w:rPr>
+                <w:rFonts w:ascii="Calibri" w:hAnsi="Calibri"/>
+                <w:b w:val="0"/>
+                <w:color w:val="1F2937"/>
+                <w:sz w:val="19"/>
+              </w:rPr>
+              <w:t>Opus</w:t>
+            </w:r>
+          </w:p>
+        </w:tc>
+        <w:tc>
+          <w:tcPr>
+            <w:tcW w:type="dxa" w:w="2232"/>
+            <w:shd w:val="clear" w:color="auto" w:fill="F3F4F6"/>
+          </w:tcPr>
+          <w:p>
+            <w:pPr>
+              <w:spacing w:after="40" w:before="40"/>
+            </w:pPr>
+            <w:r/>
+            <w:r>
+              <w:rPr>
+                <w:rFonts w:ascii="Calibri" w:hAnsi="Calibri"/>
+                <w:b w:val="0"/>
+                <w:color w:val="1F2937"/>
+                <w:sz w:val="19"/>
+              </w:rPr>
+              <w:t>review.md</w:t>
+            </w:r>
+          </w:p>
+        </w:tc>
+      </w:tr>
+      <w:tr>
+        <w:tc>
+          <w:tcPr>
+            <w:tcW w:type="dxa" w:w="1656"/>
+          </w:tcPr>
+          <w:p>
+            <w:pPr>
+              <w:spacing w:after="40" w:before="40"/>
+            </w:pPr>
+            <w:r/>
+            <w:r>
+              <w:rPr>
+                <w:rFonts w:ascii="Calibri" w:hAnsi="Calibri"/>
+                <w:b w:val="0"/>
+                <w:color w:val="1F2937"/>
+                <w:sz w:val="19"/>
+              </w:rPr>
+              <w:t>5 · VERIFY</w:t>
+            </w:r>
+          </w:p>
+        </w:tc>
+        <w:tc>
+          <w:tcPr>
+            <w:tcW w:type="dxa" w:w="4536"/>
+          </w:tcPr>
+          <w:p>
+            <w:pPr>
+              <w:spacing w:after="40" w:before="40"/>
+            </w:pPr>
+            <w:r/>
+            <w:r>
+              <w:rPr>
+                <w:rFonts w:ascii="Calibri" w:hAnsi="Calibri"/>
+                <w:b w:val="0"/>
+                <w:color w:val="1F2937"/>
+                <w:sz w:val="19"/>
+              </w:rPr>
+              <w:t>Tests/Build grün? sonst /build-fix → zurück zu Phase 3</w:t>
+            </w:r>
+          </w:p>
+        </w:tc>
+        <w:tc>
+          <w:tcPr>
+            <w:tcW w:type="dxa" w:w="1368"/>
+          </w:tcPr>
+          <w:p>
+            <w:pPr>
+              <w:spacing w:after="40" w:before="40"/>
+            </w:pPr>
+            <w:r/>
+            <w:r>
+              <w:rPr>
+                <w:rFonts w:ascii="Calibri" w:hAnsi="Calibri"/>
+                <w:b w:val="0"/>
+                <w:color w:val="1F2937"/>
+                <w:sz w:val="19"/>
+              </w:rPr>
+              <w:t>Sonnet</w:t>
+            </w:r>
+          </w:p>
+        </w:tc>
+        <w:tc>
+          <w:tcPr>
+            <w:tcW w:type="dxa" w:w="2232"/>
+          </w:tcPr>
+          <w:p>
+            <w:pPr>
+              <w:spacing w:after="40" w:before="40"/>
+            </w:pPr>
+            <w:r/>
+            <w:r>
+              <w:rPr>
+                <w:rFonts w:ascii="Calibri" w:hAnsi="Calibri"/>
+                <w:b w:val="0"/>
+                <w:color w:val="1F2937"/>
+                <w:sz w:val="19"/>
+              </w:rPr>
+              <w:t>grün → commit / PR</w:t>
+            </w:r>
+          </w:p>
+        </w:tc>
+      </w:tr>
+    </w:tbl>
+    <w:p>
+      <w:pPr>
+        <w:spacing w:after="40"/>
+      </w:pPr>
+      <w:r>
+        <w:rPr>
+          <w:rFonts w:ascii="Calibri" w:hAnsi="Calibri"/>
+          <w:b/>
+          <w:i w:val="0"/>
+          <w:color w:val="1F2937"/>
+          <w:sz w:val="21"/>
+        </w:rPr>
+        <w:t>Konkret getippt (copy-paste-tauglich):</w:t>
+      </w:r>
+    </w:p>
+    <w:p>
+      <w:pPr>
+        <w:spacing w:before="80" w:after="160"/>
+        <w:ind w:left="80"/>
+        <w:shd w:val="clear" w:color="auto" w:fill="1E1B2E"/>
+      </w:pPr>
+      <w:r>
+        <w:rPr>
+          <w:rFonts w:ascii="Consolas" w:hAnsi="Consolas"/>
+          <w:color w:val="9CE3F0"/>
+          <w:sz w:val="18"/>
+        </w:rPr>
+        <w:t># Phase 1 — Research (Output in Datei, nicht im Kopf)</w:t>
+      </w:r>
+      <w:r>
+        <w:br/>
+      </w:r>
+      <w:r>
+        <w:rPr>
+          <w:rFonts w:ascii="Consolas" w:hAnsi="Consolas"/>
+          <w:color w:val="9CE3F0"/>
+          <w:sz w:val="18"/>
+        </w:rPr>
+        <w:t>Explore-Agent: kartiere vorhandenes Routing/Handler/Tests für Suche → research.md</w:t>
+      </w:r>
+      <w:r>
+        <w:br/>
+      </w:r>
+      <w:r>
+        <w:rPr>
+          <w:rFonts w:ascii="Consolas" w:hAnsi="Consolas"/>
+          <w:color w:val="9CE3F0"/>
+          <w:sz w:val="18"/>
+        </w:rPr>
+        <w:t>/clear</w:t>
+      </w:r>
+      <w:r>
+        <w:br/>
+      </w:r>
+      <w:r>
+        <w:rPr>
+          <w:rFonts w:ascii="Consolas" w:hAnsi="Consolas"/>
+          <w:color w:val="9CE3F0"/>
+          <w:sz w:val="18"/>
+        </w:rPr>
+        <w:t># Phase 2 — Plan (wartet auf dein OK)</w:t>
+      </w:r>
+      <w:r>
+        <w:br/>
+      </w:r>
+      <w:r>
+        <w:rPr>
+          <w:rFonts w:ascii="Consolas" w:hAnsi="Consolas"/>
+          <w:color w:val="9CE3F0"/>
+          <w:sz w:val="18"/>
+        </w:rPr>
+        <w:t>/plan  Neuer Endpoint /api/search: Volltext-Query, Filter, Paginierung; Tests zuerst. Quelle: research.md</w:t>
+      </w:r>
+      <w:r>
+        <w:br/>
+      </w:r>
+      <w:r>
+        <w:rPr>
+          <w:rFonts w:ascii="Consolas" w:hAnsi="Consolas"/>
+          <w:color w:val="9CE3F0"/>
+          <w:sz w:val="18"/>
+        </w:rPr>
+        <w:t>/clear</w:t>
+      </w:r>
+      <w:r>
+        <w:br/>
+      </w:r>
+      <w:r>
+        <w:rPr>
+          <w:rFonts w:ascii="Consolas" w:hAnsi="Consolas"/>
+          <w:color w:val="9CE3F0"/>
+          <w:sz w:val="18"/>
+        </w:rPr>
+        <w:t># Phase 3 — Implement (TDD: erst RED, dann GREEN)</w:t>
+      </w:r>
+      <w:r>
+        <w:br/>
+      </w:r>
+      <w:r>
+        <w:rPr>
+          <w:rFonts w:ascii="Consolas" w:hAnsi="Consolas"/>
+          <w:color w:val="9CE3F0"/>
+          <w:sz w:val="18"/>
+        </w:rPr>
+        <w:t>/feature-dev  Setze plan.md um — Tests zuerst</w:t>
+      </w:r>
+      <w:r>
+        <w:br/>
+      </w:r>
+      <w:r>
+        <w:rPr>
+          <w:rFonts w:ascii="Consolas" w:hAnsi="Consolas"/>
+          <w:color w:val="9CE3F0"/>
+          <w:sz w:val="18"/>
+        </w:rPr>
+        <w:t># Phase 4 — Review</w:t>
+      </w:r>
+      <w:r>
+        <w:br/>
+      </w:r>
+      <w:r>
+        <w:rPr>
+          <w:rFonts w:ascii="Consolas" w:hAnsi="Consolas"/>
+          <w:color w:val="9CE3F0"/>
+          <w:sz w:val="18"/>
+        </w:rPr>
+        <w:t>/code-review                 # + /python-review bzw. /&lt;sprache&gt;-review fuer die geaenderten Dateien</w:t>
+      </w:r>
+      <w:r>
+        <w:br/>
+      </w:r>
+      <w:r>
+        <w:rPr>
+          <w:rFonts w:ascii="Consolas" w:hAnsi="Consolas"/>
+          <w:color w:val="9CE3F0"/>
+          <w:sz w:val="18"/>
+        </w:rPr>
+        <w:t># Phase 5 — Verify</w:t>
+      </w:r>
+      <w:r>
+        <w:br/>
+      </w:r>
+      <w:r>
+        <w:rPr>
+          <w:rFonts w:ascii="Consolas" w:hAnsi="Consolas"/>
+          <w:color w:val="9CE3F0"/>
+          <w:sz w:val="18"/>
+        </w:rPr>
+        <w:t>/build-fix                   # nur falls Build/Tests rot — sonst committen</w:t>
+      </w:r>
+      <w:r>
+        <w:br/>
+      </w:r>
+      <w:r>
+        <w:rPr>
+          <w:rFonts w:ascii="Consolas" w:hAnsi="Consolas"/>
+          <w:color w:val="9CE3F0"/>
+          <w:sz w:val="18"/>
+        </w:rPr>
+        <w:t>/save-session                # Stand sichern (fuer morgen)</w:t>
+      </w:r>
+    </w:p>
+    <w:p>
+      <w:pPr>
+        <w:spacing w:before="120" w:after="120"/>
+        <w:ind w:left="120"/>
+        <w:shd w:val="clear" w:color="auto" w:fill="EEF2FF"/>
+      </w:pPr>
+      <w:r>
+        <w:rPr>
+          <w:b/>
+          <w:color w:val="1E1B4B"/>
+          <w:sz w:val="20"/>
+        </w:rPr>
+        <w:t xml:space="preserve">Die eine Regel:  </w:t>
+      </w:r>
+      <w:r>
+        <w:rPr>
+          <w:color w:val="1F2937"/>
+          <w:sz w:val="20"/>
+        </w:rPr>
+        <w:t>„In Dateien speichern, nicht im Kopf behalten.“ research.md → plan.md → review.md. Jede Phase: ein Input, ein Output. Phasen nicht überspringen, /clear dazwischen.</w:t>
+      </w:r>
+    </w:p>
+    <w:p>
+      <w:pPr>
+        <w:spacing w:after="40"/>
+      </w:pPr>
+      <w:r>
+        <w:rPr>
+          <w:rFonts w:ascii="Calibri" w:hAnsi="Calibri"/>
+          <w:b/>
+          <w:i w:val="0"/>
+          <w:color w:val="312E81"/>
+          <w:sz w:val="21"/>
+        </w:rPr>
+        <w:t>c) Der tägliche Rhythmus</w:t>
+      </w:r>
+    </w:p>
+    <w:tbl>
+      <w:tblPr>
+        <w:tblStyle w:val="TableGrid"/>
+        <w:tblW w:type="auto" w:w="0"/>
+        <w:jc w:val="center"/>
+        <w:tblLook w:firstColumn="1" w:firstRow="1" w:lastColumn="0" w:lastRow="0" w:noHBand="0" w:noVBand="1" w:val="04A0"/>
+      </w:tblPr>
+      <w:tblGrid>
+        <w:gridCol w:w="3312"/>
+        <w:gridCol w:w="3312"/>
+        <w:gridCol w:w="3312"/>
+      </w:tblGrid>
+      <w:tr>
+        <w:tc>
+          <w:tcPr>
+            <w:tcW w:type="dxa" w:w="2160"/>
+            <w:shd w:val="clear" w:color="auto" w:fill="312E81"/>
+          </w:tcPr>
+          <w:p>
+            <w:pPr>
+              <w:spacing w:after="40" w:before="40"/>
+            </w:pPr>
+            <w:r/>
+            <w:r>
+              <w:rPr>
+                <w:rFonts w:ascii="Calibri" w:hAnsi="Calibri"/>
+                <w:b/>
+                <w:color w:val="FFFFFF"/>
+                <w:sz w:val="19"/>
+              </w:rPr>
+              <w:t>Wann</w:t>
+            </w:r>
+          </w:p>
+        </w:tc>
+        <w:tc>
+          <w:tcPr>
+            <w:tcW w:type="dxa" w:w="4896"/>
+            <w:shd w:val="clear" w:color="auto" w:fill="312E81"/>
+          </w:tcPr>
+          <w:p>
+            <w:pPr>
+              <w:spacing w:after="40" w:before="40"/>
+            </w:pPr>
+            <w:r/>
+            <w:r>
+              <w:rPr>
+                <w:rFonts w:ascii="Calibri" w:hAnsi="Calibri"/>
+                <w:b/>
+                <w:color w:val="FFFFFF"/>
+                <w:sz w:val="19"/>
+              </w:rPr>
+              <w:t>Was du tust</w:t>
+            </w:r>
+          </w:p>
+        </w:tc>
+        <w:tc>
+          <w:tcPr>
+            <w:tcW w:type="dxa" w:w="2736"/>
+            <w:shd w:val="clear" w:color="auto" w:fill="312E81"/>
+          </w:tcPr>
+          <w:p>
+            <w:pPr>
+              <w:spacing w:after="40" w:before="40"/>
+            </w:pPr>
+            <w:r/>
+            <w:r>
+              <w:rPr>
+                <w:rFonts w:ascii="Calibri" w:hAnsi="Calibri"/>
+                <w:b/>
+                <w:color w:val="FFFFFF"/>
+                <w:sz w:val="19"/>
+              </w:rPr>
+              <w:t>Warum</w:t>
+            </w:r>
+          </w:p>
+        </w:tc>
+      </w:tr>
+      <w:tr>
+        <w:tc>
+          <w:tcPr>
+            <w:tcW w:type="dxa" w:w="2160"/>
+            <w:shd w:val="clear" w:color="auto" w:fill="F3F4F6"/>
+          </w:tcPr>
+          <w:p>
+            <w:pPr>
+              <w:spacing w:after="40" w:before="40"/>
+            </w:pPr>
+            <w:r/>
+            <w:r>
+              <w:rPr>
+                <w:rFonts w:ascii="Calibri" w:hAnsi="Calibri"/>
+                <w:b w:val="0"/>
+                <w:color w:val="1F2937"/>
+                <w:sz w:val="19"/>
+              </w:rPr>
+              <w:t>Session-Start</w:t>
+            </w:r>
+          </w:p>
+        </w:tc>
+        <w:tc>
+          <w:tcPr>
+            <w:tcW w:type="dxa" w:w="4896"/>
+            <w:shd w:val="clear" w:color="auto" w:fill="F3F4F6"/>
+          </w:tcPr>
+          <w:p>
+            <w:pPr>
+              <w:spacing w:after="40" w:before="40"/>
+            </w:pPr>
+            <w:r/>
+            <w:r>
+              <w:rPr>
+                <w:rFonts w:ascii="Calibri" w:hAnsi="Calibri"/>
+                <w:b w:val="0"/>
+                <w:color w:val="1F2937"/>
+                <w:sz w:val="19"/>
+              </w:rPr>
+              <w:t>claude-mem injiziert Kontext automatisch (ab 2. Session) · rtk gain</w:t>
+            </w:r>
+          </w:p>
+        </w:tc>
+        <w:tc>
+          <w:tcPr>
+            <w:tcW w:type="dxa" w:w="2736"/>
+            <w:shd w:val="clear" w:color="auto" w:fill="F3F4F6"/>
+          </w:tcPr>
+          <w:p>
+            <w:pPr>
+              <w:spacing w:after="40" w:before="40"/>
+            </w:pPr>
+            <w:r/>
+            <w:r>
+              <w:rPr>
+                <w:rFonts w:ascii="Calibri" w:hAnsi="Calibri"/>
+                <w:b w:val="0"/>
+                <w:color w:val="1F2937"/>
+                <w:sz w:val="19"/>
+              </w:rPr>
+              <w:t>nahtlos weiter, wo du warst</w:t>
+            </w:r>
+          </w:p>
+        </w:tc>
+      </w:tr>
+      <w:tr>
+        <w:tc>
+          <w:tcPr>
+            <w:tcW w:type="dxa" w:w="2160"/>
+          </w:tcPr>
+          <w:p>
+            <w:pPr>
+              <w:spacing w:after="40" w:before="40"/>
+            </w:pPr>
+            <w:r/>
+            <w:r>
+              <w:rPr>
+                <w:rFonts w:ascii="Calibri" w:hAnsi="Calibri"/>
+                <w:b w:val="0"/>
+                <w:color w:val="1F2937"/>
+                <w:sz w:val="19"/>
+              </w:rPr>
+              <w:t>Vor großer Aufgabe</w:t>
+            </w:r>
+          </w:p>
+        </w:tc>
+        <w:tc>
+          <w:tcPr>
+            <w:tcW w:type="dxa" w:w="4896"/>
+          </w:tcPr>
+          <w:p>
+            <w:pPr>
+              <w:spacing w:after="40" w:before="40"/>
+            </w:pPr>
+            <w:r/>
+            <w:r>
+              <w:rPr>
+                <w:rFonts w:ascii="Calibri" w:hAnsi="Calibri"/>
+                <w:b w:val="0"/>
+                <w:color w:val="1F2937"/>
+                <w:sz w:val="19"/>
+              </w:rPr>
+              <w:t>/resume-session · /mem-search „schon gelöst?“</w:t>
+            </w:r>
+          </w:p>
+        </w:tc>
+        <w:tc>
+          <w:tcPr>
+            <w:tcW w:type="dxa" w:w="2736"/>
+          </w:tcPr>
+          <w:p>
+            <w:pPr>
+              <w:spacing w:after="40" w:before="40"/>
+            </w:pPr>
+            <w:r/>
+            <w:r>
+              <w:rPr>
+                <w:rFonts w:ascii="Calibri" w:hAnsi="Calibri"/>
+                <w:b w:val="0"/>
+                <w:color w:val="1F2937"/>
+                <w:sz w:val="19"/>
+              </w:rPr>
+              <w:t>Alt-Wissen nutzen statt neu lösen</w:t>
+            </w:r>
+          </w:p>
+        </w:tc>
+      </w:tr>
+      <w:tr>
+        <w:tc>
+          <w:tcPr>
+            <w:tcW w:type="dxa" w:w="2160"/>
+            <w:shd w:val="clear" w:color="auto" w:fill="F3F4F6"/>
+          </w:tcPr>
+          <w:p>
+            <w:pPr>
+              <w:spacing w:after="40" w:before="40"/>
+            </w:pPr>
+            <w:r/>
+            <w:r>
+              <w:rPr>
+                <w:rFonts w:ascii="Calibri" w:hAnsi="Calibri"/>
+                <w:b w:val="0"/>
+                <w:color w:val="1F2937"/>
+                <w:sz w:val="19"/>
+              </w:rPr>
+              <w:t>Während</w:t>
+            </w:r>
+          </w:p>
+        </w:tc>
+        <w:tc>
+          <w:tcPr>
+            <w:tcW w:type="dxa" w:w="4896"/>
+            <w:shd w:val="clear" w:color="auto" w:fill="F3F4F6"/>
+          </w:tcPr>
+          <w:p>
+            <w:pPr>
+              <w:spacing w:after="40" w:before="40"/>
+            </w:pPr>
+            <w:r/>
+            <w:r>
+              <w:rPr>
+                <w:rFonts w:ascii="Calibri" w:hAnsi="Calibri"/>
+                <w:b w:val="0"/>
+                <w:color w:val="1F2937"/>
+                <w:sz w:val="19"/>
+              </w:rPr>
+              <w:t>in Phasen arbeiten · /clear zwischen Phasen · /checkpoint</w:t>
+            </w:r>
+          </w:p>
+        </w:tc>
+        <w:tc>
+          <w:tcPr>
+            <w:tcW w:type="dxa" w:w="2736"/>
+            <w:shd w:val="clear" w:color="auto" w:fill="F3F4F6"/>
+          </w:tcPr>
+          <w:p>
+            <w:pPr>
+              <w:spacing w:after="40" w:before="40"/>
+            </w:pPr>
+            <w:r/>
+            <w:r>
+              <w:rPr>
+                <w:rFonts w:ascii="Calibri" w:hAnsi="Calibri"/>
+                <w:b w:val="0"/>
+                <w:color w:val="1F2937"/>
+                <w:sz w:val="19"/>
+              </w:rPr>
+              <w:t>Kontext schlank, billiges Modell</w:t>
+            </w:r>
+          </w:p>
+        </w:tc>
+      </w:tr>
+      <w:tr>
+        <w:tc>
+          <w:tcPr>
+            <w:tcW w:type="dxa" w:w="2160"/>
+          </w:tcPr>
+          <w:p>
+            <w:pPr>
+              <w:spacing w:after="40" w:before="40"/>
+            </w:pPr>
+            <w:r/>
+            <w:r>
+              <w:rPr>
+                <w:rFonts w:ascii="Calibri" w:hAnsi="Calibri"/>
+                <w:b w:val="0"/>
+                <w:color w:val="1F2937"/>
+                <w:sz w:val="19"/>
+              </w:rPr>
+              <w:t>Nebenfrage</w:t>
+            </w:r>
+          </w:p>
+        </w:tc>
+        <w:tc>
+          <w:tcPr>
+            <w:tcW w:type="dxa" w:w="4896"/>
+          </w:tcPr>
+          <w:p>
+            <w:pPr>
+              <w:spacing w:after="40" w:before="40"/>
+            </w:pPr>
+            <w:r/>
+            <w:r>
+              <w:rPr>
+                <w:rFonts w:ascii="Calibri" w:hAnsi="Calibri"/>
+                <w:b w:val="0"/>
+                <w:color w:val="1F2937"/>
+                <w:sz w:val="19"/>
+              </w:rPr>
+              <w:t>/aside  (oder /fork)</w:t>
+            </w:r>
+          </w:p>
+        </w:tc>
+        <w:tc>
+          <w:tcPr>
+            <w:tcW w:type="dxa" w:w="2736"/>
+          </w:tcPr>
+          <w:p>
+            <w:pPr>
+              <w:spacing w:after="40" w:before="40"/>
+            </w:pPr>
+            <w:r/>
+            <w:r>
+              <w:rPr>
+                <w:rFonts w:ascii="Calibri" w:hAnsi="Calibri"/>
+                <w:b w:val="0"/>
+                <w:color w:val="1F2937"/>
+                <w:sz w:val="19"/>
+              </w:rPr>
+              <w:t>Haupt-Task-Kontext nicht verlieren</w:t>
+            </w:r>
+          </w:p>
+        </w:tc>
+      </w:tr>
+      <w:tr>
+        <w:tc>
+          <w:tcPr>
+            <w:tcW w:type="dxa" w:w="2160"/>
+            <w:shd w:val="clear" w:color="auto" w:fill="F3F4F6"/>
+          </w:tcPr>
+          <w:p>
+            <w:pPr>
+              <w:spacing w:after="40" w:before="40"/>
+            </w:pPr>
+            <w:r/>
+            <w:r>
+              <w:rPr>
+                <w:rFonts w:ascii="Calibri" w:hAnsi="Calibri"/>
+                <w:b w:val="0"/>
+                <w:color w:val="1F2937"/>
+                <w:sz w:val="19"/>
+              </w:rPr>
+              <w:t>Session-Ende</w:t>
+            </w:r>
+          </w:p>
+        </w:tc>
+        <w:tc>
+          <w:tcPr>
+            <w:tcW w:type="dxa" w:w="4896"/>
+            <w:shd w:val="clear" w:color="auto" w:fill="F3F4F6"/>
+          </w:tcPr>
+          <w:p>
+            <w:pPr>
+              <w:spacing w:after="40" w:before="40"/>
+            </w:pPr>
+            <w:r/>
+            <w:r>
+              <w:rPr>
+                <w:rFonts w:ascii="Calibri" w:hAnsi="Calibri"/>
+                <w:b w:val="0"/>
+                <w:color w:val="1F2937"/>
+                <w:sz w:val="19"/>
+              </w:rPr>
+              <w:t>/learn-eval → /evolve → /promote · /save-session</w:t>
+            </w:r>
+          </w:p>
+        </w:tc>
+        <w:tc>
+          <w:tcPr>
+            <w:tcW w:type="dxa" w:w="2736"/>
+            <w:shd w:val="clear" w:color="auto" w:fill="F3F4F6"/>
+          </w:tcPr>
+          <w:p>
+            <w:pPr>
+              <w:spacing w:after="40" w:before="40"/>
+            </w:pPr>
+            <w:r/>
+            <w:r>
+              <w:rPr>
+                <w:rFonts w:ascii="Calibri" w:hAnsi="Calibri"/>
+                <w:b w:val="0"/>
+                <w:color w:val="1F2937"/>
+                <w:sz w:val="19"/>
+              </w:rPr>
+              <w:t>ECC lernt — morgen schneller</w:t>
+            </w:r>
+          </w:p>
+        </w:tc>
+      </w:tr>
+    </w:tbl>
+    <w:p>
+      <w:pPr>
+        <w:spacing w:before="120" w:after="120"/>
+        <w:ind w:left="120"/>
+        <w:shd w:val="clear" w:color="auto" w:fill="EEF2FF"/>
+      </w:pPr>
+      <w:r>
+        <w:rPr>
+          <w:b/>
+          <w:color w:val="1E1B4B"/>
+          <w:sz w:val="20"/>
+        </w:rPr>
+        <w:t xml:space="preserve">Der Loop, der ECC ausmacht:  </w:t>
+      </w:r>
+      <w:r>
+        <w:rPr>
+          <w:color w:val="1F2937"/>
+          <w:sz w:val="20"/>
+        </w:rPr>
+        <w:t>Was du zum 3. Mal tippst → /skill-create. Bewährte Muster → /promote (global). So wirst du mit jeder Session schneller — genau das trennt ECC von „nur Configs“.</w:t>
+      </w:r>
+    </w:p>
+    <w:p>
+      <w:pPr>
+        <w:pStyle w:val="Heading1"/>
+        <w:spacing w:before="320" w:after="80"/>
+        <w:pBdr>
+          <w:bottom w:val="single" w:sz="18" w:space="2" w:color="06B6D4"/>
+        </w:pBdr>
+      </w:pPr>
+      <w:r>
+        <w:t>8 · Cheat-Sheet — wann welcher Command</w:t>
       </w:r>
     </w:p>
     <w:tbl>
@@ -4271,7 +5724,7 @@
         </w:pBdr>
       </w:pPr>
       <w:r>
-        <w:t>8 · Wann welcher MCP</w:t>
+        <w:t>9 · Wann welcher MCP</w:t>
       </w:r>
     </w:p>
     <w:p>
@@ -5194,7 +6647,7 @@
           <w:color w:val="1F2937"/>
           <w:sz w:val="20"/>
         </w:rPr>
-        <w:t>Der „memory“-MCP (Wissensgraph) ist NICHT installiert und nicht nötig — claude-mem ist deine primäre Memory-Quelle (§10). EINE Quelle pro Projekt, sonst doppelte Wahrheit.</w:t>
+        <w:t>Der „memory“-MCP (Wissensgraph) ist NICHT installiert und nicht nötig — claude-mem ist deine primäre Memory-Quelle (§11). EINE Quelle pro Projekt, sonst doppelte Wahrheit.</w:t>
       </w:r>
     </w:p>
     <w:p>
@@ -5206,7 +6659,7 @@
         </w:pBdr>
       </w:pPr>
       <w:r>
-        <w:t>9 · Token-Ökonomie &amp; Modellstrategie</w:t>
+        <w:t>10 · Token-Ökonomie &amp; Modellstrategie</w:t>
       </w:r>
     </w:p>
     <w:p>
@@ -5945,7 +7398,7 @@
         </w:pBdr>
       </w:pPr>
       <w:r>
-        <w:t>10 · Memory &amp; Sessions</w:t>
+        <w:t>11 · Memory &amp; Sessions</w:t>
       </w:r>
     </w:p>
     <w:p>
@@ -6359,7 +7812,7 @@
         </w:pBdr>
       </w:pPr>
       <w:r>
-        <w:t>11 · Continuous Learning (Self-Improvement)</w:t>
+        <w:t>12 · Continuous Learning (Self-Improvement)</w:t>
       </w:r>
     </w:p>
     <w:p>
@@ -6715,7 +8168,7 @@
         </w:pBdr>
       </w:pPr>
       <w:r>
-        <w:t>12 · Parallelisierung</w:t>
+        <w:t>13 · Parallelisierung</w:t>
       </w:r>
     </w:p>
     <w:p>
@@ -6837,7 +8290,7 @@
         </w:pBdr>
       </w:pPr>
       <w:r>
-        <w:t>13 · Security im Alltag + VPS-Hinweise</w:t>
+        <w:t>14 · Security im Alltag + VPS-Hinweise</w:t>
       </w:r>
     </w:p>
     <w:p>
@@ -7042,7 +8495,7 @@
         </w:pBdr>
       </w:pPr>
       <w:r>
-        <w:t>14 · ECC-CLIs &amp; Wartung</w:t>
+        <w:t>15 · ECC-CLIs &amp; Wartung</w:t>
       </w:r>
     </w:p>
     <w:p>
@@ -7150,7 +8603,7 @@
         </w:pBdr>
       </w:pPr>
       <w:r>
-        <w:t>15 · Quellen &amp; TL;DR</w:t>
+        <w:t>16 · Quellen &amp; TL;DR</w:t>
       </w:r>
     </w:p>
     <w:p>

</xml_diff>

<commit_message>
docs: Hybrid-Mega-Workflow + Begleit-Guide-Kapitel (Schritt 4)
- docs/MEGA-WORKFLOW.de.md: Speicherorte, Sync-Loop (PRE/POST),
  RPI+ECC-Orchestrierung, neu vs. bestehend, Recovery, Spickzettel
- build_guide.py: Kapitel "16 - Hybrid-Mega-Workflow" (docx) + eine
  pptx-Slide (Denominator 18 -> 19); Quellen-Kapitel auf 17/19 verschoben
- Office-Dateien (.docx/.pptx) neu gebaut

Co-Authored-By: Claude Opus 4.8 (1M context) <noreply@anthropic.com>
</commit_message>
<xml_diff>
--- a/docs/ECC-Harness-Guide.de.docx
+++ b/docs/ECC-Harness-Guide.de.docx
@@ -8603,7 +8603,824 @@
         </w:pBdr>
       </w:pPr>
       <w:r>
-        <w:t>16 · Quellen &amp; TL;DR</w:t>
+        <w:t>16 · Hybrid-Mega-Workflow — State-Sync + RPI-Berater</w:t>
+      </w:r>
+    </w:p>
+    <w:p>
+      <w:pPr>
+        <w:spacing w:after="40"/>
+      </w:pPr>
+      <w:r>
+        <w:rPr>
+          <w:rFonts w:ascii="Calibri" w:hAnsi="Calibri"/>
+          <w:b w:val="0"/>
+          <w:i w:val="0"/>
+          <w:color w:val="1F2937"/>
+          <w:sz w:val="21"/>
+        </w:rPr>
+        <w:t>Der BestPractice-Wrapper koppelt persistenten Projekt-State an ECCs Loop und stellt /mega-plan als Planungs-Vorstufe bereit — rein additiv. Der ECC-Core (ecc/) bleibt unverändert.</w:t>
+      </w:r>
+    </w:p>
+    <w:p>
+      <w:pPr>
+        <w:spacing w:after="40"/>
+      </w:pPr>
+      <w:r>
+        <w:rPr>
+          <w:rFonts w:ascii="Calibri" w:hAnsi="Calibri"/>
+          <w:b/>
+          <w:i w:val="0"/>
+          <w:color w:val="312E81"/>
+          <w:sz w:val="21"/>
+        </w:rPr>
+        <w:t>a) Wo wird was gespeichert</w:t>
+      </w:r>
+    </w:p>
+    <w:tbl>
+      <w:tblPr>
+        <w:tblStyle w:val="TableGrid"/>
+        <w:tblW w:type="auto" w:w="0"/>
+        <w:jc w:val="center"/>
+        <w:tblLook w:firstColumn="1" w:firstRow="1" w:lastColumn="0" w:lastRow="0" w:noHBand="0" w:noVBand="1" w:val="04A0"/>
+      </w:tblPr>
+      <w:tblGrid>
+        <w:gridCol w:w="3312"/>
+        <w:gridCol w:w="3312"/>
+        <w:gridCol w:w="3312"/>
+      </w:tblGrid>
+      <w:tr>
+        <w:tc>
+          <w:tcPr>
+            <w:tcW w:type="dxa" w:w="2448"/>
+            <w:shd w:val="clear" w:color="auto" w:fill="312E81"/>
+          </w:tcPr>
+          <w:p>
+            <w:pPr>
+              <w:spacing w:after="40" w:before="40"/>
+            </w:pPr>
+            <w:r/>
+            <w:r>
+              <w:rPr>
+                <w:rFonts w:ascii="Calibri" w:hAnsi="Calibri"/>
+                <w:b/>
+                <w:color w:val="FFFFFF"/>
+                <w:sz w:val="19"/>
+              </w:rPr>
+              <w:t>Artefakt</w:t>
+            </w:r>
+          </w:p>
+        </w:tc>
+        <w:tc>
+          <w:tcPr>
+            <w:tcW w:type="dxa" w:w="4896"/>
+            <w:shd w:val="clear" w:color="auto" w:fill="312E81"/>
+          </w:tcPr>
+          <w:p>
+            <w:pPr>
+              <w:spacing w:after="40" w:before="40"/>
+            </w:pPr>
+            <w:r/>
+            <w:r>
+              <w:rPr>
+                <w:rFonts w:ascii="Calibri" w:hAnsi="Calibri"/>
+                <w:b/>
+                <w:color w:val="FFFFFF"/>
+                <w:sz w:val="19"/>
+              </w:rPr>
+              <w:t>Ort</w:t>
+            </w:r>
+          </w:p>
+        </w:tc>
+        <w:tc>
+          <w:tcPr>
+            <w:tcW w:type="dxa" w:w="2448"/>
+            <w:shd w:val="clear" w:color="auto" w:fill="312E81"/>
+          </w:tcPr>
+          <w:p>
+            <w:pPr>
+              <w:spacing w:after="40" w:before="40"/>
+            </w:pPr>
+            <w:r/>
+            <w:r>
+              <w:rPr>
+                <w:rFonts w:ascii="Calibri" w:hAnsi="Calibri"/>
+                <w:b/>
+                <w:color w:val="FFFFFF"/>
+                <w:sz w:val="19"/>
+              </w:rPr>
+              <w:t>Wahrheit?</w:t>
+            </w:r>
+          </w:p>
+        </w:tc>
+      </w:tr>
+      <w:tr>
+        <w:tc>
+          <w:tcPr>
+            <w:tcW w:type="dxa" w:w="2448"/>
+            <w:shd w:val="clear" w:color="auto" w:fill="F3F4F6"/>
+          </w:tcPr>
+          <w:p>
+            <w:pPr>
+              <w:spacing w:after="40" w:before="40"/>
+            </w:pPr>
+            <w:r/>
+            <w:r>
+              <w:rPr>
+                <w:rFonts w:ascii="Calibri" w:hAnsi="Calibri"/>
+                <w:b w:val="0"/>
+                <w:color w:val="1F2937"/>
+                <w:sz w:val="19"/>
+              </w:rPr>
+              <w:t>State (4 Dateien)</w:t>
+            </w:r>
+          </w:p>
+        </w:tc>
+        <w:tc>
+          <w:tcPr>
+            <w:tcW w:type="dxa" w:w="4896"/>
+            <w:shd w:val="clear" w:color="auto" w:fill="F3F4F6"/>
+          </w:tcPr>
+          <w:p>
+            <w:pPr>
+              <w:spacing w:after="40" w:before="40"/>
+            </w:pPr>
+            <w:r/>
+            <w:r>
+              <w:rPr>
+                <w:rFonts w:ascii="Calibri" w:hAnsi="Calibri"/>
+                <w:b w:val="0"/>
+                <w:color w:val="1F2937"/>
+                <w:sz w:val="19"/>
+              </w:rPr>
+              <w:t>state/{context,decisions,tasks,progress}.md</w:t>
+            </w:r>
+          </w:p>
+        </w:tc>
+        <w:tc>
+          <w:tcPr>
+            <w:tcW w:type="dxa" w:w="2448"/>
+            <w:shd w:val="clear" w:color="auto" w:fill="F3F4F6"/>
+          </w:tcPr>
+          <w:p>
+            <w:pPr>
+              <w:spacing w:after="40" w:before="40"/>
+            </w:pPr>
+            <w:r/>
+            <w:r>
+              <w:rPr>
+                <w:rFonts w:ascii="Calibri" w:hAnsi="Calibri"/>
+                <w:b w:val="0"/>
+                <w:color w:val="1F2937"/>
+                <w:sz w:val="19"/>
+              </w:rPr>
+              <w:t>JA — vom Menschen</w:t>
+            </w:r>
+          </w:p>
+        </w:tc>
+      </w:tr>
+      <w:tr>
+        <w:tc>
+          <w:tcPr>
+            <w:tcW w:type="dxa" w:w="2448"/>
+          </w:tcPr>
+          <w:p>
+            <w:pPr>
+              <w:spacing w:after="40" w:before="40"/>
+            </w:pPr>
+            <w:r/>
+            <w:r>
+              <w:rPr>
+                <w:rFonts w:ascii="Calibri" w:hAnsi="Calibri"/>
+                <w:b w:val="0"/>
+                <w:color w:val="1F2937"/>
+                <w:sz w:val="19"/>
+              </w:rPr>
+              <w:t>Loop-Futter</w:t>
+            </w:r>
+          </w:p>
+        </w:tc>
+        <w:tc>
+          <w:tcPr>
+            <w:tcW w:type="dxa" w:w="4896"/>
+          </w:tcPr>
+          <w:p>
+            <w:pPr>
+              <w:spacing w:after="40" w:before="40"/>
+            </w:pPr>
+            <w:r/>
+            <w:r>
+              <w:rPr>
+                <w:rFonts w:ascii="Calibri" w:hAnsi="Calibri"/>
+                <w:b w:val="0"/>
+                <w:color w:val="1F2937"/>
+                <w:sz w:val="19"/>
+              </w:rPr>
+              <w:t>&lt;root&gt;/WORKING-CONTEXT.md (generiert)</w:t>
+            </w:r>
+          </w:p>
+        </w:tc>
+        <w:tc>
+          <w:tcPr>
+            <w:tcW w:type="dxa" w:w="2448"/>
+          </w:tcPr>
+          <w:p>
+            <w:pPr>
+              <w:spacing w:after="40" w:before="40"/>
+            </w:pPr>
+            <w:r/>
+            <w:r>
+              <w:rPr>
+                <w:rFonts w:ascii="Calibri" w:hAnsi="Calibri"/>
+                <w:b w:val="0"/>
+                <w:color w:val="1F2937"/>
+                <w:sz w:val="19"/>
+              </w:rPr>
+              <w:t>Nein — aus state/</w:t>
+            </w:r>
+          </w:p>
+        </w:tc>
+      </w:tr>
+      <w:tr>
+        <w:tc>
+          <w:tcPr>
+            <w:tcW w:type="dxa" w:w="2448"/>
+            <w:shd w:val="clear" w:color="auto" w:fill="F3F4F6"/>
+          </w:tcPr>
+          <w:p>
+            <w:pPr>
+              <w:spacing w:after="40" w:before="40"/>
+            </w:pPr>
+            <w:r/>
+            <w:r>
+              <w:rPr>
+                <w:rFonts w:ascii="Calibri" w:hAnsi="Calibri"/>
+                <w:b w:val="0"/>
+                <w:color w:val="1F2937"/>
+                <w:sz w:val="19"/>
+              </w:rPr>
+              <w:t>Sync-Snapshot</w:t>
+            </w:r>
+          </w:p>
+        </w:tc>
+        <w:tc>
+          <w:tcPr>
+            <w:tcW w:type="dxa" w:w="4896"/>
+            <w:shd w:val="clear" w:color="auto" w:fill="F3F4F6"/>
+          </w:tcPr>
+          <w:p>
+            <w:pPr>
+              <w:spacing w:after="40" w:before="40"/>
+            </w:pPr>
+            <w:r/>
+            <w:r>
+              <w:rPr>
+                <w:rFonts w:ascii="Calibri" w:hAnsi="Calibri"/>
+                <w:b w:val="0"/>
+                <w:color w:val="1F2937"/>
+                <w:sz w:val="19"/>
+              </w:rPr>
+              <w:t>state/.sync/last-working-context.md</w:t>
+            </w:r>
+          </w:p>
+        </w:tc>
+        <w:tc>
+          <w:tcPr>
+            <w:tcW w:type="dxa" w:w="2448"/>
+            <w:shd w:val="clear" w:color="auto" w:fill="F3F4F6"/>
+          </w:tcPr>
+          <w:p>
+            <w:pPr>
+              <w:spacing w:after="40" w:before="40"/>
+            </w:pPr>
+            <w:r/>
+            <w:r>
+              <w:rPr>
+                <w:rFonts w:ascii="Calibri" w:hAnsi="Calibri"/>
+                <w:b w:val="0"/>
+                <w:color w:val="1F2937"/>
+                <w:sz w:val="19"/>
+              </w:rPr>
+              <w:t>Nein — gitignored</w:t>
+            </w:r>
+          </w:p>
+        </w:tc>
+      </w:tr>
+      <w:tr>
+        <w:tc>
+          <w:tcPr>
+            <w:tcW w:type="dxa" w:w="2448"/>
+          </w:tcPr>
+          <w:p>
+            <w:pPr>
+              <w:spacing w:after="40" w:before="40"/>
+            </w:pPr>
+            <w:r/>
+            <w:r>
+              <w:rPr>
+                <w:rFonts w:ascii="Calibri" w:hAnsi="Calibri"/>
+                <w:b w:val="0"/>
+                <w:color w:val="1F2937"/>
+                <w:sz w:val="19"/>
+              </w:rPr>
+              <w:t>Karpathy (global)</w:t>
+            </w:r>
+          </w:p>
+        </w:tc>
+        <w:tc>
+          <w:tcPr>
+            <w:tcW w:type="dxa" w:w="4896"/>
+          </w:tcPr>
+          <w:p>
+            <w:pPr>
+              <w:spacing w:after="40" w:before="40"/>
+            </w:pPr>
+            <w:r/>
+            <w:r>
+              <w:rPr>
+                <w:rFonts w:ascii="Calibri" w:hAnsi="Calibri"/>
+                <w:b w:val="0"/>
+                <w:color w:val="1F2937"/>
+                <w:sz w:val="19"/>
+              </w:rPr>
+              <w:t>~/.claude/rules/ecc-extras/ + @-Import</w:t>
+            </w:r>
+          </w:p>
+        </w:tc>
+        <w:tc>
+          <w:tcPr>
+            <w:tcW w:type="dxa" w:w="2448"/>
+          </w:tcPr>
+          <w:p>
+            <w:pPr>
+              <w:spacing w:after="40" w:before="40"/>
+            </w:pPr>
+            <w:r/>
+            <w:r>
+              <w:rPr>
+                <w:rFonts w:ascii="Calibri" w:hAnsi="Calibri"/>
+                <w:b w:val="0"/>
+                <w:color w:val="1F2937"/>
+                <w:sz w:val="19"/>
+              </w:rPr>
+              <w:t>JA — einmalig</w:t>
+            </w:r>
+          </w:p>
+        </w:tc>
+      </w:tr>
+    </w:tbl>
+    <w:p>
+      <w:pPr>
+        <w:spacing w:before="120" w:after="120"/>
+        <w:ind w:left="120"/>
+        <w:shd w:val="clear" w:color="auto" w:fill="EEF2FF"/>
+      </w:pPr>
+      <w:r>
+        <w:rPr>
+          <w:b/>
+          <w:color w:val="1E1B4B"/>
+          <w:sz w:val="20"/>
+        </w:rPr>
+        <w:t xml:space="preserve">Merksatz:  </w:t>
+      </w:r>
+      <w:r>
+        <w:rPr>
+          <w:color w:val="1F2937"/>
+          <w:sz w:val="20"/>
+        </w:rPr>
+        <w:t>state/ ist die Wahrheit. WORKING-CONTEXT.md ist nur ihr generiertes Spiegelbild für den Loop — nie von Hand pflegen, immer state/ editieren.</w:t>
+      </w:r>
+    </w:p>
+    <w:p>
+      <w:pPr>
+        <w:spacing w:after="40"/>
+      </w:pPr>
+      <w:r>
+        <w:rPr>
+          <w:rFonts w:ascii="Calibri" w:hAnsi="Calibri"/>
+          <w:b/>
+          <w:i w:val="0"/>
+          <w:color w:val="312E81"/>
+          <w:sz w:val="21"/>
+        </w:rPr>
+        <w:t>b) Der Sync-Loop (PRE/POST, via Lifecycle-Hooks)</w:t>
+      </w:r>
+    </w:p>
+    <w:p>
+      <w:pPr>
+        <w:spacing w:before="80" w:after="160"/>
+        <w:ind w:left="80"/>
+        <w:shd w:val="clear" w:color="auto" w:fill="1E1B2E"/>
+      </w:pPr>
+      <w:r>
+        <w:rPr>
+          <w:rFonts w:ascii="Consolas" w:hAnsi="Consolas"/>
+          <w:color w:val="9CE3F0"/>
+          <w:sz w:val="18"/>
+        </w:rPr>
+        <w:t>state/*.md  --PRE (SessionStart)--&gt;  WORKING-CONTEXT.md   (Loop liest STATE:*, fuellt SYNC:*)</w:t>
+      </w:r>
+      <w:r>
+        <w:br/>
+      </w:r>
+      <w:r>
+        <w:rPr>
+          <w:rFonts w:ascii="Consolas" w:hAnsi="Consolas"/>
+          <w:color w:val="9CE3F0"/>
+          <w:sz w:val="18"/>
+        </w:rPr>
+        <w:t>WORKING-CONTEXT.md  --POST (Stop/PreCompact)--&gt;  state/progress.md + tasks.md   (nur Delta)</w:t>
+      </w:r>
+    </w:p>
+    <w:p>
+      <w:pPr>
+        <w:pStyle w:val="ListBullet"/>
+        <w:spacing w:after="40"/>
+      </w:pPr>
+      <w:r>
+        <w:rPr>
+          <w:b/>
+          <w:color w:val="1E1B4B"/>
+          <w:sz w:val="21"/>
+        </w:rPr>
+        <w:t xml:space="preserve">PRE: </w:t>
+      </w:r>
+      <w:r>
+        <w:rPr>
+          <w:color w:val="1F2937"/>
+          <w:sz w:val="21"/>
+        </w:rPr>
+        <w:t>generiert WORKING-CONTEXT.md aus state/; STATE:*-Blöcke gespiegelt, SYNC:*-Eingabezonen bleiben erhalten.</w:t>
+      </w:r>
+    </w:p>
+    <w:p>
+      <w:pPr>
+        <w:pStyle w:val="ListBullet"/>
+        <w:spacing w:after="40"/>
+      </w:pPr>
+      <w:r>
+        <w:rPr>
+          <w:b/>
+          <w:color w:val="1E1B4B"/>
+          <w:sz w:val="21"/>
+        </w:rPr>
+        <w:t xml:space="preserve">POST: </w:t>
+      </w:r>
+      <w:r>
+        <w:rPr>
+          <w:color w:val="1F2937"/>
+          <w:sz w:val="21"/>
+        </w:rPr>
+        <w:t>liest nur die SYNC:*-Zonen, bildet das Delta gegen den Snapshot, hängt neue Zeilen verlustfrei an state/ an.</w:t>
+      </w:r>
+    </w:p>
+    <w:p>
+      <w:pPr>
+        <w:pStyle w:val="ListBullet"/>
+        <w:spacing w:after="40"/>
+      </w:pPr>
+      <w:r>
+        <w:rPr>
+          <w:b/>
+          <w:color w:val="1E1B4B"/>
+          <w:sz w:val="21"/>
+        </w:rPr>
+        <w:t xml:space="preserve">Garantien: </w:t>
+      </w:r>
+      <w:r>
+        <w:rPr>
+          <w:color w:val="1F2937"/>
+          <w:sz w:val="21"/>
+        </w:rPr>
+        <w:t>Marker (kein Clobbering) · atomar · idempotent · No-op- &amp; ECC-Guard · Exit 0. Test: selftest.js (7 Checks).</w:t>
+      </w:r>
+    </w:p>
+    <w:p>
+      <w:pPr>
+        <w:spacing w:after="40"/>
+      </w:pPr>
+      <w:r>
+        <w:rPr>
+          <w:rFonts w:ascii="Calibri" w:hAnsi="Calibri"/>
+          <w:b/>
+          <w:i w:val="0"/>
+          <w:color w:val="312E81"/>
+          <w:sz w:val="21"/>
+        </w:rPr>
+        <w:t>c) /mega-plan — RPI-Berater parallel vor /plan</w:t>
+      </w:r>
+    </w:p>
+    <w:p>
+      <w:pPr>
+        <w:spacing w:after="40"/>
+      </w:pPr>
+      <w:r>
+        <w:rPr>
+          <w:rFonts w:ascii="Calibri" w:hAnsi="Calibri"/>
+          <w:b w:val="0"/>
+          <w:i w:val="0"/>
+          <w:color w:val="1F2937"/>
+          <w:sz w:val="21"/>
+        </w:rPr>
+        <w:t>Für vage/vielschichtige Ziele: holt mehrere read-only Experten-Perspektiven parallel ein, verdichtet sie zu einem Briefing und übergibt an ECCs /plan (führend).</w:t>
+      </w:r>
+    </w:p>
+    <w:tbl>
+      <w:tblPr>
+        <w:tblStyle w:val="TableGrid"/>
+        <w:tblW w:type="auto" w:w="0"/>
+        <w:jc w:val="center"/>
+        <w:tblLook w:firstColumn="1" w:firstRow="1" w:lastColumn="0" w:lastRow="0" w:noHBand="0" w:noVBand="1" w:val="04A0"/>
+      </w:tblPr>
+      <w:tblGrid>
+        <w:gridCol w:w="4968"/>
+        <w:gridCol w:w="4968"/>
+      </w:tblGrid>
+      <w:tr>
+        <w:tc>
+          <w:tcPr>
+            <w:tcW w:type="dxa" w:w="3744"/>
+            <w:shd w:val="clear" w:color="auto" w:fill="312E81"/>
+          </w:tcPr>
+          <w:p>
+            <w:pPr>
+              <w:spacing w:after="40" w:before="40"/>
+            </w:pPr>
+            <w:r/>
+            <w:r>
+              <w:rPr>
+                <w:rFonts w:ascii="Calibri" w:hAnsi="Calibri"/>
+                <w:b/>
+                <w:color w:val="FFFFFF"/>
+                <w:sz w:val="19"/>
+              </w:rPr>
+              <w:t>Berater</w:t>
+            </w:r>
+          </w:p>
+        </w:tc>
+        <w:tc>
+          <w:tcPr>
+            <w:tcW w:type="dxa" w:w="6624"/>
+            <w:shd w:val="clear" w:color="auto" w:fill="312E81"/>
+          </w:tcPr>
+          <w:p>
+            <w:pPr>
+              <w:spacing w:after="40" w:before="40"/>
+            </w:pPr>
+            <w:r/>
+            <w:r>
+              <w:rPr>
+                <w:rFonts w:ascii="Calibri" w:hAnsi="Calibri"/>
+                <w:b/>
+                <w:color w:val="FFFFFF"/>
+                <w:sz w:val="19"/>
+              </w:rPr>
+              <w:t>Perspektive</w:t>
+            </w:r>
+          </w:p>
+        </w:tc>
+      </w:tr>
+      <w:tr>
+        <w:tc>
+          <w:tcPr>
+            <w:tcW w:type="dxa" w:w="3744"/>
+            <w:shd w:val="clear" w:color="auto" w:fill="F3F4F6"/>
+          </w:tcPr>
+          <w:p>
+            <w:pPr>
+              <w:spacing w:after="40" w:before="40"/>
+            </w:pPr>
+            <w:r/>
+            <w:r>
+              <w:rPr>
+                <w:rFonts w:ascii="Calibri" w:hAnsi="Calibri"/>
+                <w:b w:val="0"/>
+                <w:color w:val="1F2937"/>
+                <w:sz w:val="19"/>
+              </w:rPr>
+              <w:t>Intake (requirement-parser)</w:t>
+            </w:r>
+          </w:p>
+        </w:tc>
+        <w:tc>
+          <w:tcPr>
+            <w:tcW w:type="dxa" w:w="6624"/>
+            <w:shd w:val="clear" w:color="auto" w:fill="F3F4F6"/>
+          </w:tcPr>
+          <w:p>
+            <w:pPr>
+              <w:spacing w:after="40" w:before="40"/>
+            </w:pPr>
+            <w:r/>
+            <w:r>
+              <w:rPr>
+                <w:rFonts w:ascii="Calibri" w:hAnsi="Calibri"/>
+                <w:b w:val="0"/>
+                <w:color w:val="1F2937"/>
+                <w:sz w:val="19"/>
+              </w:rPr>
+              <w:t>Anforderungen, Constraints, offene Fragen</w:t>
+            </w:r>
+          </w:p>
+        </w:tc>
+      </w:tr>
+      <w:tr>
+        <w:tc>
+          <w:tcPr>
+            <w:tcW w:type="dxa" w:w="3744"/>
+          </w:tcPr>
+          <w:p>
+            <w:pPr>
+              <w:spacing w:after="40" w:before="40"/>
+            </w:pPr>
+            <w:r/>
+            <w:r>
+              <w:rPr>
+                <w:rFonts w:ascii="Calibri" w:hAnsi="Calibri"/>
+                <w:b w:val="0"/>
+                <w:color w:val="1F2937"/>
+                <w:sz w:val="19"/>
+              </w:rPr>
+              <w:t>CTO</w:t>
+            </w:r>
+          </w:p>
+        </w:tc>
+        <w:tc>
+          <w:tcPr>
+            <w:tcW w:type="dxa" w:w="6624"/>
+          </w:tcPr>
+          <w:p>
+            <w:pPr>
+              <w:spacing w:after="40" w:before="40"/>
+            </w:pPr>
+            <w:r/>
+            <w:r>
+              <w:rPr>
+                <w:rFonts w:ascii="Calibri" w:hAnsi="Calibri"/>
+                <w:b w:val="0"/>
+                <w:color w:val="1F2937"/>
+                <w:sz w:val="19"/>
+              </w:rPr>
+              <w:t>Technik-Strategie, Architektur-Fit, Risiko</w:t>
+            </w:r>
+          </w:p>
+        </w:tc>
+      </w:tr>
+      <w:tr>
+        <w:tc>
+          <w:tcPr>
+            <w:tcW w:type="dxa" w:w="3744"/>
+            <w:shd w:val="clear" w:color="auto" w:fill="F3F4F6"/>
+          </w:tcPr>
+          <w:p>
+            <w:pPr>
+              <w:spacing w:after="40" w:before="40"/>
+            </w:pPr>
+            <w:r/>
+            <w:r>
+              <w:rPr>
+                <w:rFonts w:ascii="Calibri" w:hAnsi="Calibri"/>
+                <w:b w:val="0"/>
+                <w:color w:val="1F2937"/>
+                <w:sz w:val="19"/>
+              </w:rPr>
+              <w:t>Product</w:t>
+            </w:r>
+          </w:p>
+        </w:tc>
+        <w:tc>
+          <w:tcPr>
+            <w:tcW w:type="dxa" w:w="6624"/>
+            <w:shd w:val="clear" w:color="auto" w:fill="F3F4F6"/>
+          </w:tcPr>
+          <w:p>
+            <w:pPr>
+              <w:spacing w:after="40" w:before="40"/>
+            </w:pPr>
+            <w:r/>
+            <w:r>
+              <w:rPr>
+                <w:rFonts w:ascii="Calibri" w:hAnsi="Calibri"/>
+                <w:b w:val="0"/>
+                <w:color w:val="1F2937"/>
+                <w:sz w:val="19"/>
+              </w:rPr>
+              <w:t>Scope, Requirements, Akzeptanzkriterien</w:t>
+            </w:r>
+          </w:p>
+        </w:tc>
+      </w:tr>
+      <w:tr>
+        <w:tc>
+          <w:tcPr>
+            <w:tcW w:type="dxa" w:w="3744"/>
+          </w:tcPr>
+          <w:p>
+            <w:pPr>
+              <w:spacing w:after="40" w:before="40"/>
+            </w:pPr>
+            <w:r/>
+            <w:r>
+              <w:rPr>
+                <w:rFonts w:ascii="Calibri" w:hAnsi="Calibri"/>
+                <w:b w:val="0"/>
+                <w:color w:val="1F2937"/>
+                <w:sz w:val="19"/>
+              </w:rPr>
+              <w:t>UX</w:t>
+            </w:r>
+          </w:p>
+        </w:tc>
+        <w:tc>
+          <w:tcPr>
+            <w:tcW w:type="dxa" w:w="6624"/>
+          </w:tcPr>
+          <w:p>
+            <w:pPr>
+              <w:spacing w:after="40" w:before="40"/>
+            </w:pPr>
+            <w:r/>
+            <w:r>
+              <w:rPr>
+                <w:rFonts w:ascii="Calibri" w:hAnsi="Calibri"/>
+                <w:b w:val="0"/>
+                <w:color w:val="1F2937"/>
+                <w:sz w:val="19"/>
+              </w:rPr>
+              <w:t>Flows, States, Accessibility</w:t>
+            </w:r>
+          </w:p>
+        </w:tc>
+      </w:tr>
+    </w:tbl>
+    <w:p>
+      <w:pPr>
+        <w:spacing w:before="80" w:after="160"/>
+        <w:ind w:left="80"/>
+        <w:shd w:val="clear" w:color="auto" w:fill="1E1B2E"/>
+      </w:pPr>
+      <w:r>
+        <w:rPr>
+          <w:rFonts w:ascii="Consolas" w:hAnsi="Consolas"/>
+          <w:color w:val="9CE3F0"/>
+          <w:sz w:val="18"/>
+        </w:rPr>
+        <w:t>/mega-plan  &lt;Ziel in einem Satz&gt;      # Berater parallel -&gt; Briefing -&gt; /plan</w:t>
+      </w:r>
+      <w:r>
+        <w:br/>
+      </w:r>
+      <w:r>
+        <w:rPr>
+          <w:rFonts w:ascii="Consolas" w:hAnsi="Consolas"/>
+          <w:color w:val="9CE3F0"/>
+          <w:sz w:val="18"/>
+        </w:rPr>
+        <w:t>/plan                                  # ECC, wartet auf dein OK</w:t>
+      </w:r>
+      <w:r>
+        <w:br/>
+      </w:r>
+      <w:r>
+        <w:rPr>
+          <w:rFonts w:ascii="Consolas" w:hAnsi="Consolas"/>
+          <w:color w:val="9CE3F0"/>
+          <w:sz w:val="18"/>
+        </w:rPr>
+        <w:t>/feature-dev -&gt; /code-review -&gt; Verify # normaler ECC-5-Phasen-Flow</w:t>
+      </w:r>
+    </w:p>
+    <w:p>
+      <w:pPr>
+        <w:spacing w:before="120" w:after="120"/>
+        <w:ind w:left="120"/>
+        <w:shd w:val="clear" w:color="auto" w:fill="EEF2FF"/>
+      </w:pPr>
+      <w:r>
+        <w:rPr>
+          <w:b/>
+          <w:color w:val="1E1B4B"/>
+          <w:sz w:val="20"/>
+        </w:rPr>
+        <w:t xml:space="preserve">ECC-Core unberührt:  </w:t>
+      </w:r>
+      <w:r>
+        <w:rPr>
+          <w:color w:val="1F2937"/>
+          <w:sz w:val="20"/>
+        </w:rPr>
+        <w:t>Alles liegt in bestpractice-extras/. git diff zeigt keine Änderung unter ecc/. Tiefe Doku: docs/MEGA-WORKFLOW.de.md.</w:t>
+      </w:r>
+    </w:p>
+    <w:p>
+      <w:pPr>
+        <w:pStyle w:val="Heading1"/>
+        <w:spacing w:before="320" w:after="80"/>
+        <w:pBdr>
+          <w:bottom w:val="single" w:sz="18" w:space="2" w:color="06B6D4"/>
+        </w:pBdr>
+      </w:pPr>
+      <w:r>
+        <w:t>17 · Quellen &amp; TL;DR</w:t>
       </w:r>
     </w:p>
     <w:p>

</xml_diff>

<commit_message>
feat(harness): Guides-Alignment — Hooks aktiv, Modell-Matrix, onboard-Fix
- CLAUDE.md: von Projektbeschreibung zu Arbeitsvertrag (Workflow, Verbote,
  Modell-Matrix, Pflicht-Commands, Hook-Status) nach @affaanmustafa-Guides
- ecc-onboard.md: Bug-Fix — install-plan.js übergibt kein projectRoot,
  Dry-Run muss install-apply.js --dry-run nutzen (sonst Install ins ECC-Repo)
- Word-Doku: 5 neue Kapitel (14a Hooks aktiv, 14b Modell-Matrix,
  14c mgrep/SeqThinking, 14d CLAUDE.md-Pattern, 14e onboard-Bug)

Verifiziert: console-warn/quality-gate/SessionStart/Stop-Hooks feuern live,
targetRoot zeigt aufs Zielprojekt, Audit 39/39.

Co-Authored-By: Claude Opus 4.8 (1M context) <noreply@anthropic.com>
</commit_message>
<xml_diff>
--- a/docs/ECC-Harness-Guide.de.docx
+++ b/docs/ECC-Harness-Guide.de.docx
@@ -9615,6 +9615,775 @@
         <w:t>Bei Unsicherheit: /ecc-guide, ecc doctor, die drei Original-Guides.</w:t>
       </w:r>
     </w:p>
+    <w:p>
+      <w:r>
+        <w:br w:type="page"/>
+      </w:r>
+    </w:p>
+    <w:p>
+      <w:pPr>
+        <w:pStyle w:val="Heading1"/>
+      </w:pPr>
+      <w:r>
+        <w:t>14a · Hooks — Jetzt aktiv (Stand Juni 2026)</w:t>
+      </w:r>
+    </w:p>
+    <w:p>
+      <w:r>
+        <w:rPr>
+          <w:b/>
+        </w:rPr>
+        <w:t xml:space="preserve">Wichtige Korrektur: </w:t>
+      </w:r>
+      <w:r>
+        <w:t>Die ECC hooks.json enthält 20+ Hooks, aber das ECC plugin.json registriert keine Hooks automatisch. Alle Hooks (PostToolUse, Stop, SessionStart, PreCompact) waren tot — bis sie manuell in settings.json aktiviert wurden.</w:t>
+      </w:r>
+    </w:p>
+    <w:p>
+      <w:pPr>
+        <w:pStyle w:val="Heading2"/>
+      </w:pPr>
+      <w:r>
+        <w:t>Jetzt aktive Hooks in ~/.claude/settings.json:</w:t>
+      </w:r>
+    </w:p>
+    <w:tbl>
+      <w:tblPr>
+        <w:tblStyle w:val="TableGrid"/>
+        <w:tblW w:type="auto" w:w="0"/>
+        <w:tblLook w:firstColumn="1" w:firstRow="1" w:lastColumn="0" w:lastRow="0" w:noHBand="0" w:noVBand="1" w:val="04A0"/>
+      </w:tblPr>
+      <w:tblGrid>
+        <w:gridCol w:w="3312"/>
+        <w:gridCol w:w="3312"/>
+        <w:gridCol w:w="3312"/>
+      </w:tblGrid>
+      <w:tr>
+        <w:tc>
+          <w:tcPr>
+            <w:tcW w:type="dxa" w:w="3312"/>
+          </w:tcPr>
+          <w:p>
+            <w:r>
+              <w:rPr>
+                <w:b/>
+              </w:rPr>
+              <w:t>Hook-Typ</w:t>
+            </w:r>
+          </w:p>
+        </w:tc>
+        <w:tc>
+          <w:tcPr>
+            <w:tcW w:type="dxa" w:w="3312"/>
+          </w:tcPr>
+          <w:p>
+            <w:r>
+              <w:rPr>
+                <w:b/>
+              </w:rPr>
+              <w:t>IDs</w:t>
+            </w:r>
+          </w:p>
+        </w:tc>
+        <w:tc>
+          <w:tcPr>
+            <w:tcW w:type="dxa" w:w="3312"/>
+          </w:tcPr>
+          <w:p>
+            <w:r>
+              <w:rPr>
+                <w:b/>
+              </w:rPr>
+              <w:t>Zweck</w:t>
+            </w:r>
+          </w:p>
+        </w:tc>
+      </w:tr>
+      <w:tr>
+        <w:tc>
+          <w:tcPr>
+            <w:tcW w:type="dxa" w:w="3312"/>
+          </w:tcPr>
+          <w:p>
+            <w:r>
+              <w:t>PostToolUse</w:t>
+            </w:r>
+          </w:p>
+        </w:tc>
+        <w:tc>
+          <w:tcPr>
+            <w:tcW w:type="dxa" w:w="3312"/>
+          </w:tcPr>
+          <w:p>
+            <w:r>
+              <w:t>post:quality-gate</w:t>
+              <w:br/>
+              <w:t>post:edit:accumulator</w:t>
+              <w:br/>
+              <w:t>post:edit:console-warn</w:t>
+            </w:r>
+          </w:p>
+        </w:tc>
+        <w:tc>
+          <w:tcPr>
+            <w:tcW w:type="dxa" w:w="3312"/>
+          </w:tcPr>
+          <w:p>
+            <w:r>
+              <w:t>Quality Gate nach Edit/Write · console.log warnen</w:t>
+            </w:r>
+          </w:p>
+        </w:tc>
+      </w:tr>
+      <w:tr>
+        <w:tc>
+          <w:tcPr>
+            <w:tcW w:type="dxa" w:w="3312"/>
+          </w:tcPr>
+          <w:p>
+            <w:r>
+              <w:t>Stop</w:t>
+            </w:r>
+          </w:p>
+        </w:tc>
+        <w:tc>
+          <w:tcPr>
+            <w:tcW w:type="dxa" w:w="3312"/>
+          </w:tcPr>
+          <w:p>
+            <w:r>
+              <w:t>stop:format-typecheck</w:t>
+              <w:br/>
+              <w:t>stop:check-console-log</w:t>
+              <w:br/>
+              <w:t>stop:session-end</w:t>
+            </w:r>
+          </w:p>
+        </w:tc>
+        <w:tc>
+          <w:tcPr>
+            <w:tcW w:type="dxa" w:w="3312"/>
+          </w:tcPr>
+          <w:p>
+            <w:r>
+              <w:t>Format+Typecheck · console.log prüfen · Session sichern</w:t>
+            </w:r>
+          </w:p>
+        </w:tc>
+      </w:tr>
+      <w:tr>
+        <w:tc>
+          <w:tcPr>
+            <w:tcW w:type="dxa" w:w="3312"/>
+          </w:tcPr>
+          <w:p>
+            <w:r>
+              <w:t>SessionStart</w:t>
+            </w:r>
+          </w:p>
+        </w:tc>
+        <w:tc>
+          <w:tcPr>
+            <w:tcW w:type="dxa" w:w="3312"/>
+          </w:tcPr>
+          <w:p>
+            <w:r>
+              <w:t>session:start</w:t>
+            </w:r>
+          </w:p>
+        </w:tc>
+        <w:tc>
+          <w:tcPr>
+            <w:tcW w:type="dxa" w:w="3312"/>
+          </w:tcPr>
+          <w:p>
+            <w:r>
+              <w:t>Vorigen Kontext laden beim Start</w:t>
+            </w:r>
+          </w:p>
+        </w:tc>
+      </w:tr>
+      <w:tr>
+        <w:tc>
+          <w:tcPr>
+            <w:tcW w:type="dxa" w:w="3312"/>
+          </w:tcPr>
+          <w:p>
+            <w:r>
+              <w:t>PreCompact</w:t>
+            </w:r>
+          </w:p>
+        </w:tc>
+        <w:tc>
+          <w:tcPr>
+            <w:tcW w:type="dxa" w:w="3312"/>
+          </w:tcPr>
+          <w:p>
+            <w:r>
+              <w:t>pre:compact</w:t>
+            </w:r>
+          </w:p>
+        </w:tc>
+        <w:tc>
+          <w:tcPr>
+            <w:tcW w:type="dxa" w:w="3312"/>
+          </w:tcPr>
+          <w:p>
+            <w:r>
+              <w:t>State sichern vor Kontext-Kompaktierung</w:t>
+            </w:r>
+          </w:p>
+        </w:tc>
+      </w:tr>
+    </w:tbl>
+    <w:p/>
+    <w:p>
+      <w:r>
+        <w:rPr>
+          <w:b/>
+        </w:rPr>
+        <w:t xml:space="preserve">Aktivierung: </w:t>
+      </w:r>
+      <w:r>
+        <w:t>Die Hooks aus der ECC hooks.json müssen direkt (per Python-Skript) in ~/.claude/settings.json eingetragen werden — install-apply.js macht das NICHT automatisch.</w:t>
+      </w:r>
+    </w:p>
+    <w:p>
+      <w:r>
+        <w:br w:type="page"/>
+      </w:r>
+    </w:p>
+    <w:p>
+      <w:pPr>
+        <w:pStyle w:val="Heading1"/>
+      </w:pPr>
+      <w:r>
+        <w:t>14b · Modell-Matrix — Billigstes ausreichendes Modell</w:t>
+      </w:r>
+    </w:p>
+    <w:p>
+      <w:r>
+        <w:rPr>
+          <w:b w:val="0"/>
+        </w:rPr>
+        <w:t xml:space="preserve">Aus den Guides von @affaanmustafa </w:t>
+      </w:r>
+      <w:r>
+        <w:rPr>
+          <w:b/>
+        </w:rPr>
+        <w:t>(Shorthand + Longform)</w:t>
+      </w:r>
+      <w:r>
+        <w:t>: Nicht jede Aufgabe braucht Opus. Die richtige Wahl spart 60–90% Kosten.</w:t>
+      </w:r>
+    </w:p>
+    <w:p>
+      <w:pPr>
+        <w:pStyle w:val="Heading2"/>
+      </w:pPr>
+      <w:r>
+        <w:t>Aufgaben-Modell-Tabelle (Guide-Standard):</w:t>
+      </w:r>
+    </w:p>
+    <w:tbl>
+      <w:tblPr>
+        <w:tblStyle w:val="TableGrid"/>
+        <w:tblW w:type="auto" w:w="0"/>
+        <w:tblLook w:firstColumn="1" w:firstRow="1" w:lastColumn="0" w:lastRow="0" w:noHBand="0" w:noVBand="1" w:val="04A0"/>
+      </w:tblPr>
+      <w:tblGrid>
+        <w:gridCol w:w="3312"/>
+        <w:gridCol w:w="3312"/>
+        <w:gridCol w:w="3312"/>
+      </w:tblGrid>
+      <w:tr>
+        <w:tc>
+          <w:tcPr>
+            <w:tcW w:type="dxa" w:w="3312"/>
+          </w:tcPr>
+          <w:p>
+            <w:r>
+              <w:rPr>
+                <w:b/>
+              </w:rPr>
+              <w:t>Aufgabe</w:t>
+            </w:r>
+          </w:p>
+        </w:tc>
+        <w:tc>
+          <w:tcPr>
+            <w:tcW w:type="dxa" w:w="3312"/>
+          </w:tcPr>
+          <w:p>
+            <w:r>
+              <w:rPr>
+                <w:b/>
+              </w:rPr>
+              <w:t>Modell</w:t>
+            </w:r>
+          </w:p>
+        </w:tc>
+        <w:tc>
+          <w:tcPr>
+            <w:tcW w:type="dxa" w:w="3312"/>
+          </w:tcPr>
+          <w:p>
+            <w:r>
+              <w:rPr>
+                <w:b/>
+              </w:rPr>
+              <w:t>Warum</w:t>
+            </w:r>
+          </w:p>
+        </w:tc>
+      </w:tr>
+      <w:tr>
+        <w:tc>
+          <w:tcPr>
+            <w:tcW w:type="dxa" w:w="3312"/>
+          </w:tcPr>
+          <w:p>
+            <w:r>
+              <w:t>Exploration, Suche, einfache Edits, Doku schreiben</w:t>
+            </w:r>
+          </w:p>
+        </w:tc>
+        <w:tc>
+          <w:tcPr>
+            <w:tcW w:type="dxa" w:w="3312"/>
+          </w:tcPr>
+          <w:p>
+            <w:r>
+              <w:t>Haiku 4.5</w:t>
+            </w:r>
+          </w:p>
+        </w:tc>
+        <w:tc>
+          <w:tcPr>
+            <w:tcW w:type="dxa" w:w="3312"/>
+          </w:tcPr>
+          <w:p>
+            <w:r>
+              <w:t>Schnell, günstig, ausreichend</w:t>
+            </w:r>
+          </w:p>
+        </w:tc>
+      </w:tr>
+      <w:tr>
+        <w:tc>
+          <w:tcPr>
+            <w:tcW w:type="dxa" w:w="3312"/>
+          </w:tcPr>
+          <w:p>
+            <w:r>
+              <w:t>Standard-Coding, Multi-File, PR-Review</w:t>
+            </w:r>
+          </w:p>
+        </w:tc>
+        <w:tc>
+          <w:tcPr>
+            <w:tcW w:type="dxa" w:w="3312"/>
+          </w:tcPr>
+          <w:p>
+            <w:r>
+              <w:t>Sonnet 4.6</w:t>
+            </w:r>
+          </w:p>
+        </w:tc>
+        <w:tc>
+          <w:tcPr>
+            <w:tcW w:type="dxa" w:w="3312"/>
+          </w:tcPr>
+          <w:p>
+            <w:r>
+              <w:t>Bestes Balance-Modell (Default 90%)</w:t>
+            </w:r>
+          </w:p>
+        </w:tc>
+      </w:tr>
+      <w:tr>
+        <w:tc>
+          <w:tcPr>
+            <w:tcW w:type="dxa" w:w="3312"/>
+          </w:tcPr>
+          <w:p>
+            <w:r>
+              <w:t>Komplexe Architektur, Security-Analyse</w:t>
+            </w:r>
+          </w:p>
+        </w:tc>
+        <w:tc>
+          <w:tcPr>
+            <w:tcW w:type="dxa" w:w="3312"/>
+          </w:tcPr>
+          <w:p>
+            <w:r>
+              <w:t>Opus 4.8</w:t>
+            </w:r>
+          </w:p>
+        </w:tc>
+        <w:tc>
+          <w:tcPr>
+            <w:tcW w:type="dxa" w:w="3312"/>
+          </w:tcPr>
+          <w:p>
+            <w:r>
+              <w:t>Tiefes Reasoning, darf nichts übersehen</w:t>
+            </w:r>
+          </w:p>
+        </w:tc>
+      </w:tr>
+      <w:tr>
+        <w:tc>
+          <w:tcPr>
+            <w:tcW w:type="dxa" w:w="3312"/>
+          </w:tcPr>
+          <w:p>
+            <w:r>
+              <w:t>Hartnäckige Bugs (5+ Dateien, 1. Versuch scheiterte)</w:t>
+            </w:r>
+          </w:p>
+        </w:tc>
+        <w:tc>
+          <w:tcPr>
+            <w:tcW w:type="dxa" w:w="3312"/>
+          </w:tcPr>
+          <w:p>
+            <w:r>
+              <w:t>Opus 4.8</w:t>
+            </w:r>
+          </w:p>
+        </w:tc>
+        <w:tc>
+          <w:tcPr>
+            <w:tcW w:type="dxa" w:w="3312"/>
+          </w:tcPr>
+          <w:p>
+            <w:r>
+              <w:t>Ganzes System im Kopf halten</w:t>
+            </w:r>
+          </w:p>
+        </w:tc>
+      </w:tr>
+      <w:tr>
+        <w:tc>
+          <w:tcPr>
+            <w:tcW w:type="dxa" w:w="3312"/>
+          </w:tcPr>
+          <w:p>
+            <w:r>
+              <w:t>Worker in Multi-Agent-Setup</w:t>
+            </w:r>
+          </w:p>
+        </w:tc>
+        <w:tc>
+          <w:tcPr>
+            <w:tcW w:type="dxa" w:w="3312"/>
+          </w:tcPr>
+          <w:p>
+            <w:r>
+              <w:t>Haiku 4.5</w:t>
+            </w:r>
+          </w:p>
+        </w:tc>
+        <w:tc>
+          <w:tcPr>
+            <w:tcW w:type="dxa" w:w="3312"/>
+          </w:tcPr>
+          <w:p>
+            <w:r>
+              <w:t>Viele günstige Parallel-Agents</w:t>
+            </w:r>
+          </w:p>
+        </w:tc>
+      </w:tr>
+    </w:tbl>
+    <w:p/>
+    <w:p>
+      <w:r>
+        <w:rPr>
+          <w:b/>
+        </w:rPr>
+        <w:t xml:space="preserve">Agenten-Zuweisungen: </w:t>
+      </w:r>
+      <w:r>
+        <w:t>security-reviewer → Opus (darf nichts übersehen). architect, planner → Opus. code-reviewer, tdd-guide, build-error-resolver → Sonnet. doc-updater, code-tour → Haiku.</w:t>
+      </w:r>
+    </w:p>
+    <w:p/>
+    <w:p>
+      <w:r>
+        <w:rPr>
+          <w:b/>
+        </w:rPr>
+        <w:t xml:space="preserve">Upgrade auf Opus wenn: </w:t>
+      </w:r>
+      <w:r>
+        <w:t>Erster Versuch scheiterte · Aufgabe umfasst 5+ Dateien · Architekturentscheidung · Security-kritischer Code.</w:t>
+      </w:r>
+    </w:p>
+    <w:p>
+      <w:r>
+        <w:br w:type="page"/>
+      </w:r>
+    </w:p>
+    <w:p>
+      <w:pPr>
+        <w:pStyle w:val="Heading1"/>
+      </w:pPr>
+      <w:r>
+        <w:t>14c · mgrep + Sequential Thinking — Noch ausstehend</w:t>
+      </w:r>
+    </w:p>
+    <w:p>
+      <w:pPr>
+        <w:pStyle w:val="Heading2"/>
+      </w:pPr>
+      <w:r>
+        <w:t>mgrep (Token-Optimierung ~50%)</w:t>
+      </w:r>
+    </w:p>
+    <w:p>
+      <w:r>
+        <w:rPr>
+          <w:b/>
+        </w:rPr>
+        <w:t xml:space="preserve">Status: NICHT installiert. </w:t>
+      </w:r>
+      <w:r>
+        <w:t>Das ECC-Plugin-System listet mgrep, aber es ist nicht im PATH verfügbar.</w:t>
+      </w:r>
+    </w:p>
+    <w:p>
+      <w:r>
+        <w:t>Installation (im Claude Code Terminal):</w:t>
+        <w:br/>
+      </w:r>
+    </w:p>
+    <w:p>
+      <w:pPr>
+        <w:pStyle w:val="NoSpacing"/>
+      </w:pPr>
+      <w:r>
+        <w:rPr>
+          <w:rFonts w:ascii="Courier New" w:hAnsi="Courier New"/>
+        </w:rPr>
+        <w:t>claude plugin marketplace add https://github.com/mixedbread-ai/mgrep</w:t>
+      </w:r>
+    </w:p>
+    <w:p>
+      <w:r>
+        <w:rPr>
+          <w:b/>
+        </w:rPr>
+        <w:t xml:space="preserve">Warum wichtig: </w:t>
+      </w:r>
+      <w:r>
+        <w:t>laut @affaanmustafa Benchmark ~2x weniger Tokens als grep/ripgrep bei gleichwertiger Qualität. Einzusetzen für alle Codebase-Suchen.</w:t>
+      </w:r>
+    </w:p>
+    <w:p>
+      <w:pPr>
+        <w:pStyle w:val="Heading2"/>
+      </w:pPr>
+      <w:r>
+        <w:t>Sequential Thinking MCP</w:t>
+      </w:r>
+    </w:p>
+    <w:p>
+      <w:r>
+        <w:rPr>
+          <w:b/>
+        </w:rPr>
+        <w:t xml:space="preserve">Status: Registriert als deferred tool </w:t>
+      </w:r>
+      <w:r>
+        <w:t>(mcp__plugin_ecc_sequential-thinking__sequentialthinking), aber nie proaktiv genutzt.</w:t>
+      </w:r>
+    </w:p>
+    <w:p>
+      <w:r>
+        <w:rPr>
+          <w:b/>
+        </w:rPr>
+        <w:t xml:space="preserve">Einsatz: </w:t>
+      </w:r>
+      <w:r>
+        <w:t>Komplexe Mehrschritt-Probleme, Architektur-Entscheidungen mit vielen Abhängigkeiten, Debugging verschachtelter Systeme. Tool via ToolSearch laden, dann aufrufen.</w:t>
+      </w:r>
+    </w:p>
+    <w:p>
+      <w:pPr>
+        <w:pStyle w:val="Heading1"/>
+      </w:pPr>
+      <w:r>
+        <w:t>14d · CLAUDE.md — Anleitung statt Beschreibung</w:t>
+      </w:r>
+    </w:p>
+    <w:p>
+      <w:r>
+        <w:rPr>
+          <w:b/>
+        </w:rPr>
+        <w:t xml:space="preserve">Erkenntniss aus Test-ECC-Onboarding: </w:t>
+      </w:r>
+      <w:r>
+        <w:t>CLAUDE.md ist KEIN Projektbeschrieb. Es ist der Arbeitsvertrag für Claude: Workflow, Verbote, Commands, Checklisten.</w:t>
+      </w:r>
+    </w:p>
+    <w:p>
+      <w:pPr>
+        <w:pStyle w:val="Heading2"/>
+      </w:pPr>
+      <w:r>
+        <w:t>Was rein muss:</w:t>
+      </w:r>
+    </w:p>
+    <w:p>
+      <w:pPr>
+        <w:pStyle w:val="ListBullet"/>
+      </w:pPr>
+      <w:r>
+        <w:t>Pflicht-Workflow (ECC 5-Phasen)</w:t>
+      </w:r>
+    </w:p>
+    <w:p>
+      <w:pPr>
+        <w:pStyle w:val="ListBullet"/>
+      </w:pPr>
+      <w:r>
+        <w:t>Was Claude NICHT tun darf (explizite Verbote)</w:t>
+      </w:r>
+    </w:p>
+    <w:p>
+      <w:pPr>
+        <w:pStyle w:val="ListBullet"/>
+      </w:pPr>
+      <w:r>
+        <w:t>Modell-Matrix (welches Modell für welche Aufgabe)</w:t>
+      </w:r>
+    </w:p>
+    <w:p>
+      <w:pPr>
+        <w:pStyle w:val="ListBullet"/>
+      </w:pPr>
+      <w:r>
+        <w:t>Build/Test/Lint Commands (konkret, copy-paste-tauglich)</w:t>
+      </w:r>
+    </w:p>
+    <w:p>
+      <w:pPr>
+        <w:pStyle w:val="ListBullet"/>
+      </w:pPr>
+      <w:r>
+        <w:t>Pflicht-Commands pro Situation</w:t>
+      </w:r>
+    </w:p>
+    <w:p>
+      <w:pPr>
+        <w:pStyle w:val="ListBullet"/>
+      </w:pPr>
+      <w:r>
+        <w:t>Token-Budget-Regeln</w:t>
+      </w:r>
+    </w:p>
+    <w:p>
+      <w:pPr>
+        <w:pStyle w:val="ListBullet"/>
+      </w:pPr>
+      <w:r>
+        <w:t>Sicherheits-Checkliste</w:t>
+      </w:r>
+    </w:p>
+    <w:p>
+      <w:pPr>
+        <w:pStyle w:val="ListBullet"/>
+      </w:pPr>
+      <w:r>
+        <w:t>Hook-Status (welche sind aktiv)</w:t>
+      </w:r>
+    </w:p>
+    <w:p>
+      <w:pPr>
+        <w:pStyle w:val="Heading2"/>
+      </w:pPr>
+      <w:r>
+        <w:t>Was NICHT rein soll:</w:t>
+      </w:r>
+    </w:p>
+    <w:p>
+      <w:pPr>
+        <w:pStyle w:val="ListBullet"/>
+      </w:pPr>
+      <w:r>
+        <w:t>Projektbeschreibung (gehört in README oder PROJECT_RULES.md)</w:t>
+      </w:r>
+    </w:p>
+    <w:p>
+      <w:pPr>
+        <w:pStyle w:val="ListBullet"/>
+      </w:pPr>
+      <w:r>
+        <w:t>Architektur-Details (gehört in docs/CODEMAPS/)</w:t>
+      </w:r>
+    </w:p>
+    <w:p>
+      <w:pPr>
+        <w:pStyle w:val="ListBullet"/>
+      </w:pPr>
+      <w:r>
+        <w:t>Generische Platzthalter wie [Stack noch nicht konfiguriert]</w:t>
+      </w:r>
+    </w:p>
+    <w:p>
+      <w:pPr>
+        <w:pStyle w:val="Heading1"/>
+      </w:pPr>
+      <w:r>
+        <w:t>14e · /ecc-onboard Bug — install-plan.js vs install-apply.js</w:t>
+      </w:r>
+    </w:p>
+    <w:p>
+      <w:r>
+        <w:rPr>
+          <w:b/>
+        </w:rPr>
+        <w:t xml:space="preserve">Bug (behoben 2026-06-03): </w:t>
+      </w:r>
+      <w:r>
+        <w:t>install-plan.js übergibt kein projectRoot. Es landet immer im ECC-Repo statt im Zielprojekt (targetRoot zeigte auf .../ecc/.claude statt .../Zielprojekt/.claude).</w:t>
+      </w:r>
+    </w:p>
+    <w:p>
+      <w:r>
+        <w:rPr>
+          <w:b/>
+        </w:rPr>
+        <w:t xml:space="preserve">Fix: </w:t>
+      </w:r>
+      <w:r>
+        <w:t>Für Dry-Run immer install-apply.js --dry-run verwenden:</w:t>
+      </w:r>
+    </w:p>
+    <w:p>
+      <w:pPr>
+        <w:pStyle w:val="NoSpacing"/>
+      </w:pPr>
+      <w:r>
+        <w:rPr>
+          <w:rFonts w:ascii="Courier New" w:hAnsi="Courier New"/>
+          <w:sz w:val="18"/>
+        </w:rPr>
+        <w:t>cd "&lt;ZIELPROJEKT-ROOT&gt;"</w:t>
+        <w:br/>
+        <w:t># FALSCH: node "$ECC_REPO/scripts/install-plan.js" --target claude-project</w:t>
+        <w:br/>
+        <w:t># RICHTIG:</w:t>
+        <w:br/>
+        <w:t>node "$ECC_REPO/scripts/install-apply.js" --target claude-project --profile &lt;profil&gt; --dry-run</w:t>
+      </w:r>
+    </w:p>
     <w:sectPr>
       <w:pgSz w:w="12240" w:h="15840"/>
       <w:pgMar w:top="1008" w:right="1152" w:bottom="1008" w:left="1152" w:header="720" w:footer="720" w:gutter="0"/>

</xml_diff>

<commit_message>
feat(harness): Schicht-2 scharf — State-Sync aktiv, ecc-onboard-Drift behoben, Extras deployed
- Schritt 0: globale ecc-onboard.md auf 13K-Version (State-Sync-Verdrahtung + consumer-scaffold)
- install-vps.sh additiv erweitert: rpi-Advisors, attribution-policy, start.md (-ef-Guard), contexts/
- State-Sync projekt-lokal verdrahtet (Variante A): .claude/settings.json SessionStart/Stop/PreCompact
- Repo onboardet: state/ befuellt + harvest, WORKING-CONTEXT.md generiert
- contexts/{dev,review}.md angelegt (Dynamic-Context-Profile)
- Guides aktualisiert: ECC-ERKLAERBUCH Abschnitt 15, CLAUDE.md Hooks-Liste, docx/pptx Status nachgezogen
- ECC-Core unberuehrt (git status -- ecc/ leer), RTK-Hook intakt

Co-Authored-By: Claude Opus 4.8 (1M context) <noreply@anthropic.com>
</commit_message>
<xml_diff>
--- a/docs/ECC-Harness-Guide.de.docx
+++ b/docs/ECC-Harness-Guide.de.docx
@@ -10384,6 +10384,51 @@
         <w:t>node "$ECC_REPO/scripts/install-apply.js" --target claude-project --profile &lt;profil&gt; --dry-run</w:t>
       </w:r>
     </w:p>
+    <w:p>
+      <w:pPr>
+        <w:pStyle w:val="Heading1"/>
+      </w:pPr>
+      <w:r>
+        <w:t>15. Aktivierungs-Status (Stand 2026-06-05)</w:t>
+      </w:r>
+    </w:p>
+    <w:p>
+      <w:r>
+        <w:t>Das BestPractice-Repo ist onboardet; die Schicht-2-Mechanik ist scharf:</w:t>
+      </w:r>
+    </w:p>
+    <w:p>
+      <w:pPr>
+        <w:pStyle w:val="ListBullet"/>
+      </w:pPr>
+      <w:r>
+        <w:t>State-Sync aktiv (Variante A, projekt-lokal): SessionStart-&gt;pre, Stop/PreCompact-&gt;post; WORKING-CONTEXT.md wird aus state/ gespiegelt; ecc/-Guard unberuehrt.</w:t>
+      </w:r>
+    </w:p>
+    <w:p>
+      <w:pPr>
+        <w:pStyle w:val="ListBullet"/>
+      </w:pPr>
+      <w:r>
+        <w:t>Globale ecc-onboard.md-Drift behoben (6,3K -&gt; 13K, mit State-Sync-Verdrahtung + consumer-scaffold).</w:t>
+      </w:r>
+    </w:p>
+    <w:p>
+      <w:pPr>
+        <w:pStyle w:val="ListBullet"/>
+      </w:pPr>
+      <w:r>
+        <w:t>Extras global gelayert: rpi-Advisors, attribution-policy.md, contexts/dev+review; install-vps.sh deployt das kuenftig automatisch.</w:t>
+      </w:r>
+    </w:p>
+    <w:p>
+      <w:pPr>
+        <w:pStyle w:val="ListBullet"/>
+      </w:pPr>
+      <w:r>
+        <w:t>Unberuehrt: ECC-Core (git status -- ecc/ leer), RTK-Hook (PreToolUse:Bash), globale ECC-Lifecycle-Hooks.</w:t>
+      </w:r>
+    </w:p>
     <w:sectPr>
       <w:pgSz w:w="12240" w:h="15840"/>
       <w:pgMar w:top="1008" w:right="1152" w:bottom="1008" w:left="1152" w:header="720" w:footer="720" w:gutter="0"/>

</xml_diff>

<commit_message>
chore(harness): Arbeitsstand der letzten Tage sichern
Onboard-Skripte (onboard.js/onboard-verify.js), state-sync + Doku
(Erklärbuch, Harness-Guide docx/pptx/md, WO-LAEUFT-WAS), PROJECT_RULES,
ecc-onboard-Command und State-Sync-Hook-Cleanup in settings.json.

Co-Authored-By: Claude Opus 4.8 (1M context) <noreply@anthropic.com>
</commit_message>
<xml_diff>
--- a/docs/ECC-Harness-Guide.de.docx
+++ b/docs/ECC-Harness-Guide.de.docx
@@ -37,7 +37,21 @@
           <w:b w:val="0"/>
           <w:i w:val="0"/>
         </w:rPr>
-        <w:t xml:space="preserve">Global aktiv in </w:t>
+        <w:t xml:space="preserve">ECC 2.0.0-rc.1 als </w:t>
+      </w:r>
+      <w:r>
+        <w:rPr>
+          <w:b/>
+          <w:i w:val="0"/>
+        </w:rPr>
+        <w:t>globales Plugin</w:t>
+      </w:r>
+      <w:r>
+        <w:rPr>
+          <w:b w:val="0"/>
+          <w:i w:val="0"/>
+        </w:rPr>
+        <w:t xml:space="preserve"> </w:t>
       </w:r>
       <w:r>
         <w:rPr>
@@ -46,14 +60,14 @@
           <w:i w:val="0"/>
           <w:sz w:val="20"/>
         </w:rPr>
-        <w:t>~/.claude</w:t>
-      </w:r>
-      <w:r>
-        <w:rPr>
-          <w:b w:val="0"/>
-          <w:i w:val="0"/>
-        </w:rPr>
-        <w:t xml:space="preserve"> · ECC 2.0.0-rc.1 (core, führend) · RTK-sicher.</w:t>
+        <w:t>ecc@ecc</w:t>
+      </w:r>
+      <w:r>
+        <w:rPr>
+          <w:b w:val="0"/>
+          <w:i w:val="0"/>
+        </w:rPr>
+        <w:t xml:space="preserve"> (führend) · Schicht-2-Extras im Repo · RTK-sicher.</w:t>
       </w:r>
     </w:p>
     <w:p>
@@ -65,7 +79,7 @@
           <w:b w:val="0"/>
           <w:i w:val="0"/>
         </w:rPr>
-        <w:t xml:space="preserve">Quelle/Re-Install: </w:t>
+        <w:t xml:space="preserve">Seit der Plugin-only-Migration (2026-06-10): keine vendored </w:t>
       </w:r>
       <w:r>
         <w:rPr>
@@ -74,23 +88,14 @@
           <w:i w:val="0"/>
           <w:sz w:val="20"/>
         </w:rPr>
-        <w:t>/root/projekte/Claude Code BestPractice</w:t>
-      </w:r>
-      <w:r>
-        <w:rPr>
-          <w:b w:val="0"/>
-          <w:i w:val="0"/>
-        </w:rPr>
-        <w:t xml:space="preserve"> → </w:t>
-      </w:r>
-      <w:r>
-        <w:rPr>
-          <w:rFonts w:ascii="Consolas" w:hAnsi="Consolas"/>
-          <w:b w:val="0"/>
-          <w:i w:val="0"/>
-          <w:sz w:val="20"/>
-        </w:rPr>
-        <w:t>./install-vps.sh</w:t>
+        <w:t>ecc/</w:t>
+      </w:r>
+      <w:r>
+        <w:rPr>
+          <w:b w:val="0"/>
+          <w:i w:val="0"/>
+        </w:rPr>
+        <w:t>-Kopie mehr, claude-mem/superpowers deaktiviert.</w:t>
       </w:r>
     </w:p>
     <w:p>
@@ -121,7 +126,7 @@
           <w:b w:val="0"/>
           <w:i/>
         </w:rPr>
-        <w:t>Single Source ist diese Markdown-Datei (`docs/ECC-Harness-Guide.de.md`). Die Word-/PowerPoint-Snapshots werden daraus gebaut: `bestpractice-extras/scripts/build-docs/`. Stand: 2026-06-05.</w:t>
+        <w:t>Single Source ist diese Markdown-Datei (`docs/ECC-Harness-Guide.de.md`). Die Word-/PowerPoint-Snapshots werden daraus gebaut: `bestpractice-extras/scripts/build-docs/`. Stand: 2026-06-10.</w:t>
       </w:r>
     </w:p>
     <w:p>
@@ -184,7 +189,21 @@
           <w:b w:val="0"/>
           <w:i w:val="0"/>
         </w:rPr>
-        <w:t xml:space="preserve"> von Affaan Mustafa — die dominante Engine: 63 Agents, 249 Skills, ~80 Commands, manifest-basierter Installer, Continuous Learning, Security-Scanning. Global installiert (core-Profil): 80 Commands, 63 Agents, 21 ECC-Skills, </w:t>
+        <w:t xml:space="preserve"> von Affaan Mustafa — die dominante Engine: 63 Agents, 249 Skills, ~80 Commands, Continuous Learning, Security-Scanning, 6 mitgebrachte MCP-Server. Läuft als </w:t>
+      </w:r>
+      <w:r>
+        <w:rPr>
+          <w:b/>
+          <w:i w:val="0"/>
+        </w:rPr>
+        <w:t>globales Plugin</w:t>
+      </w:r>
+      <w:r>
+        <w:rPr>
+          <w:b w:val="0"/>
+          <w:i w:val="0"/>
+        </w:rPr>
+        <w:t xml:space="preserve"> </w:t>
       </w:r>
       <w:r>
         <w:rPr>
@@ -193,14 +212,14 @@
           <w:i w:val="0"/>
           <w:sz w:val="19"/>
         </w:rPr>
-        <w:t>rules/ecc</w:t>
-      </w:r>
-      <w:r>
-        <w:rPr>
-          <w:b w:val="0"/>
-          <w:i w:val="0"/>
-        </w:rPr>
-        <w:t xml:space="preserve"> = common + 19 Sprach-/Domain-Packs; mehr Skills via </w:t>
+        <w:t>ecc@ecc</w:t>
+      </w:r>
+      <w:r>
+        <w:rPr>
+          <w:b w:val="0"/>
+          <w:i w:val="0"/>
+        </w:rPr>
+        <w:t xml:space="preserve">, gepinnt auf Upstream-Tag </w:t>
       </w:r>
       <w:r>
         <w:rPr>
@@ -209,14 +228,30 @@
           <w:i w:val="0"/>
           <w:sz w:val="19"/>
         </w:rPr>
-        <w:t>--profile full</w:t>
-      </w:r>
-      <w:r>
-        <w:rPr>
-          <w:b w:val="0"/>
-          <w:i w:val="0"/>
-        </w:rPr>
-        <w:t xml:space="preserve"> (249).</w:t>
+        <w:t>v2.0.0-rc.1</w:t>
+      </w:r>
+      <w:r>
+        <w:rPr>
+          <w:b w:val="0"/>
+          <w:i w:val="0"/>
+        </w:rPr>
+        <w:t xml:space="preserve"> (Cache: </w:t>
+      </w:r>
+      <w:r>
+        <w:rPr>
+          <w:rFonts w:ascii="Consolas" w:hAnsi="Consolas"/>
+          <w:b w:val="0"/>
+          <w:i w:val="0"/>
+          <w:sz w:val="19"/>
+        </w:rPr>
+        <w:t>~/.claude/plugins/cache/ecc/ecc/2.0.0-rc.1/</w:t>
+      </w:r>
+      <w:r>
+        <w:rPr>
+          <w:b w:val="0"/>
+          <w:i w:val="0"/>
+        </w:rPr>
+        <w:t>) — damit in JEDEM Projekt verfügbar, ohne Kopien im Home oder Repo.</w:t>
       </w:r>
     </w:p>
     <w:p>
@@ -309,23 +344,21 @@
           <w:b w:val="0"/>
           <w:i w:val="0"/>
         </w:rPr>
-        <w:t xml:space="preserve">ECC ist GLOBAL nach </w:t>
-      </w:r>
-      <w:r>
-        <w:rPr>
-          <w:rFonts w:ascii="Consolas" w:hAnsi="Consolas"/>
-          <w:b w:val="0"/>
-          <w:i w:val="0"/>
-          <w:sz w:val="19"/>
-        </w:rPr>
-        <w:t>~/.claude</w:t>
-      </w:r>
-      <w:r>
-        <w:rPr>
-          <w:b w:val="0"/>
-          <w:i w:val="0"/>
-        </w:rPr>
-        <w:t xml:space="preserve"> installiert und damit in JEDEM Projekt auf der VPS aktiv (WMS, Jarvis, n8n, Werkstatt …). Die Installation ist bewusst additiv und namespace-sicher:</w:t>
+        <w:t xml:space="preserve">ECC läuft als globales </w:t>
+      </w:r>
+      <w:r>
+        <w:rPr>
+          <w:b/>
+          <w:i w:val="0"/>
+        </w:rPr>
+        <w:t>Plugin</w:t>
+      </w:r>
+      <w:r>
+        <w:rPr>
+          <w:b w:val="0"/>
+          <w:i w:val="0"/>
+        </w:rPr>
+        <w:t xml:space="preserve"> und ist damit in JEDEM Projekt auf der VPS verfügbar (WMS, Jarvis, n8n, Werkstatt …). Das Setup ist bewusst schlank und reproduzierbar:</w:t>
       </w:r>
     </w:p>
     <w:p>
@@ -337,14 +370,14 @@
           <w:b/>
           <w:i w:val="0"/>
         </w:rPr>
-        <w:t>Namespace-sicher:</w:t>
-      </w:r>
-      <w:r>
-        <w:rPr>
-          <w:b w:val="0"/>
-          <w:i w:val="0"/>
-        </w:rPr>
-        <w:t xml:space="preserve"> ECC liegt unter </w:t>
+        <w:t>Plugin-only:</w:t>
+      </w:r>
+      <w:r>
+        <w:rPr>
+          <w:b w:val="0"/>
+          <w:i w:val="0"/>
+        </w:rPr>
+        <w:t xml:space="preserve"> Single Source ist </w:t>
       </w:r>
       <w:r>
         <w:rPr>
@@ -353,14 +386,14 @@
           <w:i w:val="0"/>
           <w:sz w:val="19"/>
         </w:rPr>
-        <w:t>rules/ecc/</w:t>
-      </w:r>
-      <w:r>
-        <w:rPr>
-          <w:b w:val="0"/>
-          <w:i w:val="0"/>
-        </w:rPr>
-        <w:t xml:space="preserve"> und </w:t>
+        <w:t>~/.claude/plugins/cache/ecc/ecc/2.0.0-rc.1/</w:t>
+      </w:r>
+      <w:r>
+        <w:rPr>
+          <w:b w:val="0"/>
+          <w:i w:val="0"/>
+        </w:rPr>
+        <w:t xml:space="preserve"> — keine Kopien mehr unter </w:t>
       </w:r>
       <w:r>
         <w:rPr>
@@ -369,14 +402,62 @@
           <w:i w:val="0"/>
           <w:sz w:val="19"/>
         </w:rPr>
-        <w:t>skills/ecc/</w:t>
-      </w:r>
-      <w:r>
-        <w:rPr>
-          <w:b w:val="0"/>
-          <w:i w:val="0"/>
-        </w:rPr>
-        <w:t xml:space="preserve"> — keine Kollision mit Eigenem.</w:t>
+        <w:t>~/.claude/{rules,hooks,skills,commands}</w:t>
+      </w:r>
+      <w:r>
+        <w:rPr>
+          <w:b w:val="0"/>
+          <w:i w:val="0"/>
+        </w:rPr>
+        <w:t xml:space="preserve"> und keine vendored </w:t>
+      </w:r>
+      <w:r>
+        <w:rPr>
+          <w:rFonts w:ascii="Consolas" w:hAnsi="Consolas"/>
+          <w:b w:val="0"/>
+          <w:i w:val="0"/>
+          <w:sz w:val="19"/>
+        </w:rPr>
+        <w:t>ecc/</w:t>
+      </w:r>
+      <w:r>
+        <w:rPr>
+          <w:b w:val="0"/>
+          <w:i w:val="0"/>
+        </w:rPr>
+        <w:t xml:space="preserve"> im Repo. Update = </w:t>
+      </w:r>
+      <w:r>
+        <w:rPr>
+          <w:rFonts w:ascii="Consolas" w:hAnsi="Consolas"/>
+          <w:b w:val="0"/>
+          <w:i w:val="0"/>
+          <w:sz w:val="19"/>
+        </w:rPr>
+        <w:t>extraKnownMarketplaces.ecc.source.ref</w:t>
+      </w:r>
+      <w:r>
+        <w:rPr>
+          <w:b w:val="0"/>
+          <w:i w:val="0"/>
+        </w:rPr>
+        <w:t xml:space="preserve"> in </w:t>
+      </w:r>
+      <w:r>
+        <w:rPr>
+          <w:rFonts w:ascii="Consolas" w:hAnsi="Consolas"/>
+          <w:b w:val="0"/>
+          <w:i w:val="0"/>
+          <w:sz w:val="19"/>
+        </w:rPr>
+        <w:t>~/.claude/settings.json</w:t>
+      </w:r>
+      <w:r>
+        <w:rPr>
+          <w:b w:val="0"/>
+          <w:i w:val="0"/>
+        </w:rPr>
+        <w:t xml:space="preserve"> auf neuen Tag setzen.</w:t>
       </w:r>
     </w:p>
     <w:p>
@@ -423,14 +504,14 @@
           <w:b/>
           <w:i w:val="0"/>
         </w:rPr>
-        <w:t>Startup-Config additiv:</w:t>
-      </w:r>
-      <w:r>
-        <w:rPr>
-          <w:b w:val="0"/>
-          <w:i w:val="0"/>
-        </w:rPr>
-        <w:t xml:space="preserve"> Der Installer lässt </w:t>
+        <w:t>Hook-Zähmung per Profil:</w:t>
+      </w:r>
+      <w:r>
+        <w:rPr>
+          <w:b w:val="0"/>
+          <w:i w:val="0"/>
+        </w:rPr>
+        <w:t xml:space="preserve"> global </w:t>
       </w:r>
       <w:r>
         <w:rPr>
@@ -439,14 +520,14 @@
           <w:i w:val="0"/>
           <w:sz w:val="19"/>
         </w:rPr>
-        <w:t>settings.json</w:t>
-      </w:r>
-      <w:r>
-        <w:rPr>
-          <w:b w:val="0"/>
-          <w:i w:val="0"/>
-        </w:rPr>
-        <w:t>/</w:t>
+        <w:t>ECC_HOOK_PROFILE=minimal</w:t>
+      </w:r>
+      <w:r>
+        <w:rPr>
+          <w:b w:val="0"/>
+          <w:i w:val="0"/>
+        </w:rPr>
+        <w:t xml:space="preserve"> (Nicht-ECC-Projekte ruhig), projekt-lokal </w:t>
       </w:r>
       <w:r>
         <w:rPr>
@@ -455,14 +536,14 @@
           <w:i w:val="0"/>
           <w:sz w:val="19"/>
         </w:rPr>
-        <w:t>CLAUDE.md</w:t>
-      </w:r>
-      <w:r>
-        <w:rPr>
-          <w:b w:val="0"/>
-          <w:i w:val="0"/>
-        </w:rPr>
-        <w:t xml:space="preserve"> unberührt. Bewusste Aufräum-Schritte (feature-dev-Plugin deaktiviert, context-mode entfernt) wurden separat mit Backup vorgenommen.</w:t>
+        <w:t>standard</w:t>
+      </w:r>
+      <w:r>
+        <w:rPr>
+          <w:b w:val="0"/>
+          <w:i w:val="0"/>
+        </w:rPr>
+        <w:t xml:space="preserve"> in onboardeten Projekten (volle Pipeline). Details §14.</w:t>
       </w:r>
     </w:p>
     <w:p>
@@ -474,14 +555,14 @@
           <w:b/>
           <w:i w:val="0"/>
         </w:rPr>
-        <w:t>Reproduzierbar:</w:t>
-      </w:r>
-      <w:r>
-        <w:rPr>
-          <w:b w:val="0"/>
-          <w:i w:val="0"/>
-        </w:rPr>
-        <w:t xml:space="preserve"> Quelle ist das Repo; Re-Install via </w:t>
+        <w:t>Backup:</w:t>
+      </w:r>
+      <w:r>
+        <w:rPr>
+          <w:b w:val="0"/>
+          <w:i w:val="0"/>
+        </w:rPr>
+        <w:t xml:space="preserve"> kompletter Vor-Migrations-Stand unter </w:t>
       </w:r>
       <w:r>
         <w:rPr>
@@ -490,14 +571,14 @@
           <w:i w:val="0"/>
           <w:sz w:val="19"/>
         </w:rPr>
-        <w:t>./install-vps.sh</w:t>
-      </w:r>
-      <w:r>
-        <w:rPr>
-          <w:b w:val="0"/>
-          <w:i w:val="0"/>
-        </w:rPr>
-        <w:t xml:space="preserve"> (idempotent, mit Backup).</w:t>
+        <w:t>/root/harness-backup-20260610/</w:t>
+      </w:r>
+      <w:r>
+        <w:rPr>
+          <w:b w:val="0"/>
+          <w:i w:val="0"/>
+        </w:rPr>
+        <w:t>.</w:t>
       </w:r>
     </w:p>
     <w:p>
@@ -506,7 +587,7 @@
           <w:b/>
           <w:i w:val="0"/>
         </w:rPr>
-        <w:t>Koexistenz mit deinem bestehenden Setup:</w:t>
+        <w:t>Abgelöste Plugins (in `enabledPlugins` auf `false` — Änderung greift erst nach Claude-Code-Neustart):</w:t>
       </w:r>
     </w:p>
     <w:tbl>
@@ -516,14 +597,13 @@
         <w:tblLook w:firstColumn="1" w:firstRow="1" w:lastColumn="0" w:lastRow="0" w:noHBand="0" w:noVBand="1" w:val="04A0"/>
       </w:tblPr>
       <w:tblGrid>
-        <w:gridCol w:w="2880"/>
-        <w:gridCol w:w="2880"/>
-        <w:gridCol w:w="2880"/>
+        <w:gridCol w:w="4320"/>
+        <w:gridCol w:w="4320"/>
       </w:tblGrid>
       <w:tr>
         <w:tc>
           <w:tcPr>
-            <w:tcW w:type="dxa" w:w="2880"/>
+            <w:tcW w:type="dxa" w:w="4320"/>
           </w:tcPr>
           <w:p>
             <w:r/>
@@ -531,13 +611,13 @@
               <w:rPr>
                 <w:b/>
               </w:rPr>
-              <w:t>Dein Tool</w:t>
+              <w:t>Plugin (aus)</w:t>
             </w:r>
           </w:p>
         </w:tc>
         <w:tc>
           <w:tcPr>
-            <w:tcW w:type="dxa" w:w="2880"/>
+            <w:tcW w:type="dxa" w:w="4320"/>
           </w:tcPr>
           <w:p>
             <w:r/>
@@ -545,21 +625,7 @@
               <w:rPr>
                 <w:b/>
               </w:rPr>
-              <w:t>ECC-Pendant</w:t>
-            </w:r>
-          </w:p>
-        </w:tc>
-        <w:tc>
-          <w:tcPr>
-            <w:tcW w:type="dxa" w:w="2880"/>
-          </w:tcPr>
-          <w:p>
-            <w:r/>
-            <w:r>
-              <w:rPr>
-                <w:b/>
-              </w:rPr>
-              <w:t>Empfehlung</w:t>
+              <w:t>ECC-Pendant (führend)</w:t>
             </w:r>
           </w:p>
         </w:tc>
@@ -567,7 +633,7 @@
       <w:tr>
         <w:tc>
           <w:tcPr>
-            <w:tcW w:type="dxa" w:w="2880"/>
+            <w:tcW w:type="dxa" w:w="4320"/>
           </w:tcPr>
           <w:p>
             <w:r/>
@@ -582,7 +648,7 @@
         </w:tc>
         <w:tc>
           <w:tcPr>
-            <w:tcW w:type="dxa" w:w="2880"/>
+            <w:tcW w:type="dxa" w:w="4320"/>
           </w:tcPr>
           <w:p>
             <w:r/>
@@ -591,22 +657,7 @@
                 <w:b w:val="0"/>
                 <w:i w:val="0"/>
               </w:rPr>
-              <w:t>tdd-workflow, verification-loop …</w:t>
-            </w:r>
-          </w:p>
-        </w:tc>
-        <w:tc>
-          <w:tcPr>
-            <w:tcW w:type="dxa" w:w="2880"/>
-          </w:tcPr>
-          <w:p>
-            <w:r/>
-            <w:r>
-              <w:rPr>
-                <w:b w:val="0"/>
-                <w:i w:val="0"/>
-              </w:rPr>
-              <w:t>Beides nutzbar; bei Doppelung ECC bevorzugen</w:t>
+              <w:t>tdd-workflow, verification-loop, dispatching über ECC-Agents</w:t>
             </w:r>
           </w:p>
         </w:tc>
@@ -614,7 +665,7 @@
       <w:tr>
         <w:tc>
           <w:tcPr>
-            <w:tcW w:type="dxa" w:w="2880"/>
+            <w:tcW w:type="dxa" w:w="4320"/>
           </w:tcPr>
           <w:p>
             <w:r/>
@@ -629,7 +680,7 @@
         </w:tc>
         <w:tc>
           <w:tcPr>
-            <w:tcW w:type="dxa" w:w="2880"/>
+            <w:tcW w:type="dxa" w:w="4320"/>
           </w:tcPr>
           <w:p>
             <w:r/>
@@ -638,22 +689,7 @@
                 <w:b w:val="0"/>
                 <w:i w:val="0"/>
               </w:rPr>
-              <w:t>/save-session, continuous-learning-v2</w:t>
-            </w:r>
-          </w:p>
-        </w:tc>
-        <w:tc>
-          <w:tcPr>
-            <w:tcW w:type="dxa" w:w="2880"/>
-          </w:tcPr>
-          <w:p>
-            <w:r/>
-            <w:r>
-              <w:rPr>
-                <w:b w:val="0"/>
-                <w:i w:val="0"/>
-              </w:rPr>
-              <w:t>primäre Memory-Quelle; injiziert Kontext automatisch</w:t>
+              <w:t>memory-MCP (Wissensgraph) + Instincts + /save-session</w:t>
             </w:r>
           </w:p>
         </w:tc>
@@ -661,7 +697,7 @@
       <w:tr>
         <w:tc>
           <w:tcPr>
-            <w:tcW w:type="dxa" w:w="2880"/>
+            <w:tcW w:type="dxa" w:w="4320"/>
           </w:tcPr>
           <w:p>
             <w:r/>
@@ -670,13 +706,13 @@
                 <w:b w:val="0"/>
                 <w:i w:val="0"/>
               </w:rPr>
-              <w:t>RTK</w:t>
+              <w:t>context7@official</w:t>
             </w:r>
           </w:p>
         </w:tc>
         <w:tc>
           <w:tcPr>
-            <w:tcW w:type="dxa" w:w="2880"/>
+            <w:tcW w:type="dxa" w:w="4320"/>
           </w:tcPr>
           <w:p>
             <w:r/>
@@ -685,22 +721,7 @@
                 <w:b w:val="0"/>
                 <w:i w:val="0"/>
               </w:rPr>
-              <w:t>Token-Ökonomie (§10)</w:t>
-            </w:r>
-          </w:p>
-        </w:tc>
-        <w:tc>
-          <w:tcPr>
-            <w:tcW w:type="dxa" w:w="2880"/>
-          </w:tcPr>
-          <w:p>
-            <w:r/>
-            <w:r>
-              <w:rPr>
-                <w:b w:val="0"/>
-                <w:i w:val="0"/>
-              </w:rPr>
-              <w:t>Ergänzen sich: RTK auf Bash-, ECC auf Workflow-Ebene</w:t>
+              <w:t>ECC bringt eigenes context7-MCP mit</w:t>
             </w:r>
           </w:p>
         </w:tc>
@@ -708,7 +729,7 @@
       <w:tr>
         <w:tc>
           <w:tcPr>
-            <w:tcW w:type="dxa" w:w="2880"/>
+            <w:tcW w:type="dxa" w:w="4320"/>
           </w:tcPr>
           <w:p>
             <w:r/>
@@ -717,13 +738,13 @@
                 <w:b w:val="0"/>
                 <w:i w:val="0"/>
               </w:rPr>
-              <w:t>codex / superpowers</w:t>
+              <w:t>feature-dev</w:t>
             </w:r>
           </w:p>
         </w:tc>
         <w:tc>
           <w:tcPr>
-            <w:tcW w:type="dxa" w:w="2880"/>
+            <w:tcW w:type="dxa" w:w="4320"/>
           </w:tcPr>
           <w:p>
             <w:r/>
@@ -732,22 +753,7 @@
                 <w:b w:val="0"/>
                 <w:i w:val="0"/>
               </w:rPr>
-              <w:t>diverse Skills/Agents</w:t>
-            </w:r>
-          </w:p>
-        </w:tc>
-        <w:tc>
-          <w:tcPr>
-            <w:tcW w:type="dxa" w:w="2880"/>
-          </w:tcPr>
-          <w:p>
-            <w:r/>
-            <w:r>
-              <w:rPr>
-                <w:b w:val="0"/>
-                <w:i w:val="0"/>
-              </w:rPr>
-              <w:t>eigenständiger Mehrwert; bleiben aktiv</w:t>
+              <w:t>/feature-dev (ECC-Command)</w:t>
             </w:r>
           </w:p>
         </w:tc>
@@ -760,14 +766,14 @@
           <w:b/>
           <w:i w:val="0"/>
         </w:rPr>
-        <w:t>Aufgeräumt:</w:t>
-      </w:r>
-      <w:r>
-        <w:rPr>
-          <w:b w:val="0"/>
-          <w:i w:val="0"/>
-        </w:rPr>
-        <w:t xml:space="preserve"> feature-dev existierte 3-fach — die ECC-Version ist kanonisch, das gleichnamige Plugin wurde deaktiviert. RPI als Plugin wurde entfernt (durch die schlanken Schicht-2-RPI-Berater ersetzt). Bei Namens-Zweifeln eindeutige ECC-Commands nutzen (</w:t>
+        <w:t>Weiter aktiv neben ECC:</w:t>
+      </w:r>
+      <w:r>
+        <w:rPr>
+          <w:b w:val="0"/>
+          <w:i w:val="0"/>
+        </w:rPr>
+        <w:t xml:space="preserve"> codex, mgrep, LSP-Plugins, frontend-design, skill-creator u. a. — eigenständiger Mehrwert ohne Doppelung. Bei Namens-Zweifeln eindeutige ECC-Commands nutzen (</w:t>
       </w:r>
       <w:r>
         <w:rPr>
@@ -893,7 +899,7 @@
               <w:rPr>
                 <w:b/>
               </w:rPr>
-              <w:t>Wo (global)</w:t>
+              <w:t>Wo</w:t>
             </w:r>
           </w:p>
         </w:tc>
@@ -954,7 +960,23 @@
                 <w:b w:val="0"/>
                 <w:i w:val="0"/>
               </w:rPr>
-              <w:t>~/.claude/skills/ecc/</w:t>
+              <w:t xml:space="preserve">Plugin </w:t>
+            </w:r>
+            <w:r>
+              <w:rPr>
+                <w:rFonts w:ascii="Consolas" w:hAnsi="Consolas"/>
+                <w:b w:val="0"/>
+                <w:i w:val="0"/>
+                <w:sz w:val="19"/>
+              </w:rPr>
+              <w:t>skills/</w:t>
+            </w:r>
+            <w:r>
+              <w:rPr>
+                <w:b w:val="0"/>
+                <w:i w:val="0"/>
+              </w:rPr>
+              <w:t xml:space="preserve"> (alle 249)</w:t>
             </w:r>
           </w:p>
         </w:tc>
@@ -1016,7 +1038,23 @@
                 <w:b w:val="0"/>
                 <w:i w:val="0"/>
               </w:rPr>
-              <w:t>~/.claude/commands/</w:t>
+              <w:t xml:space="preserve">Plugin </w:t>
+            </w:r>
+            <w:r>
+              <w:rPr>
+                <w:rFonts w:ascii="Consolas" w:hAnsi="Consolas"/>
+                <w:b w:val="0"/>
+                <w:i w:val="0"/>
+                <w:sz w:val="19"/>
+              </w:rPr>
+              <w:t>commands/</w:t>
+            </w:r>
+            <w:r>
+              <w:rPr>
+                <w:b w:val="0"/>
+                <w:i w:val="0"/>
+              </w:rPr>
+              <w:t xml:space="preserve"> (+ 3 Schicht-2: /start, /mega-plan, /ecc-onboard)</w:t>
             </w:r>
           </w:p>
         </w:tc>
@@ -1063,7 +1101,7 @@
                 <w:b w:val="0"/>
                 <w:i w:val="0"/>
               </w:rPr>
-              <w:t>Delegierbare Spezialisten mit eigenem Tool-Scope</w:t>
+              <w:t>Delegierbare Spezialisten mit eigenem Tool-Scope + festem Modell</w:t>
             </w:r>
           </w:p>
         </w:tc>
@@ -1078,7 +1116,23 @@
                 <w:b w:val="0"/>
                 <w:i w:val="0"/>
               </w:rPr>
-              <w:t>~/.claude/agents/</w:t>
+              <w:t xml:space="preserve">Plugin </w:t>
+            </w:r>
+            <w:r>
+              <w:rPr>
+                <w:rFonts w:ascii="Consolas" w:hAnsi="Consolas"/>
+                <w:b w:val="0"/>
+                <w:i w:val="0"/>
+                <w:sz w:val="19"/>
+              </w:rPr>
+              <w:t>agents/</w:t>
+            </w:r>
+            <w:r>
+              <w:rPr>
+                <w:b w:val="0"/>
+                <w:i w:val="0"/>
+              </w:rPr>
+              <w:t xml:space="preserve"> (+ RPI-Berater in bestpractice-extras/)</w:t>
             </w:r>
           </w:p>
         </w:tc>
@@ -1140,7 +1194,23 @@
                 <w:b w:val="0"/>
                 <w:i w:val="0"/>
               </w:rPr>
-              <w:t>~/.claude/hooks/</w:t>
+              <w:t xml:space="preserve">Plugin </w:t>
+            </w:r>
+            <w:r>
+              <w:rPr>
+                <w:rFonts w:ascii="Consolas" w:hAnsi="Consolas"/>
+                <w:b w:val="0"/>
+                <w:i w:val="0"/>
+                <w:sz w:val="19"/>
+              </w:rPr>
+              <w:t>hooks/hooks.json</w:t>
+            </w:r>
+            <w:r>
+              <w:rPr>
+                <w:b w:val="0"/>
+                <w:i w:val="0"/>
+              </w:rPr>
+              <w:t>, gesteuert per ECC_HOOK_PROFILE</w:t>
             </w:r>
           </w:p>
         </w:tc>
@@ -1199,10 +1269,33 @@
             <w:r/>
             <w:r>
               <w:rPr>
+                <w:b/>
+                <w:i w:val="0"/>
+              </w:rPr>
+              <w:t>global</w:t>
+            </w:r>
+            <w:r>
+              <w:rPr>
                 <w:b w:val="0"/>
                 <w:i w:val="0"/>
               </w:rPr>
-              <w:t>~/.claude/rules/ecc/</w:t>
+              <w:t xml:space="preserve"> im Plugin (</w:t>
+            </w:r>
+            <w:r>
+              <w:rPr>
+                <w:rFonts w:ascii="Consolas" w:hAnsi="Consolas"/>
+                <w:b w:val="0"/>
+                <w:i w:val="0"/>
+                <w:sz w:val="19"/>
+              </w:rPr>
+              <w:t>ecc@ecc</w:t>
+            </w:r>
+            <w:r>
+              <w:rPr>
+                <w:b w:val="0"/>
+                <w:i w:val="0"/>
+              </w:rPr>
+              <w:t>) — kein Projekt-Vendoring mehr</w:t>
             </w:r>
           </w:p>
         </w:tc>
@@ -1249,7 +1342,7 @@
                 <w:b w:val="0"/>
                 <w:i w:val="0"/>
               </w:rPr>
-              <w:t>Prompt-getriebene Wrapper um externe Dienste</w:t>
+              <w:t>Externe Dienste als Tools (memory, context7, github, exa, playwright, sequential-thinking)</w:t>
             </w:r>
           </w:p>
         </w:tc>
@@ -1264,7 +1357,16 @@
                 <w:b w:val="0"/>
                 <w:i w:val="0"/>
               </w:rPr>
-              <w:t>.mcp.json / global</w:t>
+              <w:t xml:space="preserve">Plugin </w:t>
+            </w:r>
+            <w:r>
+              <w:rPr>
+                <w:rFonts w:ascii="Consolas" w:hAnsi="Consolas"/>
+                <w:b w:val="0"/>
+                <w:i w:val="0"/>
+                <w:sz w:val="19"/>
+              </w:rPr>
+              <w:t>.mcp.json</w:t>
             </w:r>
           </w:p>
         </w:tc>
@@ -1326,7 +1428,7 @@
                 <w:b w:val="0"/>
                 <w:i w:val="0"/>
               </w:rPr>
-              <w:t>homunculus/instincts/</w:t>
+              <w:t>~/.claude (continuous-learning), /instinct-status</w:t>
             </w:r>
           </w:p>
         </w:tc>
@@ -1348,6 +1450,15 @@
       </w:tr>
     </w:tbl>
     <w:p/>
+    <w:p>
+      <w:r>
+        <w:rPr>
+          <w:b w:val="0"/>
+          <w:i/>
+        </w:rPr>
+        <w:t>(Plugin-Pfad jeweils: `~/.claude/plugins/cache/ecc/ecc/2.0.0-rc.1/`.)</w:t>
+      </w:r>
+    </w:p>
     <w:p>
       <w:r>
         <w:rPr>
@@ -1678,14 +1789,14 @@
           <w:b/>
           <w:i w:val="0"/>
         </w:rPr>
-        <w:t>Mehr verfügbar:</w:t>
-      </w:r>
-      <w:r>
-        <w:rPr>
-          <w:b w:val="0"/>
-          <w:i w:val="0"/>
-        </w:rPr>
-        <w:t xml:space="preserve"> Mehr (249 Skills) via </w:t>
+        <w:t>Alle 249 Skills liefert das Plugin direkt</w:t>
+      </w:r>
+      <w:r>
+        <w:rPr>
+          <w:b w:val="0"/>
+          <w:i w:val="0"/>
+        </w:rPr>
+        <w:t xml:space="preserve"> — kein Install-Profil mehr nötig. claude-mem und superpowers sind deaktiviert; ihre Aufgaben übernehmen memory-MCP/Instincts bzw. die ECC-Workflows (</w:t>
       </w:r>
       <w:r>
         <w:rPr>
@@ -1694,14 +1805,30 @@
           <w:i w:val="0"/>
           <w:sz w:val="19"/>
         </w:rPr>
-        <w:t>./install-vps.sh --profile full</w:t>
-      </w:r>
-      <w:r>
-        <w:rPr>
-          <w:b w:val="0"/>
-          <w:i w:val="0"/>
-        </w:rPr>
-        <w:t>. claude-mem (mem-search, smart-explore) + superpowers koexistieren.</w:t>
+        <w:t>tdd-workflow</w:t>
+      </w:r>
+      <w:r>
+        <w:rPr>
+          <w:b w:val="0"/>
+          <w:i w:val="0"/>
+        </w:rPr>
+        <w:t xml:space="preserve">, </w:t>
+      </w:r>
+      <w:r>
+        <w:rPr>
+          <w:rFonts w:ascii="Consolas" w:hAnsi="Consolas"/>
+          <w:b w:val="0"/>
+          <w:i w:val="0"/>
+          <w:sz w:val="19"/>
+        </w:rPr>
+        <w:t>verification-loop</w:t>
+      </w:r>
+      <w:r>
+        <w:rPr>
+          <w:b w:val="0"/>
+          <w:i w:val="0"/>
+        </w:rPr>
+        <w:t>).</w:t>
       </w:r>
     </w:p>
     <w:p>
@@ -1819,7 +1946,7 @@
                 <w:b w:val="0"/>
                 <w:i w:val="0"/>
               </w:rPr>
-              <w:t>Explore-Agent / claude-mem</w:t>
+              <w:t>Explore-Agent / memory-MCP (search_nodes)</w:t>
             </w:r>
           </w:p>
         </w:tc>
@@ -2117,7 +2244,83 @@
           <w:b w:val="0"/>
           <w:i w:val="0"/>
         </w:rPr>
-        <w:t>Ein Command, ein OK: erkennt den Stack, installiert ECC project-level und legt persistente Projekt-Dateien an, die Claude künftig zuerst liest.</w:t>
+        <w:t xml:space="preserve">Ein Command, ein OK: </w:t>
+      </w:r>
+      <w:r>
+        <w:rPr>
+          <w:b/>
+          <w:i w:val="0"/>
+        </w:rPr>
+        <w:t>schlank (plugin-only)</w:t>
+      </w:r>
+      <w:r>
+        <w:rPr>
+          <w:b w:val="0"/>
+          <w:i w:val="0"/>
+        </w:rPr>
+        <w:t>. ECC-Core ist global — ins Projekt kommt nur der minimale projektlokale Kern. Ein deterministisches Script (</w:t>
+      </w:r>
+      <w:r>
+        <w:rPr>
+          <w:rFonts w:ascii="Consolas" w:hAnsi="Consolas"/>
+          <w:b w:val="0"/>
+          <w:i w:val="0"/>
+          <w:sz w:val="19"/>
+        </w:rPr>
+        <w:t>onboard.js</w:t>
+      </w:r>
+      <w:r>
+        <w:rPr>
+          <w:b w:val="0"/>
+          <w:i w:val="0"/>
+        </w:rPr>
+        <w:t>) erledigt die Mechanik, eine maschinelle Abnahme (</w:t>
+      </w:r>
+      <w:r>
+        <w:rPr>
+          <w:rFonts w:ascii="Consolas" w:hAnsi="Consolas"/>
+          <w:b w:val="0"/>
+          <w:i w:val="0"/>
+          <w:sz w:val="19"/>
+        </w:rPr>
+        <w:t>onboard-verify.js</w:t>
+      </w:r>
+      <w:r>
+        <w:rPr>
+          <w:b w:val="0"/>
+          <w:i w:val="0"/>
+        </w:rPr>
+        <w:t xml:space="preserve">) belegt „fertig". </w:t>
+      </w:r>
+      <w:r>
+        <w:rPr>
+          <w:b/>
+          <w:i w:val="0"/>
+        </w:rPr>
+        <w:t>Kein</w:t>
+      </w:r>
+      <w:r>
+        <w:rPr>
+          <w:b w:val="0"/>
+          <w:i w:val="0"/>
+        </w:rPr>
+        <w:t xml:space="preserve"> Vendoring (</w:t>
+      </w:r>
+      <w:r>
+        <w:rPr>
+          <w:rFonts w:ascii="Consolas" w:hAnsi="Consolas"/>
+          <w:b w:val="0"/>
+          <w:i w:val="0"/>
+          <w:sz w:val="19"/>
+        </w:rPr>
+        <w:t>.claude/rules/ecc</w:t>
+      </w:r>
+      <w:r>
+        <w:rPr>
+          <w:b w:val="0"/>
+          <w:i w:val="0"/>
+        </w:rPr>
+        <w:t xml:space="preserve"> etc.), funktioniert auch in Fremd-Repos.</w:t>
       </w:r>
     </w:p>
     <w:tbl>
@@ -2187,7 +2390,7 @@
                 <w:b w:val="0"/>
                 <w:i w:val="0"/>
               </w:rPr>
-              <w:t>1 · Detect</w:t>
+              <w:t>1 · Dry-Run</w:t>
             </w:r>
           </w:p>
         </w:tc>
@@ -2199,10 +2402,12 @@
             <w:r/>
             <w:r>
               <w:rPr>
+                <w:rFonts w:ascii="Consolas" w:hAnsi="Consolas"/>
                 <w:b w:val="0"/>
                 <w:i w:val="0"/>
-              </w:rPr>
-              <w:t>Stack aus package.json / go.mod / pyproject.toml … erkennen</w:t>
+                <w:sz w:val="19"/>
+              </w:rPr>
+              <w:t>onboard.js --project &lt;dir&gt;</w:t>
             </w:r>
           </w:p>
         </w:tc>
@@ -2217,7 +2422,7 @@
                 <w:b w:val="0"/>
                 <w:i w:val="0"/>
               </w:rPr>
-              <w:t>Profil + Sprach-Packs</w:t>
+              <w:t>Preflight + De-Cruft-Plan + Slim-Scaffold-Plan, schreibt nichts</w:t>
             </w:r>
           </w:p>
         </w:tc>
@@ -2234,7 +2439,7 @@
                 <w:b w:val="0"/>
                 <w:i w:val="0"/>
               </w:rPr>
-              <w:t>2 · Dry-Run</w:t>
+              <w:t>2 · Bestätigung</w:t>
             </w:r>
           </w:p>
         </w:tc>
@@ -2249,7 +2454,7 @@
                 <w:b w:val="0"/>
                 <w:i w:val="0"/>
               </w:rPr>
-              <w:t>install-apply --target claude-project --dry-run</w:t>
+              <w:t>1× OK des Users</w:t>
             </w:r>
           </w:p>
         </w:tc>
@@ -2264,7 +2469,7 @@
                 <w:b w:val="0"/>
                 <w:i w:val="0"/>
               </w:rPr>
-              <w:t>Plan ohne Schreiben</w:t>
+              <w:t>Freigabe</w:t>
             </w:r>
           </w:p>
         </w:tc>
@@ -2281,7 +2486,7 @@
                 <w:b w:val="0"/>
                 <w:i w:val="0"/>
               </w:rPr>
-              <w:t>3 · Bestätigung</w:t>
+              <w:t>3 · Apply</w:t>
             </w:r>
           </w:p>
         </w:tc>
@@ -2293,10 +2498,12 @@
             <w:r/>
             <w:r>
               <w:rPr>
+                <w:rFonts w:ascii="Consolas" w:hAnsi="Consolas"/>
                 <w:b w:val="0"/>
                 <w:i w:val="0"/>
-              </w:rPr>
-              <w:t>1× OK des Users</w:t>
+                <w:sz w:val="19"/>
+              </w:rPr>
+              <w:t>onboard.js --apply</w:t>
             </w:r>
           </w:p>
         </w:tc>
@@ -2311,7 +2518,23 @@
                 <w:b w:val="0"/>
                 <w:i w:val="0"/>
               </w:rPr>
-              <w:t>Freigabe</w:t>
+              <w:t xml:space="preserve">De-Cruft (Altlasten → </w:t>
+            </w:r>
+            <w:r>
+              <w:rPr>
+                <w:rFonts w:ascii="Consolas" w:hAnsi="Consolas"/>
+                <w:b w:val="0"/>
+                <w:i w:val="0"/>
+                <w:sz w:val="19"/>
+              </w:rPr>
+              <w:t>.harness-backup/</w:t>
+            </w:r>
+            <w:r>
+              <w:rPr>
+                <w:b w:val="0"/>
+                <w:i w:val="0"/>
+              </w:rPr>
+              <w:t>) + Slim-Scaffold</w:t>
             </w:r>
           </w:p>
         </w:tc>
@@ -2328,7 +2551,7 @@
                 <w:b w:val="0"/>
                 <w:i w:val="0"/>
               </w:rPr>
-              <w:t>4 · Install</w:t>
+              <w:t>4 · Slim-Kern</w:t>
             </w:r>
           </w:p>
         </w:tc>
@@ -2343,7 +2566,39 @@
                 <w:b w:val="0"/>
                 <w:i w:val="0"/>
               </w:rPr>
-              <w:t>install-apply --target claude-project</w:t>
+              <w:t xml:space="preserve">env-Block + </w:t>
+            </w:r>
+            <w:r>
+              <w:rPr>
+                <w:rFonts w:ascii="Consolas" w:hAnsi="Consolas"/>
+                <w:b w:val="0"/>
+                <w:i w:val="0"/>
+                <w:sz w:val="19"/>
+              </w:rPr>
+              <w:t>state/</w:t>
+            </w:r>
+            <w:r>
+              <w:rPr>
+                <w:b w:val="0"/>
+                <w:i w:val="0"/>
+              </w:rPr>
+              <w:t xml:space="preserve"> + Sentinel + </w:t>
+            </w:r>
+            <w:r>
+              <w:rPr>
+                <w:rFonts w:ascii="Consolas" w:hAnsi="Consolas"/>
+                <w:b w:val="0"/>
+                <w:i w:val="0"/>
+                <w:sz w:val="19"/>
+              </w:rPr>
+              <w:t>.gitignore</w:t>
+            </w:r>
+            <w:r>
+              <w:rPr>
+                <w:b w:val="0"/>
+                <w:i w:val="0"/>
+              </w:rPr>
+              <w:t xml:space="preserve"> + consumer-Artefakte + initialer PRE</w:t>
             </w:r>
           </w:p>
         </w:tc>
@@ -2355,10 +2610,44 @@
             <w:r/>
             <w:r>
               <w:rPr>
+                <w:rFonts w:ascii="Consolas" w:hAnsi="Consolas"/>
                 <w:b w:val="0"/>
                 <w:i w:val="0"/>
-              </w:rPr>
-              <w:t>.claude/rules/ecc/ + skills/ecc/</w:t>
+                <w:sz w:val="19"/>
+              </w:rPr>
+              <w:t>.claude/settings.json</w:t>
+            </w:r>
+            <w:r>
+              <w:rPr>
+                <w:b w:val="0"/>
+                <w:i w:val="0"/>
+              </w:rPr>
+              <w:t xml:space="preserve">, </w:t>
+            </w:r>
+            <w:r>
+              <w:rPr>
+                <w:rFonts w:ascii="Consolas" w:hAnsi="Consolas"/>
+                <w:b w:val="0"/>
+                <w:i w:val="0"/>
+                <w:sz w:val="19"/>
+              </w:rPr>
+              <w:t>state/*</w:t>
+            </w:r>
+            <w:r>
+              <w:rPr>
+                <w:b w:val="0"/>
+                <w:i w:val="0"/>
+              </w:rPr>
+              <w:t xml:space="preserve">, </w:t>
+            </w:r>
+            <w:r>
+              <w:rPr>
+                <w:rFonts w:ascii="Consolas" w:hAnsi="Consolas"/>
+                <w:b w:val="0"/>
+                <w:i w:val="0"/>
+                <w:sz w:val="19"/>
+              </w:rPr>
+              <w:t>WORKING-CONTEXT.md</w:t>
             </w:r>
           </w:p>
         </w:tc>
@@ -2375,7 +2664,7 @@
                 <w:b w:val="0"/>
                 <w:i w:val="0"/>
               </w:rPr>
-              <w:t>5 · Kontext</w:t>
+              <w:t>5 · Verfeinern</w:t>
             </w:r>
           </w:p>
         </w:tc>
@@ -2390,7 +2679,16 @@
                 <w:b w:val="0"/>
                 <w:i w:val="0"/>
               </w:rPr>
-              <w:t>Templates mit echten Werten füllen</w:t>
+              <w:t xml:space="preserve">Templates mit echten Werten füllen + </w:t>
+            </w:r>
+            <w:r>
+              <w:rPr>
+                <w:rFonts w:ascii="Consolas" w:hAnsi="Consolas"/>
+                <w:b w:val="0"/>
+                <w:i w:val="0"/>
+                <w:sz w:val="19"/>
+              </w:rPr>
+              <w:t>onboard-verify</w:t>
             </w:r>
           </w:p>
         </w:tc>
@@ -2405,7 +2703,7 @@
                 <w:b w:val="0"/>
                 <w:i w:val="0"/>
               </w:rPr>
-              <w:t>PROJECT_RULES.md + state/*</w:t>
+              <w:t>PROJECT_RULES.md + CLAUDE.md, alle Pflicht-Checks grün</w:t>
             </w:r>
           </w:p>
         </w:tc>
@@ -2669,7 +2967,39 @@
           <w:b w:val="0"/>
           <w:i w:val="0"/>
         </w:rPr>
-        <w:t xml:space="preserve"> erneut laufen lassen. Erstes Mal in einem fremden Repo: code-tour-Skill bzw. claude-mem smart-explore/learn-codebase erzeugen Touren/Struktur.</w:t>
+        <w:t xml:space="preserve"> erneut laufen lassen. Erstes Mal in einem fremden Repo: </w:t>
+      </w:r>
+      <w:r>
+        <w:rPr>
+          <w:rFonts w:ascii="Consolas" w:hAnsi="Consolas"/>
+          <w:b w:val="0"/>
+          <w:i w:val="0"/>
+          <w:sz w:val="19"/>
+        </w:rPr>
+        <w:t>code-tour</w:t>
+      </w:r>
+      <w:r>
+        <w:rPr>
+          <w:b w:val="0"/>
+          <w:i w:val="0"/>
+        </w:rPr>
+        <w:t xml:space="preserve">- bzw. </w:t>
+      </w:r>
+      <w:r>
+        <w:rPr>
+          <w:rFonts w:ascii="Consolas" w:hAnsi="Consolas"/>
+          <w:b w:val="0"/>
+          <w:i w:val="0"/>
+          <w:sz w:val="19"/>
+        </w:rPr>
+        <w:t>codebase-onboarding</w:t>
+      </w:r>
+      <w:r>
+        <w:rPr>
+          <w:b w:val="0"/>
+          <w:i w:val="0"/>
+        </w:rPr>
+        <w:t>-Skill erzeugen Touren/Struktur.</w:t>
       </w:r>
     </w:p>
     <w:p>
@@ -2743,14 +3073,14 @@
           <w:b/>
           <w:i w:val="0"/>
         </w:rPr>
-        <w:t>claude-mem ergänzt:</w:t>
-      </w:r>
-      <w:r>
-        <w:rPr>
-          <w:b w:val="0"/>
-          <w:i w:val="0"/>
-        </w:rPr>
-        <w:t xml:space="preserve"> Injiziert relevanten Kontext aus früheren Sessions ab der 2. Session automatisch. </w:t>
+        <w:t>Memory ergänzt:</w:t>
+      </w:r>
+      <w:r>
+        <w:rPr>
+          <w:b w:val="0"/>
+          <w:i w:val="0"/>
+        </w:rPr>
+        <w:t xml:space="preserve"> Der ECC-SessionStart-Hook lädt Session-Kontext; in onboardeten Projekten spiegelt State-Sync </w:t>
       </w:r>
       <w:r>
         <w:rPr>
@@ -2759,14 +3089,62 @@
           <w:i w:val="0"/>
           <w:sz w:val="19"/>
         </w:rPr>
-        <w:t>/mem-search</w:t>
-      </w:r>
-      <w:r>
-        <w:rPr>
-          <w:b w:val="0"/>
-          <w:i w:val="0"/>
-        </w:rPr>
-        <w:t xml:space="preserve"> für gezielte Treffer („schon mal gelöst?").</w:t>
+        <w:t>state/</w:t>
+      </w:r>
+      <w:r>
+        <w:rPr>
+          <w:b w:val="0"/>
+          <w:i w:val="0"/>
+        </w:rPr>
+        <w:t xml:space="preserve"> nach </w:t>
+      </w:r>
+      <w:r>
+        <w:rPr>
+          <w:rFonts w:ascii="Consolas" w:hAnsi="Consolas"/>
+          <w:b w:val="0"/>
+          <w:i w:val="0"/>
+          <w:sz w:val="19"/>
+        </w:rPr>
+        <w:t>WORKING-CONTEXT.md</w:t>
+      </w:r>
+      <w:r>
+        <w:rPr>
+          <w:b w:val="0"/>
+          <w:i w:val="0"/>
+        </w:rPr>
+        <w:t xml:space="preserve">. Gezielt nachschlagen („schon mal gelöst?"): memory-MCP </w:t>
+      </w:r>
+      <w:r>
+        <w:rPr>
+          <w:rFonts w:ascii="Consolas" w:hAnsi="Consolas"/>
+          <w:b w:val="0"/>
+          <w:i w:val="0"/>
+          <w:sz w:val="19"/>
+        </w:rPr>
+        <w:t>search_nodes</w:t>
+      </w:r>
+      <w:r>
+        <w:rPr>
+          <w:b w:val="0"/>
+          <w:i w:val="0"/>
+        </w:rPr>
+        <w:t xml:space="preserve"> + </w:t>
+      </w:r>
+      <w:r>
+        <w:rPr>
+          <w:rFonts w:ascii="Consolas" w:hAnsi="Consolas"/>
+          <w:b w:val="0"/>
+          <w:i w:val="0"/>
+          <w:sz w:val="19"/>
+        </w:rPr>
+        <w:t>/instinct-status</w:t>
+      </w:r>
+      <w:r>
+        <w:rPr>
+          <w:b w:val="0"/>
+          <w:i w:val="0"/>
+        </w:rPr>
+        <w:t>.</w:t>
       </w:r>
     </w:p>
     <w:p>
@@ -2868,7 +3246,7 @@
           <w:rFonts w:ascii="Consolas" w:hAnsi="Consolas"/>
           <w:sz w:val="18"/>
         </w:rPr>
-        <w:t>/ecc-onboard           # Stack-Frage → 1x OK → .claude/rules+skills, PROJECT_RULES.md, state/</w:t>
+        <w:t>/ecc-onboard           # Dry-Run → 1x OK → De-Cruft + slim Scaffold (env, state/, PROJECT_RULES.md) → Abnahme</w:t>
       </w:r>
     </w:p>
     <w:p>
@@ -3130,7 +3508,7 @@
                 <w:b w:val="0"/>
                 <w:i w:val="0"/>
               </w:rPr>
-              <w:t>Explore-Agent: Routing/Handler/Tests kartieren (+ claude-mem)</w:t>
+              <w:t>Explore-Agent: Routing/Handler/Tests kartieren (+ memory-MCP)</w:t>
             </w:r>
           </w:p>
         </w:tc>
@@ -3732,7 +4110,7 @@
                 <w:b w:val="0"/>
                 <w:i w:val="0"/>
               </w:rPr>
-              <w:t>/start · claude-mem injiziert Kontext (ab 2. Session) · rtk gain</w:t>
+              <w:t>/start (State-Sync PRE + rtk-Budget + Agenda)</w:t>
             </w:r>
           </w:p>
         </w:tc>
@@ -3779,7 +4157,7 @@
                 <w:b w:val="0"/>
                 <w:i w:val="0"/>
               </w:rPr>
-              <w:t>/resume-session · /mem-search „schon gelöst?"</w:t>
+              <w:t>/resume-session · memory-MCP search_nodes „schon gelöst?" · /instinct-status</w:t>
             </w:r>
           </w:p>
         </w:tc>
@@ -4268,7 +4646,7 @@
                 <w:b w:val="0"/>
                 <w:i w:val="0"/>
               </w:rPr>
-              <w:t>/systematic-debugging</w:t>
+              <w:t>reproduzieren + failing Test (ecc:tdd-workflow)</w:t>
             </w:r>
           </w:p>
         </w:tc>
@@ -4283,7 +4661,7 @@
                 <w:b w:val="0"/>
                 <w:i w:val="0"/>
               </w:rPr>
-              <w:t>Root-Cause vor Fix</w:t>
+              <w:t>Root-Cause vor Fix, nie blind fixen</w:t>
             </w:r>
           </w:p>
         </w:tc>
@@ -4330,7 +4708,7 @@
                 <w:b w:val="0"/>
                 <w:i w:val="0"/>
               </w:rPr>
-              <w:t>Stack erkennen → 1× OK → Rules/Skills + PROJECT_RULES.md + state/</w:t>
+              <w:t>Dry-Run → 1× OK → De-Cruft + Slim-Scaffold (env + state/ + PROJECT_RULES.md) + Abnahme</w:t>
             </w:r>
           </w:p>
         </w:tc>
@@ -5021,7 +5399,7 @@
           <w:b w:val="0"/>
           <w:i w:val="0"/>
         </w:rPr>
-        <w:t xml:space="preserve">Faustregel: 20–30 MCPs konfiguriert, aber &lt; 10 aktiv / &lt; 80 Tools. Ungenutztes pro Projekt mit </w:t>
+        <w:t xml:space="preserve">Faustregel: &lt; 10 MCPs aktiv / &lt; 80 Tools. Ungenutztes pro Projekt mit </w:t>
       </w:r>
       <w:r>
         <w:rPr>
@@ -5046,7 +5424,7 @@
           <w:b/>
           <w:i w:val="0"/>
         </w:rPr>
-        <w:t>Bei dir aktiv (global):</w:t>
+        <w:t>Das ECC-Plugin bringt 6 MCP-Server mit (automatisch verfügbar, nichts zu konfigurieren):</w:t>
       </w:r>
     </w:p>
     <w:tbl>
@@ -5085,7 +5463,7 @@
               <w:rPr>
                 <w:b/>
               </w:rPr>
-              <w:t>MCP / Tool</w:t>
+              <w:t>MCP (via ECC)</w:t>
             </w:r>
           </w:p>
         </w:tc>
@@ -5116,7 +5494,7 @@
                 <w:b w:val="0"/>
                 <w:i w:val="0"/>
               </w:rPr>
-              <w:t>PDF/Word/Excel/PPTX lesen</w:t>
+              <w:t>Frühere Arbeit / Wissensgraph</w:t>
             </w:r>
           </w:p>
         </w:tc>
@@ -5131,7 +5509,7 @@
                 <w:b w:val="0"/>
                 <w:i w:val="0"/>
               </w:rPr>
-              <w:t>markitdown</w:t>
+              <w:t>memory</w:t>
             </w:r>
           </w:p>
         </w:tc>
@@ -5146,7 +5524,7 @@
                 <w:b w:val="0"/>
                 <w:i w:val="0"/>
               </w:rPr>
-              <w:t>Dokumente → Markdown (lokal, global aktiv)</w:t>
+              <w:t>search_nodes / open_nodes / create_entities — deine primäre Memory-Quelle (§11)</w:t>
             </w:r>
           </w:p>
         </w:tc>
@@ -5193,7 +5571,23 @@
                 <w:b w:val="0"/>
                 <w:i w:val="0"/>
               </w:rPr>
-              <w:t>React, Prisma, Next.js … statt veraltetem Wissen (Plugin)</w:t>
+              <w:t>React, Prisma, Next.js … statt veraltetem Wissen. Läuft über ECC (</w:t>
+            </w:r>
+            <w:r>
+              <w:rPr>
+                <w:rFonts w:ascii="Consolas" w:hAnsi="Consolas"/>
+                <w:b w:val="0"/>
+                <w:i w:val="0"/>
+                <w:sz w:val="19"/>
+              </w:rPr>
+              <w:t>mcp__plugin_ecc_context7__*</w:t>
+            </w:r>
+            <w:r>
+              <w:rPr>
+                <w:b w:val="0"/>
+                <w:i w:val="0"/>
+              </w:rPr>
+              <w:t>) — das offizielle context7-Plugin bleibt bewusst aus (keine Dubletten)</w:t>
             </w:r>
           </w:p>
         </w:tc>
@@ -5210,7 +5604,7 @@
                 <w:b w:val="0"/>
                 <w:i w:val="0"/>
               </w:rPr>
-              <w:t>Frühere Arbeit / „schon gelöst?"</w:t>
+              <w:t>GitHub (PRs, Issues, Code-Suche)</w:t>
             </w:r>
           </w:p>
         </w:tc>
@@ -5225,7 +5619,7 @@
                 <w:b w:val="0"/>
                 <w:i w:val="0"/>
               </w:rPr>
-              <w:t>claude-mem</w:t>
+              <w:t>github</w:t>
             </w:r>
           </w:p>
         </w:tc>
@@ -5240,7 +5634,7 @@
                 <w:b w:val="0"/>
                 <w:i w:val="0"/>
               </w:rPr>
-              <w:t>deine Memory-Quelle: /mem-search, Auto-Injektion ab 2. Session</w:t>
+              <w:t>ergänzt die gh-CLI</w:t>
             </w:r>
           </w:p>
         </w:tc>
@@ -5257,7 +5651,7 @@
                 <w:b w:val="0"/>
                 <w:i w:val="0"/>
               </w:rPr>
-              <w:t>Dienste anbinden</w:t>
+              <w:t>Web-Recherche / Discovery</w:t>
             </w:r>
           </w:p>
         </w:tc>
@@ -5272,7 +5666,7 @@
                 <w:b w:val="0"/>
                 <w:i w:val="0"/>
               </w:rPr>
-              <w:t>claude.ai-Connectoren</w:t>
+              <w:t>exa</w:t>
             </w:r>
           </w:p>
         </w:tc>
@@ -5287,7 +5681,7 @@
                 <w:b w:val="0"/>
                 <w:i w:val="0"/>
               </w:rPr>
-              <w:t>n8n · Notion · Gamma · Google Drive · Microsoft Learn · Kiwi</w:t>
+              <w:t>breite Suche, wenn GitHub+Docs nicht reichen</w:t>
             </w:r>
           </w:p>
         </w:tc>
@@ -5304,7 +5698,7 @@
                 <w:b w:val="0"/>
                 <w:i w:val="0"/>
               </w:rPr>
-              <w:t>Bash-Token sparen</w:t>
+              <w:t>Browser / E2E / Screenshots</w:t>
             </w:r>
           </w:p>
         </w:tc>
@@ -5319,7 +5713,7 @@
                 <w:b w:val="0"/>
                 <w:i w:val="0"/>
               </w:rPr>
-              <w:t>RTK (Hook, kein MCP)</w:t>
+              <w:t>playwright</w:t>
             </w:r>
           </w:p>
         </w:tc>
@@ -5334,7 +5728,7 @@
                 <w:b w:val="0"/>
                 <w:i w:val="0"/>
               </w:rPr>
-              <w:t>60–90 % Ersparnis, läuft transparent global</w:t>
+              <w:t>headless Automation, visuelle Tests</w:t>
             </w:r>
           </w:p>
         </w:tc>
@@ -5351,7 +5745,7 @@
                 <w:b w:val="0"/>
                 <w:i w:val="0"/>
               </w:rPr>
-              <w:t>Semantische Code-/Doku-Suche</w:t>
+              <w:t>Schrittweises Reasoning</w:t>
             </w:r>
           </w:p>
         </w:tc>
@@ -5366,7 +5760,7 @@
                 <w:b w:val="0"/>
                 <w:i w:val="0"/>
               </w:rPr>
-              <w:t>mgrep (CLI/Skill, kein MCP)</w:t>
+              <w:t>sequential-thinking</w:t>
             </w:r>
           </w:p>
         </w:tc>
@@ -5381,7 +5775,7 @@
                 <w:b w:val="0"/>
                 <w:i w:val="0"/>
               </w:rPr>
-              <w:t>~50 % weniger Token als grep — Details in §15</w:t>
+              <w:t>komplexe Mehrschritt-Probleme (s. §15)</w:t>
             </w:r>
           </w:p>
         </w:tc>
@@ -5394,7 +5788,7 @@
           <w:b/>
           <w:i w:val="0"/>
         </w:rPr>
-        <w:t>Optional / empfohlen — NICHT installiert, bei Bedarf nachrüsten:</w:t>
+        <w:t>Dazu unabhängig von ECC:</w:t>
       </w:r>
     </w:p>
     <w:tbl>
@@ -5464,7 +5858,7 @@
                 <w:b w:val="0"/>
                 <w:i w:val="0"/>
               </w:rPr>
-              <w:t>Web-Recherche / Discovery</w:t>
+              <w:t>PDF/Word/Excel/PPTX lesen</w:t>
             </w:r>
           </w:p>
         </w:tc>
@@ -5479,7 +5873,7 @@
                 <w:b w:val="0"/>
                 <w:i w:val="0"/>
               </w:rPr>
-              <w:t>exa</w:t>
+              <w:t>markitdown</w:t>
             </w:r>
           </w:p>
         </w:tc>
@@ -5494,7 +5888,7 @@
                 <w:b w:val="0"/>
                 <w:i w:val="0"/>
               </w:rPr>
-              <w:t>breite Suche, wenn GitHub+Docs nicht reichen</w:t>
+              <w:t>Dokumente → Markdown (lokal)</w:t>
             </w:r>
           </w:p>
         </w:tc>
@@ -5511,7 +5905,7 @@
                 <w:b w:val="0"/>
                 <w:i w:val="0"/>
               </w:rPr>
-              <w:t>GitHub (PRs, Issues, Code-Suche)</w:t>
+              <w:t>Dienste anbinden</w:t>
             </w:r>
           </w:p>
         </w:tc>
@@ -5526,7 +5920,7 @@
                 <w:b w:val="0"/>
                 <w:i w:val="0"/>
               </w:rPr>
-              <w:t>github</w:t>
+              <w:t>claude.ai-Connectoren</w:t>
             </w:r>
           </w:p>
         </w:tc>
@@ -5541,7 +5935,7 @@
                 <w:b w:val="0"/>
                 <w:i w:val="0"/>
               </w:rPr>
-              <w:t>du nutzt die gh-CLI statt MCP</w:t>
+              <w:t>n8n · Notion · Gamma · Google Drive · Microsoft Learn …</w:t>
             </w:r>
           </w:p>
         </w:tc>
@@ -5558,7 +5952,7 @@
                 <w:b w:val="0"/>
                 <w:i w:val="0"/>
               </w:rPr>
-              <w:t>Browser / E2E / Screenshots</w:t>
+              <w:t>Bash-Token sparen</w:t>
             </w:r>
           </w:p>
         </w:tc>
@@ -5573,7 +5967,7 @@
                 <w:b w:val="0"/>
                 <w:i w:val="0"/>
               </w:rPr>
-              <w:t>playwright</w:t>
+              <w:t>RTK (Hook, kein MCP)</w:t>
             </w:r>
           </w:p>
         </w:tc>
@@ -5588,7 +5982,7 @@
                 <w:b w:val="0"/>
                 <w:i w:val="0"/>
               </w:rPr>
-              <w:t>headless Automation, visuelle Tests</w:t>
+              <w:t>60–90 % Ersparnis, läuft transparent global</w:t>
             </w:r>
           </w:p>
         </w:tc>
@@ -5605,7 +5999,7 @@
                 <w:b w:val="0"/>
                 <w:i w:val="0"/>
               </w:rPr>
-              <w:t>Strukturierter Wissensgraph</w:t>
+              <w:t>Semantische Code-/Doku-Suche</w:t>
             </w:r>
           </w:p>
         </w:tc>
@@ -5620,7 +6014,7 @@
                 <w:b w:val="0"/>
                 <w:i w:val="0"/>
               </w:rPr>
-              <w:t>memory</w:t>
+              <w:t>mgrep (CLI/Skill, kein MCP)</w:t>
             </w:r>
           </w:p>
         </w:tc>
@@ -5635,54 +6029,7 @@
                 <w:b w:val="0"/>
                 <w:i w:val="0"/>
               </w:rPr>
-              <w:t>NICHT nötig, claude-mem deckt das ab</w:t>
-            </w:r>
-          </w:p>
-        </w:tc>
-      </w:tr>
-      <w:tr>
-        <w:tc>
-          <w:tcPr>
-            <w:tcW w:type="dxa" w:w="2880"/>
-          </w:tcPr>
-          <w:p>
-            <w:r/>
-            <w:r>
-              <w:rPr>
-                <w:b w:val="0"/>
-                <w:i w:val="0"/>
-              </w:rPr>
-              <w:t>Schrittweises Reasoning</w:t>
-            </w:r>
-          </w:p>
-        </w:tc>
-        <w:tc>
-          <w:tcPr>
-            <w:tcW w:type="dxa" w:w="2880"/>
-          </w:tcPr>
-          <w:p>
-            <w:r/>
-            <w:r>
-              <w:rPr>
-                <w:b w:val="0"/>
-                <w:i w:val="0"/>
-              </w:rPr>
-              <w:t>sequential-thinking</w:t>
-            </w:r>
-          </w:p>
-        </w:tc>
-        <w:tc>
-          <w:tcPr>
-            <w:tcW w:type="dxa" w:w="2880"/>
-          </w:tcPr>
-          <w:p>
-            <w:r/>
-            <w:r>
-              <w:rPr>
-                <w:b w:val="0"/>
-                <w:i w:val="0"/>
-              </w:rPr>
-              <w:t>komplexe Mehrschritt-Probleme (s. §15)</w:t>
+              <w:t>~50 % weniger Token als grep — Details in §15</w:t>
             </w:r>
           </w:p>
         </w:tc>
@@ -5695,14 +6042,46 @@
           <w:b/>
           <w:i w:val="0"/>
         </w:rPr>
-        <w:t>Memory-Klarstellung:</w:t>
-      </w:r>
-      <w:r>
-        <w:rPr>
-          <w:b w:val="0"/>
-          <w:i w:val="0"/>
-        </w:rPr>
-        <w:t xml:space="preserve"> Der „memory"-MCP (Wissensgraph) ist NICHT installiert und nicht nötig — claude-mem ist deine primäre Memory-Quelle (§11). EINE Quelle pro Projekt, sonst doppelte Wahrheit.</w:t>
+        <w:t>Memory-Klarstellung (seit 2026-06-10 umgedreht):</w:t>
+      </w:r>
+      <w:r>
+        <w:rPr>
+          <w:b w:val="0"/>
+          <w:i w:val="0"/>
+        </w:rPr>
+        <w:t xml:space="preserve"> Der memory-MCP (Wissensgraph) IST installiert (via ECC) und ist deine primäre Memory-Quelle; claude-mem ist deaktiviert. EINE Quelle pro Projekt, sonst doppelte Wahrheit. ⚠️ Die Graph-Datei liegt im npx-Cache (</w:t>
+      </w:r>
+      <w:r>
+        <w:rPr>
+          <w:rFonts w:ascii="Consolas" w:hAnsi="Consolas"/>
+          <w:b w:val="0"/>
+          <w:i w:val="0"/>
+          <w:sz w:val="19"/>
+        </w:rPr>
+        <w:t>~/.npm/_npx/&lt;hash&gt;/…/memory.jsonl</w:t>
+      </w:r>
+      <w:r>
+        <w:rPr>
+          <w:b w:val="0"/>
+          <w:i w:val="0"/>
+        </w:rPr>
+        <w:t xml:space="preserve">, kein MEMORY_FILE_PATH gesetzt) — kompakte Schlüssel-Fakten dort, langlebige Wahrheit zusätzlich in </w:t>
+      </w:r>
+      <w:r>
+        <w:rPr>
+          <w:rFonts w:ascii="Consolas" w:hAnsi="Consolas"/>
+          <w:b w:val="0"/>
+          <w:i w:val="0"/>
+          <w:sz w:val="19"/>
+        </w:rPr>
+        <w:t>state/</w:t>
+      </w:r>
+      <w:r>
+        <w:rPr>
+          <w:b w:val="0"/>
+          <w:i w:val="0"/>
+        </w:rPr>
+        <w:t>/Doku (Git).</w:t>
       </w:r>
     </w:p>
     <w:p>
@@ -6116,14 +6495,46 @@
           <w:b/>
           <w:i w:val="0"/>
         </w:rPr>
-        <w:t>Agenten-Zuweisungen (Default):</w:t>
-      </w:r>
-      <w:r>
-        <w:rPr>
-          <w:b w:val="0"/>
-          <w:i w:val="0"/>
-        </w:rPr>
-        <w:t xml:space="preserve"> security-reviewer → Opus (darf nichts übersehen) · architect, planner → Opus · code-reviewer, tdd-guide, build-error-resolver → Sonnet · doc-updater, code-tour → Haiku.</w:t>
+        <w:t>Agenten-Zuweisungen (automatisch!):</w:t>
+      </w:r>
+      <w:r>
+        <w:rPr>
+          <w:b w:val="0"/>
+          <w:i w:val="0"/>
+        </w:rPr>
+        <w:t xml:space="preserve"> Jeder ECC-Agent trägt sein Modell als </w:t>
+      </w:r>
+      <w:r>
+        <w:rPr>
+          <w:rFonts w:ascii="Consolas" w:hAnsi="Consolas"/>
+          <w:b w:val="0"/>
+          <w:i w:val="0"/>
+          <w:sz w:val="19"/>
+        </w:rPr>
+        <w:t>model:</w:t>
+      </w:r>
+      <w:r>
+        <w:rPr>
+          <w:b w:val="0"/>
+          <w:i w:val="0"/>
+        </w:rPr>
+        <w:t xml:space="preserve">-Frontmatter in seiner Definition — du wählst nichts: planner, architect → Opus · Reviewer, Build-Resolver, tdd-guide, security-reviewer u. a. → Sonnet · doc-updater → Haiku. Das gilt unabhängig vom Modell deiner Haupt-Session; manuell überschreiben nur bewusst (Agent-Tool-Parameter </w:t>
+      </w:r>
+      <w:r>
+        <w:rPr>
+          <w:rFonts w:ascii="Consolas" w:hAnsi="Consolas"/>
+          <w:b w:val="0"/>
+          <w:i w:val="0"/>
+          <w:sz w:val="19"/>
+        </w:rPr>
+        <w:t>model</w:t>
+      </w:r>
+      <w:r>
+        <w:rPr>
+          <w:b w:val="0"/>
+          <w:i w:val="0"/>
+        </w:rPr>
+        <w:t>).</w:t>
       </w:r>
     </w:p>
     <w:p>
@@ -6217,7 +6628,7 @@
           <w:b/>
           <w:i w:val="0"/>
         </w:rPr>
-        <w:t>claude-mem ist deine primäre, persistente Memory-Quelle:</w:t>
+        <w:t>Drei Gedächtnisse, drei Aufgaben (claude-mem ist deaktiviert):</w:t>
       </w:r>
     </w:p>
     <w:p>
@@ -6229,14 +6640,78 @@
           <w:b/>
           <w:i w:val="0"/>
         </w:rPr>
-        <w:t>Automatisch:</w:t>
-      </w:r>
-      <w:r>
-        <w:rPr>
-          <w:b w:val="0"/>
-          <w:i w:val="0"/>
-        </w:rPr>
-        <w:t xml:space="preserve"> injiziert relevanten Kontext aus früheren Sessions ab der 2. Session je Projekt — ohne Zutun.</w:t>
+        <w:t>memory-MCP (Wissensgraph, via ECC):</w:t>
+      </w:r>
+      <w:r>
+        <w:rPr>
+          <w:b w:val="0"/>
+          <w:i w:val="0"/>
+        </w:rPr>
+        <w:t xml:space="preserve"> Fakten als Entities/Relations/Observations. Aktiv nutzen: </w:t>
+      </w:r>
+      <w:r>
+        <w:rPr>
+          <w:rFonts w:ascii="Consolas" w:hAnsi="Consolas"/>
+          <w:b w:val="0"/>
+          <w:i w:val="0"/>
+          <w:sz w:val="19"/>
+        </w:rPr>
+        <w:t>search_nodes</w:t>
+      </w:r>
+      <w:r>
+        <w:rPr>
+          <w:b w:val="0"/>
+          <w:i w:val="0"/>
+        </w:rPr>
+        <w:t xml:space="preserve"> („schon gelöst?"), </w:t>
+      </w:r>
+      <w:r>
+        <w:rPr>
+          <w:rFonts w:ascii="Consolas" w:hAnsi="Consolas"/>
+          <w:b w:val="0"/>
+          <w:i w:val="0"/>
+          <w:sz w:val="19"/>
+        </w:rPr>
+        <w:t>open_nodes</w:t>
+      </w:r>
+      <w:r>
+        <w:rPr>
+          <w:b w:val="0"/>
+          <w:i w:val="0"/>
+        </w:rPr>
+        <w:t xml:space="preserve">, </w:t>
+      </w:r>
+      <w:r>
+        <w:rPr>
+          <w:rFonts w:ascii="Consolas" w:hAnsi="Consolas"/>
+          <w:b w:val="0"/>
+          <w:i w:val="0"/>
+          <w:sz w:val="19"/>
+        </w:rPr>
+        <w:t>create_entities</w:t>
+      </w:r>
+      <w:r>
+        <w:rPr>
+          <w:b w:val="0"/>
+          <w:i w:val="0"/>
+        </w:rPr>
+        <w:t>/</w:t>
+      </w:r>
+      <w:r>
+        <w:rPr>
+          <w:rFonts w:ascii="Consolas" w:hAnsi="Consolas"/>
+          <w:b w:val="0"/>
+          <w:i w:val="0"/>
+          <w:sz w:val="19"/>
+        </w:rPr>
+        <w:t>add_observations</w:t>
+      </w:r>
+      <w:r>
+        <w:rPr>
+          <w:b w:val="0"/>
+          <w:i w:val="0"/>
+        </w:rPr>
+        <w:t xml:space="preserve"> („Merke dir: …") — Claude speichert nicht alles von selbst, wichtige Entscheidungen explizit merken lassen.</w:t>
       </w:r>
     </w:p>
     <w:p>
@@ -6248,14 +6723,62 @@
           <w:b/>
           <w:i w:val="0"/>
         </w:rPr>
-        <w:t>/mem-search „…":</w:t>
-      </w:r>
-      <w:r>
-        <w:rPr>
-          <w:b w:val="0"/>
-          <w:i w:val="0"/>
-        </w:rPr>
-        <w:t xml:space="preserve"> gezielt frühere Arbeit finden („schon gelöst?", „wie haben wir X gemacht?").</w:t>
+        <w:t>Instincts (Continuous Learning):</w:t>
+      </w:r>
+      <w:r>
+        <w:rPr>
+          <w:b w:val="0"/>
+          <w:i w:val="0"/>
+        </w:rPr>
+        <w:t xml:space="preserve"> ECC sammelt Arbeitsmuster automatisch (observe-Hooks, Profil </w:t>
+      </w:r>
+      <w:r>
+        <w:rPr>
+          <w:rFonts w:ascii="Consolas" w:hAnsi="Consolas"/>
+          <w:b w:val="0"/>
+          <w:i w:val="0"/>
+          <w:sz w:val="19"/>
+        </w:rPr>
+        <w:t>standard</w:t>
+      </w:r>
+      <w:r>
+        <w:rPr>
+          <w:b w:val="0"/>
+          <w:i w:val="0"/>
+        </w:rPr>
+        <w:t xml:space="preserve">); einsehen mit </w:t>
+      </w:r>
+      <w:r>
+        <w:rPr>
+          <w:rFonts w:ascii="Consolas" w:hAnsi="Consolas"/>
+          <w:b w:val="0"/>
+          <w:i w:val="0"/>
+          <w:sz w:val="19"/>
+        </w:rPr>
+        <w:t>/instinct-status</w:t>
+      </w:r>
+      <w:r>
+        <w:rPr>
+          <w:b w:val="0"/>
+          <w:i w:val="0"/>
+        </w:rPr>
+        <w:t xml:space="preserve">, befördern mit </w:t>
+      </w:r>
+      <w:r>
+        <w:rPr>
+          <w:rFonts w:ascii="Consolas" w:hAnsi="Consolas"/>
+          <w:b w:val="0"/>
+          <w:i w:val="0"/>
+          <w:sz w:val="19"/>
+        </w:rPr>
+        <w:t>/promote</w:t>
+      </w:r>
+      <w:r>
+        <w:rPr>
+          <w:b w:val="0"/>
+          <w:i w:val="0"/>
+        </w:rPr>
+        <w:t>.</w:t>
       </w:r>
     </w:p>
     <w:p>
@@ -6267,14 +6790,30 @@
           <w:b/>
           <w:i w:val="0"/>
         </w:rPr>
-        <w:t>Erfasst von selbst:</w:t>
-      </w:r>
-      <w:r>
-        <w:rPr>
-          <w:b w:val="0"/>
-          <w:i w:val="0"/>
-        </w:rPr>
-        <w:t xml:space="preserve"> Beobachtungen/Entscheidungen werden automatisch gespeichert — kein manuelles Speichern.</w:t>
+        <w:t>state/ + WORKING-CONTEXT.md (State-Sync, Schicht 2):</w:t>
+      </w:r>
+      <w:r>
+        <w:rPr>
+          <w:b w:val="0"/>
+          <w:i w:val="0"/>
+        </w:rPr>
+        <w:t xml:space="preserve"> Projekt-Zustand, automatisch via SessionStart/Stop-Hooks in onboardeten Projekten; von Hand pflegst du </w:t>
+      </w:r>
+      <w:r>
+        <w:rPr>
+          <w:rFonts w:ascii="Consolas" w:hAnsi="Consolas"/>
+          <w:b w:val="0"/>
+          <w:i w:val="0"/>
+          <w:sz w:val="19"/>
+        </w:rPr>
+        <w:t>state/*.md</w:t>
+      </w:r>
+      <w:r>
+        <w:rPr>
+          <w:b w:val="0"/>
+          <w:i w:val="0"/>
+        </w:rPr>
+        <w:t>.</w:t>
       </w:r>
     </w:p>
     <w:p>
@@ -6501,14 +7040,14 @@
           <w:b/>
           <w:i w:val="0"/>
         </w:rPr>
-        <w:t>EINE Memory-Quelle:</w:t>
-      </w:r>
-      <w:r>
-        <w:rPr>
-          <w:b w:val="0"/>
-          <w:i w:val="0"/>
-        </w:rPr>
-        <w:t xml:space="preserve"> claude-mem ist gesetzt — den generischen „memory"-MCP NICHT zusätzlich aktivieren. Keine Secrets in Memory.</w:t>
+        <w:t>EINE Memory-Quelle je Zweck:</w:t>
+      </w:r>
+      <w:r>
+        <w:rPr>
+          <w:b w:val="0"/>
+          <w:i w:val="0"/>
+        </w:rPr>
+        <w:t xml:space="preserve"> memory-MCP für Fakten, Instincts für Muster, state/ für Projekt-Zustand — claude-mem bleibt aus. Keine Secrets in Memory.</w:t>
       </w:r>
     </w:p>
     <w:p>
@@ -7035,7 +7574,21 @@
           <w:b w:val="0"/>
           <w:i w:val="0"/>
         </w:rPr>
-        <w:t xml:space="preserve"> an Lifecycle-Events feuern (vorher prüfen/blockieren, nachher aufräumen/formatieren/protokollieren). Wichtig zu wissen: Die ECC-</w:t>
+        <w:t xml:space="preserve"> an Lifecycle-Events feuern (vorher prüfen/blockieren, nachher aufräumen/formatieren/protokollieren). Seit der Plugin-Migration registriert das </w:t>
+      </w:r>
+      <w:r>
+        <w:rPr>
+          <w:b/>
+          <w:i w:val="0"/>
+        </w:rPr>
+        <w:t>Plugin selbst</w:t>
+      </w:r>
+      <w:r>
+        <w:rPr>
+          <w:b w:val="0"/>
+          <w:i w:val="0"/>
+        </w:rPr>
+        <w:t xml:space="preserve"> seine Hooks (</w:t>
       </w:r>
       <w:r>
         <w:rPr>
@@ -7044,14 +7597,28 @@
           <w:i w:val="0"/>
           <w:sz w:val="19"/>
         </w:rPr>
-        <w:t>hooks.json</w:t>
-      </w:r>
-      <w:r>
-        <w:rPr>
-          <w:b w:val="0"/>
-          <w:i w:val="0"/>
-        </w:rPr>
-        <w:t xml:space="preserve"> enthält 20+ Hooks, aber das ECC-</w:t>
+        <w:t>hooks/hooks.json</w:t>
+      </w:r>
+      <w:r>
+        <w:rPr>
+          <w:b w:val="0"/>
+          <w:i w:val="0"/>
+        </w:rPr>
+        <w:t xml:space="preserve">, 20+ Stück); welche tatsächlich feuern, steuert das </w:t>
+      </w:r>
+      <w:r>
+        <w:rPr>
+          <w:b/>
+          <w:i w:val="0"/>
+        </w:rPr>
+        <w:t>Profil</w:t>
+      </w:r>
+      <w:r>
+        <w:rPr>
+          <w:b w:val="0"/>
+          <w:i w:val="0"/>
+        </w:rPr>
+        <w:t xml:space="preserve"> </w:t>
       </w:r>
       <w:r>
         <w:rPr>
@@ -7060,53 +7627,14 @@
           <w:i w:val="0"/>
           <w:sz w:val="19"/>
         </w:rPr>
-        <w:t>plugin.json</w:t>
-      </w:r>
-      <w:r>
-        <w:rPr>
-          <w:b w:val="0"/>
-          <w:i w:val="0"/>
-        </w:rPr>
-        <w:t xml:space="preserve"> registriert </w:t>
-      </w:r>
-      <w:r>
-        <w:rPr>
-          <w:b/>
-          <w:i w:val="0"/>
-        </w:rPr>
-        <w:t>keine</w:t>
-      </w:r>
-      <w:r>
-        <w:rPr>
-          <w:b w:val="0"/>
-          <w:i w:val="0"/>
-        </w:rPr>
-        <w:t xml:space="preserve"> Hooks automatisch — sie wurden gezielt in </w:t>
-      </w:r>
-      <w:r>
-        <w:rPr>
-          <w:rFonts w:ascii="Consolas" w:hAnsi="Consolas"/>
-          <w:b w:val="0"/>
-          <w:i w:val="0"/>
-          <w:sz w:val="19"/>
-        </w:rPr>
-        <w:t>~/.claude/settings.json</w:t>
-      </w:r>
-      <w:r>
-        <w:rPr>
-          <w:b w:val="0"/>
-          <w:i w:val="0"/>
-        </w:rPr>
-        <w:t xml:space="preserve"> aktiviert.</w:t>
-      </w:r>
-    </w:p>
-    <w:p>
-      <w:r>
-        <w:rPr>
-          <w:b/>
-          <w:i w:val="0"/>
-        </w:rPr>
-        <w:t>Global aktiv (`~/.claude/settings.json`):</w:t>
+        <w:t>ECC_HOOK_PROFILE</w:t>
+      </w:r>
+      <w:r>
+        <w:rPr>
+          <w:b w:val="0"/>
+          <w:i w:val="0"/>
+        </w:rPr>
+        <w:t xml:space="preserve"> pro Scope:</w:t>
       </w:r>
     </w:p>
     <w:tbl>
@@ -7131,7 +7659,7 @@
               <w:rPr>
                 <w:b/>
               </w:rPr>
-              <w:t>Hook-Typ</w:t>
+              <w:t>Scope</w:t>
             </w:r>
           </w:p>
         </w:tc>
@@ -7145,7 +7673,7 @@
               <w:rPr>
                 <w:b/>
               </w:rPr>
-              <w:t>IDs</w:t>
+              <w:t>Profil</w:t>
             </w:r>
           </w:p>
         </w:tc>
@@ -7159,7 +7687,7 @@
               <w:rPr>
                 <w:b/>
               </w:rPr>
-              <w:t>Zweck</w:t>
+              <w:t>Effekt</w:t>
             </w:r>
           </w:p>
         </w:tc>
@@ -7176,7 +7704,23 @@
                 <w:b w:val="0"/>
                 <w:i w:val="0"/>
               </w:rPr>
-              <w:t>PostToolUse</w:t>
+              <w:t>Global (</w:t>
+            </w:r>
+            <w:r>
+              <w:rPr>
+                <w:rFonts w:ascii="Consolas" w:hAnsi="Consolas"/>
+                <w:b w:val="0"/>
+                <w:i w:val="0"/>
+                <w:sz w:val="19"/>
+              </w:rPr>
+              <w:t>~/.claude/settings.json</w:t>
+            </w:r>
+            <w:r>
+              <w:rPr>
+                <w:b w:val="0"/>
+                <w:i w:val="0"/>
+              </w:rPr>
+              <w:t>)</w:t>
             </w:r>
           </w:p>
         </w:tc>
@@ -7191,7 +7735,7 @@
                 <w:b w:val="0"/>
                 <w:i w:val="0"/>
               </w:rPr>
-              <w:t>post:quality-gate · post:edit:accumulator · post:edit:console-warn</w:t>
+              <w:t>minimal</w:t>
             </w:r>
           </w:p>
         </w:tc>
@@ -7206,7 +7750,7 @@
                 <w:b w:val="0"/>
                 <w:i w:val="0"/>
               </w:rPr>
-              <w:t>Quality-Gate nach Edit/Write · Sammel-Formatierung merken · console.log warnen</w:t>
+              <w:t>nur Essenzielles: Metriken-Bridge, Session-Speicherung, Session-Auswertung, Kosten-Tracking, Marker</w:t>
             </w:r>
           </w:p>
         </w:tc>
@@ -7223,7 +7767,23 @@
                 <w:b w:val="0"/>
                 <w:i w:val="0"/>
               </w:rPr>
-              <w:t>Stop</w:t>
+              <w:t>Onboarded Projekt (</w:t>
+            </w:r>
+            <w:r>
+              <w:rPr>
+                <w:rFonts w:ascii="Consolas" w:hAnsi="Consolas"/>
+                <w:b w:val="0"/>
+                <w:i w:val="0"/>
+                <w:sz w:val="19"/>
+              </w:rPr>
+              <w:t>.claude/settings.json</w:t>
+            </w:r>
+            <w:r>
+              <w:rPr>
+                <w:b w:val="0"/>
+                <w:i w:val="0"/>
+              </w:rPr>
+              <w:t>)</w:t>
             </w:r>
           </w:p>
         </w:tc>
@@ -7238,7 +7798,7 @@
                 <w:b w:val="0"/>
                 <w:i w:val="0"/>
               </w:rPr>
-              <w:t>stop:format-typecheck · stop:check-console-log · stop:session-end</w:t>
+              <w:t>standard</w:t>
             </w:r>
           </w:p>
         </w:tc>
@@ -7253,7 +7813,7 @@
                 <w:b w:val="0"/>
                 <w:i w:val="0"/>
               </w:rPr>
-              <w:t>Format+Typecheck · console.log prüfen · Session sichern</w:t>
+              <w:t>volle Pipeline: quality-gate, console-warn, observe/continuous-learning, governance, context-monitor …</w:t>
             </w:r>
           </w:p>
         </w:tc>
@@ -7270,7 +7830,7 @@
                 <w:b w:val="0"/>
                 <w:i w:val="0"/>
               </w:rPr>
-              <w:t>SessionStart</w:t>
+              <w:t>(nirgends aktiv)</w:t>
             </w:r>
           </w:p>
         </w:tc>
@@ -7285,7 +7845,7 @@
                 <w:b w:val="0"/>
                 <w:i w:val="0"/>
               </w:rPr>
-              <w:t>session:start (Bootstrap)</w:t>
+              <w:t>strict</w:t>
             </w:r>
           </w:p>
         </w:tc>
@@ -7300,60 +7860,22 @@
                 <w:b w:val="0"/>
                 <w:i w:val="0"/>
               </w:rPr>
-              <w:t>vorigen Kontext laden, Paketmanager erkennen</w:t>
-            </w:r>
-          </w:p>
-        </w:tc>
-      </w:tr>
-      <w:tr>
-        <w:tc>
-          <w:tcPr>
-            <w:tcW w:type="dxa" w:w="2880"/>
-          </w:tcPr>
-          <w:p>
-            <w:r/>
-            <w:r>
-              <w:rPr>
-                <w:b w:val="0"/>
-                <w:i w:val="0"/>
-              </w:rPr>
-              <w:t>PreCompact</w:t>
-            </w:r>
-          </w:p>
-        </w:tc>
-        <w:tc>
-          <w:tcPr>
-            <w:tcW w:type="dxa" w:w="2880"/>
-          </w:tcPr>
-          <w:p>
-            <w:r/>
-            <w:r>
-              <w:rPr>
-                <w:b w:val="0"/>
-                <w:i w:val="0"/>
-              </w:rPr>
-              <w:t>pre:compact</w:t>
-            </w:r>
-          </w:p>
-        </w:tc>
-        <w:tc>
-          <w:tcPr>
-            <w:tcW w:type="dxa" w:w="2880"/>
-          </w:tcPr>
-          <w:p>
-            <w:r/>
-            <w:r>
-              <w:rPr>
-                <w:b w:val="0"/>
-                <w:i w:val="0"/>
-              </w:rPr>
-              <w:t>State sichern vor Kontext-Kompaktierung</w:t>
+              <w:t>wie standard + 3 Nag-Erinnerungen (tmux, git-push, commit-quality)</w:t>
             </w:r>
           </w:p>
         </w:tc>
       </w:tr>
     </w:tbl>
     <w:p/>
+    <w:p>
+      <w:r>
+        <w:rPr>
+          <w:b w:val="0"/>
+          <w:i w:val="0"/>
+        </w:rPr>
+        <w:t>Dazu laufen wenige DIRECT-Hooks (Stop: format-typecheck · check-console-log · session-end) überall, no-oppen sich aber ohne relevante Arbeit selbst.</w:t>
+      </w:r>
+    </w:p>
     <w:p>
       <w:r>
         <w:rPr>
@@ -7527,7 +8049,7 @@
           <w:b w:val="0"/>
           <w:i w:val="0"/>
         </w:rPr>
-        <w:t xml:space="preserve"> </w:t>
+        <w:t xml:space="preserve"> GateGuard via </w:t>
       </w:r>
       <w:r>
         <w:rPr>
@@ -7536,78 +8058,14 @@
           <w:i w:val="0"/>
           <w:sz w:val="19"/>
         </w:rPr>
-        <w:t>pre:bash:gateguard-fact-force</w:t>
-      </w:r>
-      <w:r>
-        <w:rPr>
-          <w:b w:val="0"/>
-          <w:i w:val="0"/>
-        </w:rPr>
-        <w:t xml:space="preserve"> und </w:t>
-      </w:r>
-      <w:r>
-        <w:rPr>
-          <w:rFonts w:ascii="Consolas" w:hAnsi="Consolas"/>
-          <w:b w:val="0"/>
-          <w:i w:val="0"/>
-          <w:sz w:val="19"/>
-        </w:rPr>
-        <w:t>pre:edit-write:gateguard-fact-force</w:t>
-      </w:r>
-      <w:r>
-        <w:rPr>
-          <w:b w:val="0"/>
-          <w:i w:val="0"/>
-        </w:rPr>
-        <w:t xml:space="preserve"> (GateGuard) via </w:t>
-      </w:r>
-      <w:r>
-        <w:rPr>
-          <w:rFonts w:ascii="Consolas" w:hAnsi="Consolas"/>
-          <w:b w:val="0"/>
-          <w:i w:val="0"/>
-          <w:sz w:val="19"/>
-        </w:rPr>
-        <w:t>ECC_DISABLED_HOOKS</w:t>
-      </w:r>
-      <w:r>
-        <w:rPr>
-          <w:b w:val="0"/>
-          <w:i w:val="0"/>
-        </w:rPr>
-        <w:t xml:space="preserve"> — würden die erste Änderung pro Datei blockieren und Recherche erzwingen (beim normalen Arbeiten störend). Hook-Profil bleibt </w:t>
-      </w:r>
-      <w:r>
-        <w:rPr>
-          <w:rFonts w:ascii="Consolas" w:hAnsi="Consolas"/>
-          <w:b w:val="0"/>
-          <w:i w:val="0"/>
-          <w:sz w:val="19"/>
-        </w:rPr>
-        <w:t>standard</w:t>
-      </w:r>
-      <w:r>
-        <w:rPr>
-          <w:b w:val="0"/>
-          <w:i w:val="0"/>
-        </w:rPr>
-        <w:t xml:space="preserve">: alle nützlichen Hooks laufen weiter; </w:t>
-      </w:r>
-      <w:r>
-        <w:rPr>
-          <w:rFonts w:ascii="Consolas" w:hAnsi="Consolas"/>
-          <w:b w:val="0"/>
-          <w:i w:val="0"/>
-          <w:sz w:val="19"/>
-        </w:rPr>
-        <w:t>strict</w:t>
-      </w:r>
-      <w:r>
-        <w:rPr>
-          <w:b w:val="0"/>
-          <w:i w:val="0"/>
-        </w:rPr>
-        <w:t xml:space="preserve"> brächte nur drei zusätzliche Nag-Erinnerungen (tmux, git-push, commit-quality).</w:t>
+        <w:t>ECC_GATEGUARD=off</w:t>
+      </w:r>
+      <w:r>
+        <w:rPr>
+          <w:b w:val="0"/>
+          <w:i w:val="0"/>
+        </w:rPr>
+        <w:t xml:space="preserve"> (global) — würde die erste Änderung pro Datei blockieren und Recherche erzwingen (beim normalen Arbeiten störend).</w:t>
       </w:r>
     </w:p>
     <w:p>
@@ -7648,6 +8106,38 @@
           <w:i w:val="0"/>
           <w:sz w:val="19"/>
         </w:rPr>
+        <w:t>ECC_GATEGUARD=off</w:t>
+      </w:r>
+      <w:r>
+        <w:rPr>
+          <w:b w:val="0"/>
+          <w:i w:val="0"/>
+        </w:rPr>
+        <w:t xml:space="preserve"> (GateGuard aus) · </w:t>
+      </w:r>
+      <w:r>
+        <w:rPr>
+          <w:rFonts w:ascii="Consolas" w:hAnsi="Consolas"/>
+          <w:b w:val="0"/>
+          <w:i w:val="0"/>
+          <w:sz w:val="19"/>
+        </w:rPr>
+        <w:t>ECC_GOVERNANCE_CAPTURE=1</w:t>
+      </w:r>
+      <w:r>
+        <w:rPr>
+          <w:b w:val="0"/>
+          <w:i w:val="0"/>
+        </w:rPr>
+        <w:t xml:space="preserve"> (Governance-Hooks scharf) · </w:t>
+      </w:r>
+      <w:r>
+        <w:rPr>
+          <w:rFonts w:ascii="Consolas" w:hAnsi="Consolas"/>
+          <w:b w:val="0"/>
+          <w:i w:val="0"/>
+          <w:sz w:val="19"/>
+        </w:rPr>
         <w:t>ECC_DISABLED_HOOKS</w:t>
       </w:r>
       <w:r>
@@ -7655,23 +8145,14 @@
           <w:b w:val="0"/>
           <w:i w:val="0"/>
         </w:rPr>
-        <w:t xml:space="preserve"> (gezielt abschalten) · </w:t>
-      </w:r>
-      <w:r>
-        <w:rPr>
-          <w:rFonts w:ascii="Consolas" w:hAnsi="Consolas"/>
-          <w:b w:val="0"/>
-          <w:i w:val="0"/>
-          <w:sz w:val="19"/>
-        </w:rPr>
-        <w:t>ECC_GOVERNANCE_CAPTURE=1</w:t>
-      </w:r>
-      <w:r>
-        <w:rPr>
-          <w:b w:val="0"/>
-          <w:i w:val="0"/>
-        </w:rPr>
-        <w:t xml:space="preserve"> (Governance-Hooks scharf).</w:t>
+        <w:t xml:space="preserve"> (gezielte ID-Liste, bei dir nicht mehr genutzt). </w:t>
+      </w:r>
+      <w:r>
+        <w:rPr>
+          <w:b/>
+          <w:i w:val="0"/>
+        </w:rPr>
+        <w:t>Wirkung erst in frischer Session.</w:t>
       </w:r>
     </w:p>
     <w:p>
@@ -8193,7 +8674,7 @@
           <w:b w:val="0"/>
           <w:i w:val="0"/>
         </w:rPr>
-        <w:t xml:space="preserve"> (</w:t>
+        <w:t xml:space="preserve"> — Core isoliert im Plugin-Cache (</w:t>
       </w:r>
       <w:r>
         <w:rPr>
@@ -8202,30 +8683,28 @@
           <w:i w:val="0"/>
           <w:sz w:val="19"/>
         </w:rPr>
-        <w:t>rules/ecc/</w:t>
-      </w:r>
-      <w:r>
-        <w:rPr>
-          <w:b w:val="0"/>
-          <w:i w:val="0"/>
-        </w:rPr>
-        <w:t xml:space="preserve">, </w:t>
-      </w:r>
-      <w:r>
-        <w:rPr>
-          <w:rFonts w:ascii="Consolas" w:hAnsi="Consolas"/>
-          <w:b w:val="0"/>
-          <w:i w:val="0"/>
-          <w:sz w:val="19"/>
-        </w:rPr>
-        <w:t>skills/ecc/</w:t>
-      </w:r>
-      <w:r>
-        <w:rPr>
-          <w:b w:val="0"/>
-          <w:i w:val="0"/>
-        </w:rPr>
-        <w:t>) — keine Kollision mit Eigenem.</w:t>
+        <w:t>ecc@ecc</w:t>
+      </w:r>
+      <w:r>
+        <w:rPr>
+          <w:b w:val="0"/>
+          <w:i w:val="0"/>
+        </w:rPr>
+        <w:t xml:space="preserve">), global verfügbar; </w:t>
+      </w:r>
+      <w:r>
+        <w:rPr>
+          <w:b/>
+          <w:i w:val="0"/>
+        </w:rPr>
+        <w:t>kein</w:t>
+      </w:r>
+      <w:r>
+        <w:rPr>
+          <w:b w:val="0"/>
+          <w:i w:val="0"/>
+        </w:rPr>
+        <w:t xml:space="preserve"> Projekt-Vendoring (slim/plugin-only) — keine Kollision mit Eigenem.</w:t>
       </w:r>
     </w:p>
     <w:p>
@@ -8661,7 +9140,7 @@
           <w:rFonts w:ascii="Consolas" w:hAnsi="Consolas"/>
           <w:sz w:val="18"/>
         </w:rPr>
-        <w:t>cd "/root/projekte/Claude Code BestPractice/ecc"</w:t>
+        <w:t># Plugin-Pfad (Single Source, read-only behandeln):</w:t>
       </w:r>
     </w:p>
     <w:p>
@@ -8673,7 +9152,7 @@
           <w:rFonts w:ascii="Consolas" w:hAnsi="Consolas"/>
           <w:sz w:val="18"/>
         </w:rPr>
-        <w:t>node scripts/ecc.js doctor          # Health-Check (claude-home: OK)</w:t>
+        <w:t>ECC=~/.claude/plugins/cache/ecc/ecc/2.0.0-rc.1</w:t>
       </w:r>
     </w:p>
     <w:p>
@@ -8685,7 +9164,7 @@
           <w:rFonts w:ascii="Consolas" w:hAnsi="Consolas"/>
           <w:sz w:val="18"/>
         </w:rPr>
-        <w:t>node scripts/ecc.js list-installed  # was ist installiert</w:t>
+        <w:t xml:space="preserve"> </w:t>
       </w:r>
     </w:p>
     <w:p>
@@ -8697,7 +9176,7 @@
           <w:rFonts w:ascii="Consolas" w:hAnsi="Consolas"/>
           <w:sz w:val="18"/>
         </w:rPr>
-        <w:t>node scripts/ecc.js repair          # ECC-Dateien wiederherstellen</w:t>
+        <w:t>node "$ECC/scripts/harness-audit.js"   # Repo-Integritäts-Audit</w:t>
       </w:r>
     </w:p>
     <w:p>
@@ -8709,7 +9188,7 @@
           <w:rFonts w:ascii="Consolas" w:hAnsi="Consolas"/>
           <w:sz w:val="18"/>
         </w:rPr>
-        <w:t>npx ecc consult "security reviews"  # Advisor: welche Komponenten?</w:t>
+        <w:t>node "$ECC/scripts/ecc.js" doctor      # Health-Check</w:t>
       </w:r>
     </w:p>
     <w:p>
@@ -8733,7 +9212,7 @@
           <w:rFonts w:ascii="Consolas" w:hAnsi="Consolas"/>
           <w:sz w:val="18"/>
         </w:rPr>
-        <w:t># Re-Install / Update VPS-weit:</w:t>
+        <w:t># ECC-Update: in ~/.claude/settings.json den Tag anheben …</w:t>
       </w:r>
     </w:p>
     <w:p>
@@ -8745,10 +9224,22 @@
           <w:rFonts w:ascii="Consolas" w:hAnsi="Consolas"/>
           <w:sz w:val="18"/>
         </w:rPr>
-        <w:t>cd "/root/projekte/Claude Code BestPractice" &amp;&amp; ./install-vps.sh</w:t>
+        <w:t>#   extraKnownMarketplaces.ecc.source.ref = "v&lt;neue-version&gt;"</w:t>
       </w:r>
     </w:p>
     <w:p>
+      <w:pPr>
+        <w:shd w:val="clear" w:fill="F4F6F8"/>
+      </w:pPr>
+      <w:r>
+        <w:rPr>
+          <w:rFonts w:ascii="Consolas" w:hAnsi="Consolas"/>
+          <w:sz w:val="18"/>
+        </w:rPr>
+        <w:t># … dann Claude Code neu starten (Plugin wird neu gecacht).</w:t>
+      </w:r>
+    </w:p>
+    <w:p>
       <w:r>
         <w:rPr>
           <w:b w:val="0"/>
@@ -8834,7 +9325,37 @@
           <w:b w:val="0"/>
           <w:i w:val="0"/>
         </w:rPr>
-        <w:t>.</w:t>
+        <w:t xml:space="preserve">. ⚠️ Plugin-/Settings-Änderungen greifen erst nach </w:t>
+      </w:r>
+      <w:r>
+        <w:rPr>
+          <w:b/>
+          <w:i w:val="0"/>
+        </w:rPr>
+        <w:t>Neustart von Claude Code</w:t>
+      </w:r>
+      <w:r>
+        <w:rPr>
+          <w:b w:val="0"/>
+          <w:i w:val="0"/>
+        </w:rPr>
+        <w:t xml:space="preserve"> (</w:t>
+      </w:r>
+      <w:r>
+        <w:rPr>
+          <w:rFonts w:ascii="Consolas" w:hAnsi="Consolas"/>
+          <w:b w:val="0"/>
+          <w:i w:val="0"/>
+          <w:sz w:val="19"/>
+        </w:rPr>
+        <w:t>/clear</w:t>
+      </w:r>
+      <w:r>
+        <w:rPr>
+          <w:b w:val="0"/>
+          <w:i w:val="0"/>
+        </w:rPr>
+        <w:t xml:space="preserve"> reicht nicht).</w:t>
       </w:r>
     </w:p>
     <w:p>
@@ -8867,23 +9388,7 @@
           <w:b w:val="0"/>
           <w:i w:val="0"/>
         </w:rPr>
-        <w:t xml:space="preserve"> als Planungs-Vorstufe bereit — rein additiv. Der ECC-Core (</w:t>
-      </w:r>
-      <w:r>
-        <w:rPr>
-          <w:rFonts w:ascii="Consolas" w:hAnsi="Consolas"/>
-          <w:b w:val="0"/>
-          <w:i w:val="0"/>
-          <w:sz w:val="19"/>
-        </w:rPr>
-        <w:t>ecc/</w:t>
-      </w:r>
-      <w:r>
-        <w:rPr>
-          <w:b w:val="0"/>
-          <w:i w:val="0"/>
-        </w:rPr>
-        <w:t>) bleibt unverändert.</w:t>
+        <w:t xml:space="preserve"> als Planungs-Vorstufe bereit — rein additiv. Der ECC-Core (das globale Plugin) bleibt unverändert.</w:t>
       </w:r>
     </w:p>
     <w:p>
@@ -9542,7 +10047,7 @@
           <w:b w:val="0"/>
           <w:i w:val="0"/>
         </w:rPr>
-        <w:t xml:space="preserve">. </w:t>
+        <w:t xml:space="preserve">; am Plugin unter </w:t>
       </w:r>
       <w:r>
         <w:rPr>
@@ -9551,30 +10056,14 @@
           <w:i w:val="0"/>
           <w:sz w:val="19"/>
         </w:rPr>
-        <w:t>git diff</w:t>
-      </w:r>
-      <w:r>
-        <w:rPr>
-          <w:b w:val="0"/>
-          <w:i w:val="0"/>
-        </w:rPr>
-        <w:t xml:space="preserve"> zeigt keine Änderung unter </w:t>
-      </w:r>
-      <w:r>
-        <w:rPr>
-          <w:rFonts w:ascii="Consolas" w:hAnsi="Consolas"/>
-          <w:b w:val="0"/>
-          <w:i w:val="0"/>
-          <w:sz w:val="19"/>
-        </w:rPr>
-        <w:t>ecc/</w:t>
-      </w:r>
-      <w:r>
-        <w:rPr>
-          <w:b w:val="0"/>
-          <w:i w:val="0"/>
-        </w:rPr>
-        <w:t xml:space="preserve">. Tiefe Doku: </w:t>
+        <w:t>~/.claude/plugins/cache/ecc/</w:t>
+      </w:r>
+      <w:r>
+        <w:rPr>
+          <w:b w:val="0"/>
+          <w:i w:val="0"/>
+        </w:rPr>
+        <w:t xml:space="preserve"> wird nie gepatcht. Tiefe Doku: </w:t>
       </w:r>
       <w:r>
         <w:rPr>
@@ -9598,7 +10087,7 @@
         <w:pStyle w:val="Heading1"/>
       </w:pPr>
       <w:r>
-        <w:t>20 · Aktivierungs-Status &amp; behobene Bugs (Stand 2026-06-05)</w:t>
+        <w:t>20 · Aktivierungs-Status (Stand 2026-06-10 — Plugin-only-Migration)</w:t>
       </w:r>
     </w:p>
     <w:p>
@@ -9607,35 +10096,53 @@
           <w:b w:val="0"/>
           <w:i w:val="0"/>
         </w:rPr>
-        <w:t xml:space="preserve">Das BestPractice-Repo selbst ist </w:t>
+        <w:t xml:space="preserve">Die Migration auf </w:t>
       </w:r>
       <w:r>
         <w:rPr>
           <w:b/>
           <w:i w:val="0"/>
         </w:rPr>
-        <w:t>onboardet</w:t>
-      </w:r>
-      <w:r>
-        <w:rPr>
-          <w:b w:val="0"/>
-          <w:i w:val="0"/>
-        </w:rPr>
-        <w:t xml:space="preserve"> und die Schicht-2-Mechanik ist </w:t>
-      </w:r>
-      <w:r>
-        <w:rPr>
-          <w:b/>
-          <w:i w:val="0"/>
-        </w:rPr>
-        <w:t>scharf</w:t>
-      </w:r>
-      <w:r>
-        <w:rPr>
-          <w:b w:val="0"/>
-          <w:i w:val="0"/>
-        </w:rPr>
-        <w:t>:</w:t>
+        <w:t>Plugin-only</w:t>
+      </w:r>
+      <w:r>
+        <w:rPr>
+          <w:b w:val="0"/>
+          <w:i w:val="0"/>
+        </w:rPr>
+        <w:t xml:space="preserve"> ist abgeschlossen (Commits </w:t>
+      </w:r>
+      <w:r>
+        <w:rPr>
+          <w:rFonts w:ascii="Consolas" w:hAnsi="Consolas"/>
+          <w:b w:val="0"/>
+          <w:i w:val="0"/>
+          <w:sz w:val="19"/>
+        </w:rPr>
+        <w:t>d99f3d0</w:t>
+      </w:r>
+      <w:r>
+        <w:rPr>
+          <w:b w:val="0"/>
+          <w:i w:val="0"/>
+        </w:rPr>
+        <w:t xml:space="preserve"> + </w:t>
+      </w:r>
+      <w:r>
+        <w:rPr>
+          <w:rFonts w:ascii="Consolas" w:hAnsi="Consolas"/>
+          <w:b w:val="0"/>
+          <w:i w:val="0"/>
+          <w:sz w:val="19"/>
+        </w:rPr>
+        <w:t>8293011</w:t>
+      </w:r>
+      <w:r>
+        <w:rPr>
+          <w:b w:val="0"/>
+          <w:i w:val="0"/>
+        </w:rPr>
+        <w:t>):</w:t>
       </w:r>
     </w:p>
     <w:p>
@@ -9647,7 +10154,7 @@
           <w:b/>
           <w:i w:val="0"/>
         </w:rPr>
-        <w:t>State-Sync aktiv (Variante A, projekt-lokal):</w:t>
+        <w:t>ECC-Core = globales Plugin</w:t>
       </w:r>
       <w:r>
         <w:rPr>
@@ -9663,14 +10170,14 @@
           <w:i w:val="0"/>
           <w:sz w:val="19"/>
         </w:rPr>
-        <w:t>.claude/settings.json</w:t>
-      </w:r>
-      <w:r>
-        <w:rPr>
-          <w:b w:val="0"/>
-          <w:i w:val="0"/>
-        </w:rPr>
-        <w:t xml:space="preserve"> enthält additiv </w:t>
+        <w:t>ecc@ecc</w:t>
+      </w:r>
+      <w:r>
+        <w:rPr>
+          <w:b w:val="0"/>
+          <w:i w:val="0"/>
+        </w:rPr>
+        <w:t xml:space="preserve"> 2.0.0-rc.1, gepinnt auf GitHub </w:t>
       </w:r>
       <w:r>
         <w:rPr>
@@ -9679,14 +10186,14 @@
           <w:i w:val="0"/>
           <w:sz w:val="19"/>
         </w:rPr>
-        <w:t>SessionStart→pre</w:t>
-      </w:r>
-      <w:r>
-        <w:rPr>
-          <w:b w:val="0"/>
-          <w:i w:val="0"/>
-        </w:rPr>
-        <w:t xml:space="preserve">, </w:t>
+        <w:t>affaan-m/ECC</w:t>
+      </w:r>
+      <w:r>
+        <w:rPr>
+          <w:b w:val="0"/>
+          <w:i w:val="0"/>
+        </w:rPr>
+        <w:t xml:space="preserve"> Tag </w:t>
       </w:r>
       <w:r>
         <w:rPr>
@@ -9695,14 +10202,14 @@
           <w:i w:val="0"/>
           <w:sz w:val="19"/>
         </w:rPr>
-        <w:t>Stop→post</w:t>
-      </w:r>
-      <w:r>
-        <w:rPr>
-          <w:b w:val="0"/>
-          <w:i w:val="0"/>
-        </w:rPr>
-        <w:t xml:space="preserve">, </w:t>
+        <w:t>v2.0.0-rc.1</w:t>
+      </w:r>
+      <w:r>
+        <w:rPr>
+          <w:b w:val="0"/>
+          <w:i w:val="0"/>
+        </w:rPr>
+        <w:t xml:space="preserve"> (</w:t>
       </w:r>
       <w:r>
         <w:rPr>
@@ -9711,14 +10218,14 @@
           <w:i w:val="0"/>
           <w:sz w:val="19"/>
         </w:rPr>
-        <w:t>PreCompact→post</w:t>
-      </w:r>
-      <w:r>
-        <w:rPr>
-          <w:b w:val="0"/>
-          <w:i w:val="0"/>
-        </w:rPr>
-        <w:t xml:space="preserve"> (Aufruf </w:t>
+        <w:t>extraKnownMarketplaces</w:t>
+      </w:r>
+      <w:r>
+        <w:rPr>
+          <w:b w:val="0"/>
+          <w:i w:val="0"/>
+        </w:rPr>
+        <w:t xml:space="preserve"> in </w:t>
       </w:r>
       <w:r>
         <w:rPr>
@@ -9727,14 +10234,14 @@
           <w:i w:val="0"/>
           <w:sz w:val="19"/>
         </w:rPr>
-        <w:t>bestpractice-extras/scripts/state-sync/state-sync.js</w:t>
-      </w:r>
-      <w:r>
-        <w:rPr>
-          <w:b w:val="0"/>
-          <w:i w:val="0"/>
-        </w:rPr>
-        <w:t xml:space="preserve">). Der </w:t>
+        <w:t>~/.claude/settings.json</w:t>
+      </w:r>
+      <w:r>
+        <w:rPr>
+          <w:b w:val="0"/>
+          <w:i w:val="0"/>
+        </w:rPr>
+        <w:t xml:space="preserve">). Vendored </w:t>
       </w:r>
       <w:r>
         <w:rPr>
@@ -9750,7 +10257,7 @@
           <w:b w:val="0"/>
           <w:i w:val="0"/>
         </w:rPr>
-        <w:t xml:space="preserve">-Schreibguard bleibt unberührt. </w:t>
+        <w:t xml:space="preserve"> im Repo und der 213-MB-Klon </w:t>
       </w:r>
       <w:r>
         <w:rPr>
@@ -9759,30 +10266,14 @@
           <w:i w:val="0"/>
           <w:sz w:val="19"/>
         </w:rPr>
-        <w:t>state/{context,decisions,progress,tasks}.md</w:t>
-      </w:r>
-      <w:r>
-        <w:rPr>
-          <w:b w:val="0"/>
-          <w:i w:val="0"/>
-        </w:rPr>
-        <w:t xml:space="preserve"> ist befüllt, </w:t>
-      </w:r>
-      <w:r>
-        <w:rPr>
-          <w:rFonts w:ascii="Consolas" w:hAnsi="Consolas"/>
-          <w:b w:val="0"/>
-          <w:i w:val="0"/>
-          <w:sz w:val="19"/>
-        </w:rPr>
-        <w:t>WORKING-CONTEXT.md</w:t>
-      </w:r>
-      <w:r>
-        <w:rPr>
-          <w:b w:val="0"/>
-          <w:i w:val="0"/>
-        </w:rPr>
-        <w:t xml:space="preserve"> wird beim Session-Start aus state/ gespiegelt.</w:t>
+        <w:t>/root/projekte/ECC</w:t>
+      </w:r>
+      <w:r>
+        <w:rPr>
+          <w:b w:val="0"/>
+          <w:i w:val="0"/>
+        </w:rPr>
+        <w:t xml:space="preserve"> sind gelöscht.</w:t>
       </w:r>
     </w:p>
     <w:p>
@@ -9794,14 +10285,110 @@
           <w:b/>
           <w:i w:val="0"/>
         </w:rPr>
-        <w:t>Globale `ecc-onboard.md`-Drift behoben:</w:t>
-      </w:r>
-      <w:r>
-        <w:rPr>
-          <w:b w:val="0"/>
-          <w:i w:val="0"/>
-        </w:rPr>
-        <w:t xml:space="preserve"> war veraltet (6,3 K ohne Schritt 4b/4c); jetzt = Repo-Version (13 K mit State-Sync-Verdrahtung + consumer-scaffold).</w:t>
+        <w:t>ECC-Duplikate im Home entfernt:</w:t>
+      </w:r>
+      <w:r>
+        <w:rPr>
+          <w:b w:val="0"/>
+          <w:i w:val="0"/>
+        </w:rPr>
+        <w:t xml:space="preserve"> globale Rules- (117 Dateien, verursachten Auto-Compact), Hooks- und Skills-Kopien sind weg — das Plugin liefert alles. Geblieben: 3 Schicht-2-Command-Symlinks (</w:t>
+      </w:r>
+      <w:r>
+        <w:rPr>
+          <w:rFonts w:ascii="Consolas" w:hAnsi="Consolas"/>
+          <w:b w:val="0"/>
+          <w:i w:val="0"/>
+          <w:sz w:val="19"/>
+        </w:rPr>
+        <w:t>start</w:t>
+      </w:r>
+      <w:r>
+        <w:rPr>
+          <w:b w:val="0"/>
+          <w:i w:val="0"/>
+        </w:rPr>
+        <w:t xml:space="preserve">, </w:t>
+      </w:r>
+      <w:r>
+        <w:rPr>
+          <w:rFonts w:ascii="Consolas" w:hAnsi="Consolas"/>
+          <w:b w:val="0"/>
+          <w:i w:val="0"/>
+          <w:sz w:val="19"/>
+        </w:rPr>
+        <w:t>mega-plan</w:t>
+      </w:r>
+      <w:r>
+        <w:rPr>
+          <w:b w:val="0"/>
+          <w:i w:val="0"/>
+        </w:rPr>
+        <w:t xml:space="preserve">, </w:t>
+      </w:r>
+      <w:r>
+        <w:rPr>
+          <w:rFonts w:ascii="Consolas" w:hAnsi="Consolas"/>
+          <w:b w:val="0"/>
+          <w:i w:val="0"/>
+          <w:sz w:val="19"/>
+        </w:rPr>
+        <w:t>ecc-onboard</w:t>
+      </w:r>
+      <w:r>
+        <w:rPr>
+          <w:b w:val="0"/>
+          <w:i w:val="0"/>
+        </w:rPr>
+        <w:t xml:space="preserve">), </w:t>
+      </w:r>
+      <w:r>
+        <w:rPr>
+          <w:rFonts w:ascii="Consolas" w:hAnsi="Consolas"/>
+          <w:b w:val="0"/>
+          <w:i w:val="0"/>
+          <w:sz w:val="19"/>
+        </w:rPr>
+        <w:t>skills/learned</w:t>
+      </w:r>
+      <w:r>
+        <w:rPr>
+          <w:b w:val="0"/>
+          <w:i w:val="0"/>
+        </w:rPr>
+        <w:t xml:space="preserve">, </w:t>
+      </w:r>
+      <w:r>
+        <w:rPr>
+          <w:rFonts w:ascii="Consolas" w:hAnsi="Consolas"/>
+          <w:b w:val="0"/>
+          <w:i w:val="0"/>
+          <w:sz w:val="19"/>
+        </w:rPr>
+        <w:t>skills/system-architektur</w:t>
+      </w:r>
+      <w:r>
+        <w:rPr>
+          <w:b w:val="0"/>
+          <w:i w:val="0"/>
+        </w:rPr>
+        <w:t xml:space="preserve">, </w:t>
+      </w:r>
+      <w:r>
+        <w:rPr>
+          <w:rFonts w:ascii="Consolas" w:hAnsi="Consolas"/>
+          <w:b w:val="0"/>
+          <w:i w:val="0"/>
+          <w:sz w:val="19"/>
+        </w:rPr>
+        <w:t>rules/ecc-extras/</w:t>
+      </w:r>
+      <w:r>
+        <w:rPr>
+          <w:b w:val="0"/>
+          <w:i w:val="0"/>
+        </w:rPr>
+        <w:t>.</w:t>
       </w:r>
     </w:p>
     <w:p>
@@ -9813,110 +10400,28 @@
           <w:b/>
           <w:i w:val="0"/>
         </w:rPr>
-        <w:t>Global gelayerte Extras erweitert:</w:t>
-      </w:r>
-      <w:r>
-        <w:rPr>
-          <w:b w:val="0"/>
-          <w:i w:val="0"/>
-        </w:rPr>
-        <w:t xml:space="preserve"> rpi-Advisors (</w:t>
-      </w:r>
-      <w:r>
-        <w:rPr>
-          <w:rFonts w:ascii="Consolas" w:hAnsi="Consolas"/>
-          <w:b w:val="0"/>
-          <w:i w:val="0"/>
-          <w:sz w:val="19"/>
-        </w:rPr>
-        <w:t>~/.claude/agents/</w:t>
-      </w:r>
-      <w:r>
-        <w:rPr>
-          <w:b w:val="0"/>
-          <w:i w:val="0"/>
-        </w:rPr>
-        <w:t xml:space="preserve">), </w:t>
-      </w:r>
-      <w:r>
-        <w:rPr>
-          <w:rFonts w:ascii="Consolas" w:hAnsi="Consolas"/>
-          <w:b w:val="0"/>
-          <w:i w:val="0"/>
-          <w:sz w:val="19"/>
-        </w:rPr>
-        <w:t>attribution-policy.md</w:t>
-      </w:r>
-      <w:r>
-        <w:rPr>
-          <w:b w:val="0"/>
-          <w:i w:val="0"/>
-        </w:rPr>
-        <w:t xml:space="preserve"> (</w:t>
-      </w:r>
-      <w:r>
-        <w:rPr>
-          <w:rFonts w:ascii="Consolas" w:hAnsi="Consolas"/>
-          <w:b w:val="0"/>
-          <w:i w:val="0"/>
-          <w:sz w:val="19"/>
-        </w:rPr>
-        <w:t>~/.claude/rules/ecc-extras/</w:t>
-      </w:r>
-      <w:r>
-        <w:rPr>
-          <w:b w:val="0"/>
-          <w:i w:val="0"/>
-        </w:rPr>
-        <w:t xml:space="preserve">), Dynamic-Context-Profile </w:t>
-      </w:r>
-      <w:r>
-        <w:rPr>
-          <w:rFonts w:ascii="Consolas" w:hAnsi="Consolas"/>
-          <w:b w:val="0"/>
-          <w:i w:val="0"/>
-          <w:sz w:val="19"/>
-        </w:rPr>
-        <w:t>contexts/{dev,review}.md</w:t>
-      </w:r>
-      <w:r>
-        <w:rPr>
-          <w:b w:val="0"/>
-          <w:i w:val="0"/>
-        </w:rPr>
-        <w:t xml:space="preserve"> (</w:t>
-      </w:r>
-      <w:r>
-        <w:rPr>
-          <w:rFonts w:ascii="Consolas" w:hAnsi="Consolas"/>
-          <w:b w:val="0"/>
-          <w:i w:val="0"/>
-          <w:sz w:val="19"/>
-        </w:rPr>
-        <w:t>~/.claude/contexts/</w:t>
-      </w:r>
-      <w:r>
-        <w:rPr>
-          <w:b w:val="0"/>
-          <w:i w:val="0"/>
-        </w:rPr>
-        <w:t xml:space="preserve">). </w:t>
-      </w:r>
-      <w:r>
-        <w:rPr>
-          <w:rFonts w:ascii="Consolas" w:hAnsi="Consolas"/>
-          <w:b w:val="0"/>
-          <w:i w:val="0"/>
-          <w:sz w:val="19"/>
-        </w:rPr>
-        <w:t>install-vps.sh</w:t>
-      </w:r>
-      <w:r>
-        <w:rPr>
-          <w:b w:val="0"/>
-          <w:i w:val="0"/>
-        </w:rPr>
-        <w:t xml:space="preserve"> deployt das künftig automatisch.</w:t>
+        <w:t>Abgelöst (Plugins auf `false`):</w:t>
+      </w:r>
+      <w:r>
+        <w:rPr>
+          <w:b w:val="0"/>
+          <w:i w:val="0"/>
+        </w:rPr>
+        <w:t xml:space="preserve"> claude-mem → memory-MCP + Instincts + /save-session · superpowers → ECC-Workflows · context7@official + feature-dev → ECC-Pendants. ⚠️ Greift erst nach </w:t>
+      </w:r>
+      <w:r>
+        <w:rPr>
+          <w:b/>
+          <w:i w:val="0"/>
+        </w:rPr>
+        <w:t>Neustart von Claude Code</w:t>
+      </w:r>
+      <w:r>
+        <w:rPr>
+          <w:b w:val="0"/>
+          <w:i w:val="0"/>
+        </w:rPr>
+        <w:t>.</w:t>
       </w:r>
     </w:p>
     <w:p>
@@ -9928,14 +10433,14 @@
           <w:b/>
           <w:i w:val="0"/>
         </w:rPr>
-        <w:t>mgrep + LSP verankert:</w:t>
-      </w:r>
-      <w:r>
-        <w:rPr>
-          <w:b w:val="0"/>
-          <w:i w:val="0"/>
-        </w:rPr>
-        <w:t xml:space="preserve"> mgrep als Schicht-2-Tool (MXBAI_API_KEY, </w:t>
+        <w:t>Hook-Scope:</w:t>
+      </w:r>
+      <w:r>
+        <w:rPr>
+          <w:b w:val="0"/>
+          <w:i w:val="0"/>
+        </w:rPr>
+        <w:t xml:space="preserve"> global </w:t>
       </w:r>
       <w:r>
         <w:rPr>
@@ -9944,14 +10449,14 @@
           <w:i w:val="0"/>
           <w:sz w:val="19"/>
         </w:rPr>
-        <w:t>index.sh</w:t>
-      </w:r>
-      <w:r>
-        <w:rPr>
-          <w:b w:val="0"/>
-          <w:i w:val="0"/>
-        </w:rPr>
-        <w:t xml:space="preserve">); LSP-Plugins </w:t>
+        <w:t>minimal</w:t>
+      </w:r>
+      <w:r>
+        <w:rPr>
+          <w:b w:val="0"/>
+          <w:i w:val="0"/>
+        </w:rPr>
+        <w:t xml:space="preserve"> + </w:t>
       </w:r>
       <w:r>
         <w:rPr>
@@ -9960,14 +10465,14 @@
           <w:i w:val="0"/>
           <w:sz w:val="19"/>
         </w:rPr>
-        <w:t>typescript-lsp</w:t>
-      </w:r>
-      <w:r>
-        <w:rPr>
-          <w:b w:val="0"/>
-          <w:i w:val="0"/>
-        </w:rPr>
-        <w:t xml:space="preserve"> + </w:t>
+        <w:t>ECC_GATEGUARD=off</w:t>
+      </w:r>
+      <w:r>
+        <w:rPr>
+          <w:b w:val="0"/>
+          <w:i w:val="0"/>
+        </w:rPr>
+        <w:t xml:space="preserve">; onboarded Projekte lokal </w:t>
       </w:r>
       <w:r>
         <w:rPr>
@@ -9976,14 +10481,30 @@
           <w:i w:val="0"/>
           <w:sz w:val="19"/>
         </w:rPr>
-        <w:t>pyright-lsp</w:t>
-      </w:r>
-      <w:r>
-        <w:rPr>
-          <w:b w:val="0"/>
-          <w:i w:val="0"/>
-        </w:rPr>
-        <w:t xml:space="preserve"> user-scoped installiert.</w:t>
+        <w:t>standard</w:t>
+      </w:r>
+      <w:r>
+        <w:rPr>
+          <w:b w:val="0"/>
+          <w:i w:val="0"/>
+        </w:rPr>
+        <w:t xml:space="preserve"> (BestPractice, Werkstattauftraege_codex, Grow3_Automatisierung, Test-ECC, Verladelisten_Hafen). Eigenbau-</w:t>
+      </w:r>
+      <w:r>
+        <w:rPr>
+          <w:rFonts w:ascii="Consolas" w:hAnsi="Consolas"/>
+          <w:b w:val="0"/>
+          <w:i w:val="0"/>
+          <w:sz w:val="19"/>
+        </w:rPr>
+        <w:t>hooks.py</w:t>
+      </w:r>
+      <w:r>
+        <w:rPr>
+          <w:b w:val="0"/>
+          <w:i w:val="0"/>
+        </w:rPr>
+        <w:t xml:space="preserve"> aus Werkstatt/WMS_Test entfernt.</w:t>
       </w:r>
     </w:p>
     <w:p>
@@ -9995,14 +10516,14 @@
           <w:b/>
           <w:i w:val="0"/>
         </w:rPr>
-        <w:t>Unberührt:</w:t>
-      </w:r>
-      <w:r>
-        <w:rPr>
-          <w:b w:val="0"/>
-          <w:i w:val="0"/>
-        </w:rPr>
-        <w:t xml:space="preserve"> ECC-Core (</w:t>
+        <w:t>State-Sync aktiv (GLOBAL):</w:t>
+      </w:r>
+      <w:r>
+        <w:rPr>
+          <w:b w:val="0"/>
+          <w:i w:val="0"/>
+        </w:rPr>
+        <w:t xml:space="preserve"> </w:t>
       </w:r>
       <w:r>
         <w:rPr>
@@ -10011,14 +10532,14 @@
           <w:i w:val="0"/>
           <w:sz w:val="19"/>
         </w:rPr>
-        <w:t>git status -- ecc/</w:t>
-      </w:r>
-      <w:r>
-        <w:rPr>
-          <w:b w:val="0"/>
-          <w:i w:val="0"/>
-        </w:rPr>
-        <w:t xml:space="preserve"> leer), RTK-Hook (</w:t>
+        <w:t>~/.claude/settings.json</w:t>
+      </w:r>
+      <w:r>
+        <w:rPr>
+          <w:b w:val="0"/>
+          <w:i w:val="0"/>
+        </w:rPr>
+        <w:t xml:space="preserve"> → SessionStart→</w:t>
       </w:r>
       <w:r>
         <w:rPr>
@@ -10027,23 +10548,46 @@
           <w:i w:val="0"/>
           <w:sz w:val="19"/>
         </w:rPr>
-        <w:t>PreToolUse:Bash</w:t>
-      </w:r>
-      <w:r>
-        <w:rPr>
-          <w:b w:val="0"/>
-          <w:i w:val="0"/>
-        </w:rPr>
-        <w:t xml:space="preserve"> global), globale ECC-Lifecycle-Hooks.</w:t>
-      </w:r>
-    </w:p>
-    <w:p>
-      <w:r>
-        <w:rPr>
-          <w:b/>
-          <w:i w:val="0"/>
-        </w:rPr>
-        <w:t>Behobene Bugs:</w:t>
+        <w:t>pre</w:t>
+      </w:r>
+      <w:r>
+        <w:rPr>
+          <w:b w:val="0"/>
+          <w:i w:val="0"/>
+        </w:rPr>
+        <w:t>, Stop/PreCompact→</w:t>
+      </w:r>
+      <w:r>
+        <w:rPr>
+          <w:rFonts w:ascii="Consolas" w:hAnsi="Consolas"/>
+          <w:b w:val="0"/>
+          <w:i w:val="0"/>
+          <w:sz w:val="19"/>
+        </w:rPr>
+        <w:t>post</w:t>
+      </w:r>
+      <w:r>
+        <w:rPr>
+          <w:b w:val="0"/>
+          <w:i w:val="0"/>
+        </w:rPr>
+        <w:t xml:space="preserve"> über </w:t>
+      </w:r>
+      <w:r>
+        <w:rPr>
+          <w:rFonts w:ascii="Consolas" w:hAnsi="Consolas"/>
+          <w:b w:val="0"/>
+          <w:i w:val="0"/>
+          <w:sz w:val="19"/>
+        </w:rPr>
+        <w:t>~/.claude/state-sync/</w:t>
+      </w:r>
+      <w:r>
+        <w:rPr>
+          <w:b w:val="0"/>
+          <w:i w:val="0"/>
+        </w:rPr>
+        <w:t xml:space="preserve"> (Symlink→Repo-Engine), guard-gated. Onboarded Projekte brauchen keine eigenen state-sync-Hooks.</w:t>
       </w:r>
     </w:p>
     <w:p>
@@ -10055,14 +10599,14 @@
           <w:b/>
           <w:i w:val="0"/>
         </w:rPr>
-        <w:t>`/ecc-onboard` install-plan.js vs install-apply.js (behoben 2026-06-03):</w:t>
-      </w:r>
-      <w:r>
-        <w:rPr>
-          <w:b w:val="0"/>
-          <w:i w:val="0"/>
-        </w:rPr>
-        <w:t xml:space="preserve"> </w:t>
+        <w:t>Backup:</w:t>
+      </w:r>
+      <w:r>
+        <w:rPr>
+          <w:b w:val="0"/>
+          <w:i w:val="0"/>
+        </w:rPr>
+        <w:t xml:space="preserve"> kompletter Vor-Migrations-Stand unter </w:t>
       </w:r>
       <w:r>
         <w:rPr>
@@ -10071,14 +10615,14 @@
           <w:i w:val="0"/>
           <w:sz w:val="19"/>
         </w:rPr>
-        <w:t>install-plan.js</w:t>
-      </w:r>
-      <w:r>
-        <w:rPr>
-          <w:b w:val="0"/>
-          <w:i w:val="0"/>
-        </w:rPr>
-        <w:t xml:space="preserve"> übergab kein </w:t>
+        <w:t>/root/harness-backup-20260610/</w:t>
+      </w:r>
+      <w:r>
+        <w:rPr>
+          <w:b w:val="0"/>
+          <w:i w:val="0"/>
+        </w:rPr>
+        <w:t xml:space="preserve"> (inkl. geretteter Eigenarbeit </w:t>
       </w:r>
       <w:r>
         <w:rPr>
@@ -10087,30 +10631,14 @@
           <w:i w:val="0"/>
           <w:sz w:val="19"/>
         </w:rPr>
-        <w:t>projectRoot</w:t>
-      </w:r>
-      <w:r>
-        <w:rPr>
-          <w:b w:val="0"/>
-          <w:i w:val="0"/>
-        </w:rPr>
-        <w:t xml:space="preserve"> → Install landete im ECC-Repo statt im Zielprojekt. Fix: für Dry-Run immer </w:t>
-      </w:r>
-      <w:r>
-        <w:rPr>
-          <w:rFonts w:ascii="Consolas" w:hAnsi="Consolas"/>
-          <w:b w:val="0"/>
-          <w:i w:val="0"/>
-          <w:sz w:val="19"/>
-        </w:rPr>
-        <w:t>node "$ECC_REPO/scripts/install-apply.js" --target claude-project --profile &lt;profil&gt; --dry-run</w:t>
-      </w:r>
-      <w:r>
-        <w:rPr>
-          <w:b w:val="0"/>
-          <w:i w:val="0"/>
-        </w:rPr>
-        <w:t xml:space="preserve"> aus dem Zielprojekt-Root.</w:t>
+        <w:t>ecc-clone-eigenes/</w:t>
+      </w:r>
+      <w:r>
+        <w:rPr>
+          <w:b w:val="0"/>
+          <w:i w:val="0"/>
+        </w:rPr>
+        <w:t>).</w:t>
       </w:r>
     </w:p>
     <w:p>
@@ -10122,14 +10650,14 @@
           <w:b/>
           <w:i w:val="0"/>
         </w:rPr>
-        <w:t>Attribution-Policy (Schicht-2-Override):</w:t>
-      </w:r>
-      <w:r>
-        <w:rPr>
-          <w:b w:val="0"/>
-          <w:i w:val="0"/>
-        </w:rPr>
-        <w:t xml:space="preserve"> Co-Authorship ist für dieses Setup AKTIV (Commits enden mit </w:t>
+        <w:t>Unberührt:</w:t>
+      </w:r>
+      <w:r>
+        <w:rPr>
+          <w:b w:val="0"/>
+          <w:i w:val="0"/>
+        </w:rPr>
+        <w:t xml:space="preserve"> RTK-Hook (</w:t>
       </w:r>
       <w:r>
         <w:rPr>
@@ -10138,14 +10666,28 @@
           <w:i w:val="0"/>
           <w:sz w:val="19"/>
         </w:rPr>
-        <w:t>Co-Authored-By:</w:t>
-      </w:r>
-      <w:r>
-        <w:rPr>
-          <w:b w:val="0"/>
-          <w:i w:val="0"/>
-        </w:rPr>
-        <w:t>); der Upstream-Hinweis „Attribution disabled globally" im vendored Core gilt hier bewusst nicht.</w:t>
+        <w:t>PreToolUse:Bash</w:t>
+      </w:r>
+      <w:r>
+        <w:rPr>
+          <w:b w:val="0"/>
+          <w:i w:val="0"/>
+        </w:rPr>
+        <w:t xml:space="preserve"> global) · </w:t>
+      </w:r>
+      <w:r>
+        <w:rPr>
+          <w:b/>
+          <w:i w:val="0"/>
+        </w:rPr>
+        <w:t>Attribution-Policy</w:t>
+      </w:r>
+      <w:r>
+        <w:rPr>
+          <w:b w:val="0"/>
+          <w:i w:val="0"/>
+        </w:rPr>
+        <w:t xml:space="preserve"> (Schicht-2-Override): Co-Authorship AKTIV, der Upstream-Hinweis „Attribution disabled globally" gilt hier bewusst nicht.</w:t>
       </w:r>
     </w:p>
     <w:p>
@@ -10169,7 +10711,7 @@
           <w:b w:val="0"/>
           <w:i w:val="0"/>
         </w:rPr>
-        <w:t xml:space="preserve"> (als X-Threads veröffentlicht; lokal im Repo unter </w:t>
+        <w:t xml:space="preserve"> (als X-Threads veröffentlicht; lokal im Plugin-Cache </w:t>
       </w:r>
       <w:r>
         <w:rPr>
@@ -10178,7 +10720,7 @@
           <w:i w:val="0"/>
           <w:sz w:val="19"/>
         </w:rPr>
-        <w:t>ecc/</w:t>
+        <w:t>~/.claude/plugins/cache/ecc/ecc/2.0.0-rc.1/</w:t>
       </w:r>
       <w:r>
         <w:rPr>
@@ -10213,7 +10755,7 @@
           <w:i w:val="0"/>
           <w:sz w:val="19"/>
         </w:rPr>
-        <w:t>ecc/the-shortform-guide.md</w:t>
+        <w:t>the-shortform-guide.md</w:t>
       </w:r>
       <w:r>
         <w:rPr>
@@ -10248,7 +10790,7 @@
           <w:i w:val="0"/>
           <w:sz w:val="19"/>
         </w:rPr>
-        <w:t>ecc/the-longform-guide.md</w:t>
+        <w:t>the-longform-guide.md</w:t>
       </w:r>
       <w:r>
         <w:rPr>
@@ -10283,7 +10825,7 @@
           <w:i w:val="0"/>
           <w:sz w:val="19"/>
         </w:rPr>
-        <w:t>ecc/the-security-guide.md</w:t>
+        <w:t>the-security-guide.md</w:t>
       </w:r>
       <w:r>
         <w:rPr>

</xml_diff>